<commit_message>
Separate bibliography into one paragraph per reference in changes-marked MS.
Co-authored-by: Cursor <cursoragent@cursor.com>
</commit_message>
<xml_diff>
--- a/documentation/graefe_revision/submission_package_20260731/MNV_Analysis_YY_rev1_manuscript_changes_marked.docx
+++ b/documentation/graefe_revision/submission_package_20260731/MNV_Analysis_YY_rev1_manuscript_changes_marked.docx
@@ -75,16 +75,8 @@
         <w:rPr>
           <w:rFonts w:ascii="Arial" w:hAnsi="Arial" w:cs="Arial"/>
         </w:rPr>
-        <w:t xml:space="preserve">Yasuo Yanagi, Maiko Maruyama-Inoue, Tatsuya Inoue and Kazuaki </w:t>
-      </w:r>
-      <w:proofErr w:type="spellStart"/>
-      <w:r>
-        <w:rPr>
-          <w:rFonts w:ascii="Arial" w:hAnsi="Arial" w:cs="Arial"/>
-        </w:rPr>
-        <w:t>Kadonosono</w:t>
-      </w:r>
-      <w:proofErr w:type="spellEnd"/>
+        <w:t>Yasuo Yanagi, Maiko Maruyama-Inoue, Tatsuya Inoue and Kazuaki Kadonosono</w:t>
+      </w:r>
     </w:p>
     <w:p>
       <w:pPr>
@@ -112,35 +104,7 @@
         <w:rPr>
           <w:rFonts w:ascii="Arial" w:hAnsi="Arial" w:cs="Arial"/>
         </w:rPr>
-        <w:t xml:space="preserve">artment of Ophthalmology and Micro-Technology, Yokohama City University, 4-57 </w:t>
-      </w:r>
-      <w:proofErr w:type="spellStart"/>
-      <w:r>
-        <w:rPr>
-          <w:rFonts w:ascii="Arial" w:hAnsi="Arial" w:cs="Arial"/>
-        </w:rPr>
-        <w:t>Urafune</w:t>
-      </w:r>
-      <w:proofErr w:type="spellEnd"/>
-      <w:r>
-        <w:rPr>
-          <w:rFonts w:ascii="Arial" w:hAnsi="Arial" w:cs="Arial"/>
-        </w:rPr>
-        <w:t>, Minami-</w:t>
-      </w:r>
-      <w:proofErr w:type="spellStart"/>
-      <w:r>
-        <w:rPr>
-          <w:rFonts w:ascii="Arial" w:hAnsi="Arial" w:cs="Arial"/>
-        </w:rPr>
-        <w:t>ku</w:t>
-      </w:r>
-      <w:proofErr w:type="spellEnd"/>
-      <w:r>
-        <w:rPr>
-          <w:rFonts w:ascii="Arial" w:hAnsi="Arial" w:cs="Arial"/>
-        </w:rPr>
-        <w:t>, Yokohama, Kanagawa, 232-0024, Japan.</w:t>
+        <w:t>artment of Ophthalmology and Micro-Technology, Yokohama City University, 4-57 Urafune, Minami-ku, Yokohama, Kanagawa, 232-0024, Japan.</w:t>
       </w:r>
     </w:p>
     <w:p>
@@ -317,21 +281,7 @@
         <w:rPr>
           <w:rFonts w:ascii="Arial" w:hAnsi="Arial" w:cs="Arial"/>
         </w:rPr>
-        <w:t xml:space="preserve">Consultant/Speaker for Astellas Pharmaceutical, Bayer </w:t>
-      </w:r>
-      <w:proofErr w:type="spellStart"/>
-      <w:r>
-        <w:rPr>
-          <w:rFonts w:ascii="Arial" w:hAnsi="Arial" w:cs="Arial"/>
-        </w:rPr>
-        <w:t>Yakuhin</w:t>
-      </w:r>
-      <w:proofErr w:type="spellEnd"/>
-      <w:r>
-        <w:rPr>
-          <w:rFonts w:ascii="Arial" w:hAnsi="Arial" w:cs="Arial"/>
-        </w:rPr>
-        <w:t xml:space="preserve"> Ltd, Roche/Chugai</w:t>
+        <w:t>Consultant/Speaker for Astellas Pharmaceutical, Bayer Yakuhin Ltd, Roche/Chugai</w:t>
       </w:r>
       <w:r>
         <w:rPr>
@@ -591,15 +541,7 @@
       <w:ins w:id="36" w:author="rev1" w:date="2026-08-03T08:56:00Z" w16du:dateUtc="2026-08-02T23:56:00Z">
         <w:r>
           <w:lastRenderedPageBreak/>
-          <w:t xml:space="preserve">Qualitative MNV pattern labels (e.g., Medusa, </w:t>
-        </w:r>
-        <w:proofErr w:type="spellStart"/>
-        <w:r>
-          <w:t>Seafan</w:t>
-        </w:r>
-        <w:proofErr w:type="spellEnd"/>
-        <w:r>
-          <w:t>, Dead tree) remain inconsistently defined and are rarely linked to reproducible quantitative thresholds.</w:t>
+          <w:t>Qualitative MNV pattern labels (e.g., Medusa, Seafan, Dead tree) remain inconsistently defined and are rarely linked to reproducible quantitative thresholds.</w:t>
         </w:r>
       </w:ins>
     </w:p>
@@ -958,21 +900,7 @@
         <w:rPr>
           <w:rFonts w:ascii="Arial" w:hAnsi="Arial" w:cs="Arial"/>
         </w:rPr>
-        <w:t xml:space="preserve"> active, mature quiescent, transitional, and </w:t>
-      </w:r>
-      <w:proofErr w:type="spellStart"/>
-      <w:r>
-        <w:rPr>
-          <w:rFonts w:ascii="Arial" w:hAnsi="Arial" w:cs="Arial"/>
-        </w:rPr>
-        <w:t>arteriolarized</w:t>
-      </w:r>
-      <w:proofErr w:type="spellEnd"/>
-      <w:r>
-        <w:rPr>
-          <w:rFonts w:ascii="Arial" w:hAnsi="Arial" w:cs="Arial"/>
-        </w:rPr>
-        <w:t xml:space="preserve"> states.</w:t>
+        <w:t xml:space="preserve"> active, mature quiescent, transitional, and arteriolarized states.</w:t>
       </w:r>
     </w:p>
     <w:p>
@@ -1025,23 +953,7 @@
       </w:r>
       <w:ins w:id="75" w:author="rev1" w:date="2026-08-03T08:56:00Z" w16du:dateUtc="2026-08-02T23:56:00Z">
         <w:r>
-          <w:t xml:space="preserve">using </w:t>
-        </w:r>
-        <w:proofErr w:type="spellStart"/>
-        <w:r>
-          <w:t>Frangi</w:t>
-        </w:r>
-        <w:proofErr w:type="spellEnd"/>
-        <w:r>
-          <w:t>/</w:t>
-        </w:r>
-        <w:proofErr w:type="spellStart"/>
-        <w:r>
-          <w:t>tubeness</w:t>
-        </w:r>
-        <w:proofErr w:type="spellEnd"/>
-        <w:r>
-          <w:t xml:space="preserve"> and </w:t>
+          <w:t xml:space="preserve">using Frangi/tubeness and </w:t>
         </w:r>
       </w:ins>
       <w:del w:id="76" w:author="rev1" w:date="2026-08-03T08:56:00Z" w16du:dateUtc="2026-08-02T23:56:00Z">
@@ -1074,15 +986,7 @@
       </w:r>
       <w:ins w:id="78" w:author="rev1" w:date="2026-08-03T08:56:00Z" w16du:dateUtc="2026-08-02T23:56:00Z">
         <w:r>
-          <w:t xml:space="preserve">, </w:t>
-        </w:r>
-        <w:proofErr w:type="spellStart"/>
-        <w:r>
-          <w:t>Phansalkar</w:t>
-        </w:r>
-        <w:proofErr w:type="spellEnd"/>
-        <w:r>
-          <w:t xml:space="preserve"> adaptive binarization,</w:t>
+          <w:t>, Phansalkar adaptive binarization,</w:t>
         </w:r>
       </w:ins>
       <w:del w:id="79" w:author="rev1" w:date="2026-08-03T08:56:00Z" w16du:dateUtc="2026-08-02T23:56:00Z">
@@ -1165,21 +1069,7 @@
         <w:rPr>
           <w:rFonts w:ascii="Arial" w:hAnsi="Arial" w:cs="Arial"/>
         </w:rPr>
-        <w:t xml:space="preserve">classification into Medusa, </w:t>
-      </w:r>
-      <w:proofErr w:type="spellStart"/>
-      <w:r>
-        <w:rPr>
-          <w:rFonts w:ascii="Arial" w:hAnsi="Arial" w:cs="Arial"/>
-        </w:rPr>
-        <w:t>Seafan</w:t>
-      </w:r>
-      <w:proofErr w:type="spellEnd"/>
-      <w:r>
-        <w:rPr>
-          <w:rFonts w:ascii="Arial" w:hAnsi="Arial" w:cs="Arial"/>
-        </w:rPr>
-        <w:t>, Glomerular, Tree</w:t>
+        <w:t>classification into Medusa, Seafan, Glomerular, Tree</w:t>
       </w:r>
       <w:ins w:id="87" w:author="rev1" w:date="2026-08-03T08:56:00Z" w16du:dateUtc="2026-08-02T23:56:00Z">
         <w:r>
@@ -1240,15 +1130,7 @@
       </w:r>
       <w:ins w:id="93" w:author="rev1" w:date="2026-08-03T08:56:00Z" w16du:dateUtc="2026-08-02T23:56:00Z">
         <w:r>
-          <w:t xml:space="preserve">using predefined percentile and trunk-pattern thresholds. Morphology-derived interpretive categories - Active-pattern, Mature-quiescent-pattern, Transitional-pattern, and </w:t>
-        </w:r>
-        <w:proofErr w:type="spellStart"/>
-        <w:r>
-          <w:t>Arteriolarized</w:t>
-        </w:r>
-        <w:proofErr w:type="spellEnd"/>
-        <w:r>
-          <w:t>-pattern - were assigned</w:t>
+          <w:t>using predefined percentile and trunk-pattern thresholds. Morphology-derived interpretive categories - Active-pattern, Mature-quiescent-pattern, Transitional-pattern, and Arteriolarized-pattern - were assigned</w:t>
         </w:r>
       </w:ins>
       <w:del w:id="94" w:author="rev1" w:date="2026-08-03T08:56:00Z" w16du:dateUtc="2026-08-02T23:56:00Z">
@@ -1308,33 +1190,11 @@
         <w:rPr>
           <w:rFonts w:ascii="Arial" w:hAnsi="Arial" w:cs="Arial"/>
         </w:rPr>
-        <w:t xml:space="preserve"> on three OCTA platforms (Zeiss </w:t>
-      </w:r>
-      <w:proofErr w:type="spellStart"/>
-      <w:r>
-        <w:rPr>
-          <w:rFonts w:ascii="Arial" w:hAnsi="Arial" w:cs="Arial"/>
-        </w:rPr>
-        <w:t>PlexElite</w:t>
-      </w:r>
-      <w:proofErr w:type="spellEnd"/>
-      <w:r>
-        <w:rPr>
-          <w:rFonts w:ascii="Arial" w:hAnsi="Arial" w:cs="Arial"/>
-        </w:rPr>
-        <w:t xml:space="preserve"> 6×6 mm, Zeiss </w:t>
+        <w:t xml:space="preserve"> on three OCTA platforms (Zeiss PlexElite 6×6 mm, Zeiss </w:t>
       </w:r>
       <w:ins w:id="99" w:author="rev1" w:date="2026-08-03T08:56:00Z" w16du:dateUtc="2026-08-02T23:56:00Z">
         <w:r>
-          <w:t xml:space="preserve">CIRRUS </w:t>
-        </w:r>
-        <w:proofErr w:type="spellStart"/>
-        <w:r>
-          <w:t>AngioPlex</w:t>
-        </w:r>
-        <w:proofErr w:type="spellEnd"/>
-        <w:r>
-          <w:t xml:space="preserve"> </w:t>
+          <w:t xml:space="preserve">CIRRUS AngioPlex </w:t>
         </w:r>
       </w:ins>
       <w:r>
@@ -1348,31 +1208,15 @@
           <w:t xml:space="preserve">and </w:t>
         </w:r>
       </w:ins>
-      <w:proofErr w:type="spellStart"/>
-      <w:r>
-        <w:rPr>
-          <w:rFonts w:ascii="Arial" w:hAnsi="Arial" w:cs="Arial"/>
-        </w:rPr>
-        <w:t>Optovue</w:t>
-      </w:r>
-      <w:proofErr w:type="spellEnd"/>
-      <w:r>
-        <w:rPr>
-          <w:rFonts w:ascii="Arial" w:hAnsi="Arial" w:cs="Arial"/>
-        </w:rPr>
-        <w:t xml:space="preserve"> Solix 6×6 mm) were analyzed.</w:t>
+      <w:r>
+        <w:rPr>
+          <w:rFonts w:ascii="Arial" w:hAnsi="Arial" w:cs="Arial"/>
+        </w:rPr>
+        <w:t>Optovue Solix 6×6 mm) were analyzed.</w:t>
       </w:r>
       <w:ins w:id="101" w:author="rev1" w:date="2026-08-03T08:56:00Z" w16du:dateUtc="2026-08-02T23:56:00Z">
         <w:r>
-          <w:t xml:space="preserve"> Masked expert–automated morphological agreement was assessed in a stratified subset (n = 54). Inter-observer reproducibility was evaluated with three operators in 46 lesions using </w:t>
-        </w:r>
-        <w:proofErr w:type="gramStart"/>
-        <w:r>
-          <w:t>ICC(</w:t>
-        </w:r>
-        <w:proofErr w:type="gramEnd"/>
-        <w:r>
-          <w:t>2,1), and same-operator intra-observer test–retest reproducibility was assessed as a supplement (n = 46). Between-stratum score differences were summarized using Kruskal–Wallis tests and ε² effect sizes with bootstrap 95% confidence intervals.</w:t>
+          <w:t xml:space="preserve"> Masked expert–automated morphological agreement was assessed in a stratified subset (n = 54). Inter-observer reproducibility was evaluated with three operators in 46 lesions using ICC(2,1), and same-operator intra-observer test–retest reproducibility was assessed as a supplement (n = 46). Between-stratum score differences were summarized using Kruskal–Wallis tests and ε² effect sizes with bootstrap 95% confidence intervals.</w:t>
         </w:r>
       </w:ins>
     </w:p>
@@ -1513,15 +1357,7 @@
       </w:r>
       <w:ins w:id="114" w:author="rev1" w:date="2026-08-03T08:56:00Z" w16du:dateUtc="2026-08-02T23:56:00Z">
         <w:r>
-          <w:t xml:space="preserve">. Agreement with masked expert grading was modest to moderate, with an overall agreement of 57.4% and a quadratic weighted κ of 0.507. Inter-observer </w:t>
-        </w:r>
-        <w:proofErr w:type="gramStart"/>
-        <w:r>
-          <w:t>ICC(</w:t>
-        </w:r>
-        <w:proofErr w:type="gramEnd"/>
-        <w:r>
-          <w:t>2,1) was good for lesion area (0.859), Complexity Score (0.807), and Standardized Caliber Uniformity Score (0.770), and moderate for the Maturity Index derived from the Caliber score (0.593).</w:t>
+          <w:t>. Agreement with masked expert grading was modest to moderate, with an overall agreement of 57.4% and a quadratic weighted κ of 0.507. Inter-observer ICC(2,1) was good for lesion area (0.859), Complexity Score (0.807), and Standardized Caliber Uniformity Score (0.770), and moderate for the Maturity Index derived from the Caliber score (0.593).</w:t>
         </w:r>
       </w:ins>
       <w:del w:id="115" w:author="rev1" w:date="2026-08-03T08:56:00Z" w16du:dateUtc="2026-08-02T23:56:00Z">
@@ -1733,15 +1569,7 @@
       </w:pPr>
       <w:ins w:id="132" w:author="rev1" w:date="2026-08-03T08:56:00Z" w16du:dateUtc="2026-08-02T23:56:00Z">
         <w:r>
-          <w:t xml:space="preserve">Optical Coherence Tomography Angiography (OCTA) has transformed visualization of macular neovascularization (MNV) [1]. Translating qualitative observations into objective quantitative metrics remains challenging. Although general-purpose tools such as </w:t>
-        </w:r>
-        <w:proofErr w:type="spellStart"/>
-        <w:r>
-          <w:t>AngioTool</w:t>
-        </w:r>
-        <w:proofErr w:type="spellEnd"/>
-        <w:r>
-          <w:t xml:space="preserve"> perform well with high-contrast immunofluorescence images [2], they often struggle when applied to OCTA data, which are typically low in contrast and prone to imaging artifacts [3–5]. Variations in image quality across acquisition protocols and devices hinder accurate delineation of fine capillaries within dense MNV networks and yield inconsistent quantitative parameters across machines [6].</w:t>
+          <w:t>Optical Coherence Tomography Angiography (OCTA) has transformed visualization of macular neovascularization (MNV) [1]. Translating qualitative observations into objective quantitative metrics remains challenging. Although general-purpose tools such as AngioTool perform well with high-contrast immunofluorescence images [2], they often struggle when applied to OCTA data, which are typically low in contrast and prone to imaging artifacts [3–5]. Variations in image quality across acquisition protocols and devices hinder accurate delineation of fine capillaries within dense MNV networks and yield inconsistent quantitative parameters across machines [6].</w:t>
         </w:r>
       </w:ins>
     </w:p>
@@ -1754,15 +1582,7 @@
       </w:pPr>
       <w:ins w:id="134" w:author="rev1" w:date="2026-08-03T08:56:00Z" w16du:dateUtc="2026-08-02T23:56:00Z">
         <w:r>
-          <w:t>Another hurdle is characterization of vascular remodeling and the distinction between patterns consistent with active neovascularization versus mature, quiescent-appearing networks. Patterns such as “Medusa” and “</w:t>
-        </w:r>
-        <w:proofErr w:type="spellStart"/>
-        <w:r>
-          <w:t>Seafan</w:t>
-        </w:r>
-        <w:proofErr w:type="spellEnd"/>
-        <w:r>
-          <w:t>” are widely recognized, yet their quantitative definition and clinical interpretation often vary [7,8]. The term “mature” is used inconsistently: sometimes for a well-organized but still active lesion (morphological maturity), and other times for a pruned vascular tree (interpreted as pathophysiological maturity in the literature) [1,7,8]. This ambiguity impedes standardized assessment and cross-study comparison.</w:t>
+          <w:t>Another hurdle is characterization of vascular remodeling and the distinction between patterns consistent with active neovascularization versus mature, quiescent-appearing networks. Patterns such as “Medusa” and “Seafan” are widely recognized, yet their quantitative definition and clinical interpretation often vary [7,8]. The term “mature” is used inconsistently: sometimes for a well-organized but still active lesion (morphological maturity), and other times for a pruned vascular tree (interpreted as pathophysiological maturity in the literature) [1,7,8]. This ambiguity impedes standardized assessment and cross-study comparison.</w:t>
         </w:r>
       </w:ins>
     </w:p>
@@ -1775,23 +1595,7 @@
       </w:pPr>
       <w:ins w:id="136" w:author="rev1" w:date="2026-08-03T08:56:00Z" w16du:dateUtc="2026-08-02T23:56:00Z">
         <w:r>
-          <w:t xml:space="preserve">This paper presents a novel semi-automated framework designed to enhance the transparency and reproducibility of MNV quantification. We detail a robust rule-based morphological categorization that maps Medusa, </w:t>
-        </w:r>
-        <w:proofErr w:type="spellStart"/>
-        <w:r>
-          <w:t>Seafan</w:t>
-        </w:r>
-        <w:proofErr w:type="spellEnd"/>
-        <w:r>
-          <w:t xml:space="preserve">, Glomerular, Tree in bud, and Dead tree patterns using disclosed quantitative thresholds. Furthermore, we assign morphology-derived interpretive categories (Active-pattern, Mature-quiescent-pattern, Transitional-pattern, </w:t>
-        </w:r>
-        <w:proofErr w:type="spellStart"/>
-        <w:r>
-          <w:t>Arteriolarized</w:t>
-        </w:r>
-        <w:proofErr w:type="spellEnd"/>
-        <w:r>
-          <w:t>-pattern). These interpretive labels serve as a structured, hypothesis-generating taxonomy grounded in quantitative morphology. Our framework establishes standardized biomarkers (Standardized Vascular Complexity Score, Standardized Caliber Uniformity Score, Standardized Maturity Index) to facilitate consistent within-stratum reporting and rule-based thresholding, thereby providing a rigorous foundation for future biological validation.</w:t>
+          <w:t>This paper presents a novel semi-automated framework designed to enhance the transparency and reproducibility of MNV quantification. We detail a robust rule-based morphological categorization that maps Medusa, Seafan, Glomerular, Tree in bud, and Dead tree patterns using disclosed quantitative thresholds. Furthermore, we assign morphology-derived interpretive categories (Active-pattern, Mature-quiescent-pattern, Transitional-pattern, Arteriolarized-pattern). These interpretive labels serve as a structured, hypothesis-generating taxonomy grounded in quantitative morphology. Our framework establishes standardized biomarkers (Standardized Vascular Complexity Score, Standardized Caliber Uniformity Score, Standardized Maturity Index) to facilitate consistent within-stratum reporting and rule-based thresholding, thereby providing a rigorous foundation for future biological validation.</w:t>
         </w:r>
       </w:ins>
     </w:p>
@@ -2525,21 +2329,7 @@
         <w:rPr>
           <w:rFonts w:ascii="Arial" w:hAnsi="Arial" w:cs="Arial"/>
         </w:rPr>
-        <w:t xml:space="preserve"> acquisitions on the Zeiss </w:t>
-      </w:r>
-      <w:proofErr w:type="spellStart"/>
-      <w:r>
-        <w:rPr>
-          <w:rFonts w:ascii="Arial" w:hAnsi="Arial" w:cs="Arial"/>
-        </w:rPr>
-        <w:t>PlexElite</w:t>
-      </w:r>
-      <w:proofErr w:type="spellEnd"/>
-      <w:r>
-        <w:rPr>
-          <w:rFonts w:ascii="Arial" w:hAnsi="Arial" w:cs="Arial"/>
-        </w:rPr>
-        <w:t xml:space="preserve"> 9000 (swept-source OCTA, </w:t>
+        <w:t xml:space="preserve"> acquisitions on the Zeiss PlexElite 9000 (swept-source OCTA, </w:t>
       </w:r>
       <w:ins w:id="166" w:author="rev1" w:date="2026-08-03T08:56:00Z" w16du:dateUtc="2026-08-02T23:56:00Z">
         <w:r>
@@ -2596,21 +2386,7 @@
         <w:rPr>
           <w:rFonts w:ascii="Arial" w:hAnsi="Arial" w:cs="Arial"/>
         </w:rPr>
-        <w:t xml:space="preserve"> acquisitions on the Zeiss CIRRUS HD-OCT with </w:t>
-      </w:r>
-      <w:proofErr w:type="spellStart"/>
-      <w:r>
-        <w:rPr>
-          <w:rFonts w:ascii="Arial" w:hAnsi="Arial" w:cs="Arial"/>
-        </w:rPr>
-        <w:t>AngioPlex</w:t>
-      </w:r>
-      <w:proofErr w:type="spellEnd"/>
-      <w:r>
-        <w:rPr>
-          <w:rFonts w:ascii="Arial" w:hAnsi="Arial" w:cs="Arial"/>
-        </w:rPr>
-        <w:t xml:space="preserve"> (spectral-domain OCTA, </w:t>
+        <w:t xml:space="preserve"> acquisitions on the Zeiss CIRRUS HD-OCT with AngioPlex (spectral-domain OCTA, </w:t>
       </w:r>
       <w:ins w:id="172" w:author="rev1" w:date="2026-08-03T08:56:00Z" w16du:dateUtc="2026-08-02T23:56:00Z">
         <w:r>
@@ -2669,14 +2445,12 @@
         </w:rPr>
         <w:t xml:space="preserve"> acquisitions on the </w:t>
       </w:r>
-      <w:proofErr w:type="spellStart"/>
       <w:r>
         <w:rPr>
           <w:rFonts w:ascii="Arial" w:hAnsi="Arial" w:cs="Arial"/>
         </w:rPr>
         <w:t>Optovue</w:t>
       </w:r>
-      <w:proofErr w:type="spellEnd"/>
       <w:r>
         <w:rPr>
           <w:rFonts w:ascii="Arial" w:hAnsi="Arial" w:cs="Arial"/>
@@ -2685,23 +2459,7 @@
       </w:r>
       <w:ins w:id="178" w:author="rev1" w:date="2026-08-03T08:56:00Z" w16du:dateUtc="2026-08-02T23:56:00Z">
         <w:r>
-          <w:t>(</w:t>
-        </w:r>
-        <w:proofErr w:type="spellStart"/>
-        <w:r>
-          <w:t>Optovue</w:t>
-        </w:r>
-        <w:proofErr w:type="spellEnd"/>
-        <w:r>
-          <w:t>/</w:t>
-        </w:r>
-        <w:proofErr w:type="spellStart"/>
-        <w:r>
-          <w:t>Visionix</w:t>
-        </w:r>
-        <w:proofErr w:type="spellEnd"/>
-        <w:r>
-          <w:t xml:space="preserve">; </w:t>
+          <w:t xml:space="preserve">(Optovue/Visionix; </w:t>
         </w:r>
       </w:ins>
       <w:del w:id="179" w:author="rev1" w:date="2026-08-03T08:56:00Z" w16du:dateUtc="2026-08-02T23:56:00Z">
@@ -3730,47 +3488,7 @@
       </w:pPr>
       <w:ins w:id="259" w:author="rev1" w:date="2026-08-03T08:56:00Z" w16du:dateUtc="2026-08-02T23:56:00Z">
         <w:r>
-          <w:t xml:space="preserve">Hybrid multiscale vessel enhancement. A combination of </w:t>
-        </w:r>
-        <w:proofErr w:type="spellStart"/>
-        <w:r>
-          <w:t>Frangi</w:t>
-        </w:r>
-        <w:proofErr w:type="spellEnd"/>
-        <w:r>
-          <w:t xml:space="preserve"> (</w:t>
-        </w:r>
-        <w:proofErr w:type="spellStart"/>
-        <w:r>
-          <w:t>tubeness</w:t>
-        </w:r>
-        <w:proofErr w:type="spellEnd"/>
-        <w:r>
-          <w:t>) and Laplacian of Gaussian (</w:t>
-        </w:r>
-        <w:proofErr w:type="spellStart"/>
-        <w:r>
-          <w:t>LoG</w:t>
-        </w:r>
-        <w:proofErr w:type="spellEnd"/>
-        <w:r>
-          <w:t xml:space="preserve">) filters accentuates vessels of varying calibers. Fusion of complementary filters can improve vessel detection relative to single-filter methods [9–11]. </w:t>
-        </w:r>
-        <w:proofErr w:type="spellStart"/>
-        <w:r>
-          <w:t>Frangi</w:t>
-        </w:r>
-        <w:proofErr w:type="spellEnd"/>
-        <w:r>
-          <w:t xml:space="preserve"> (scales 0.8–4.0) identifies tubular structures; </w:t>
-        </w:r>
-        <w:proofErr w:type="spellStart"/>
-        <w:r>
-          <w:t>LoG</w:t>
-        </w:r>
-        <w:proofErr w:type="spellEnd"/>
-        <w:r>
-          <w:t xml:space="preserve"> detects edges. Their combined use supports enhancement of complex, multi-scale MNV networks in low-contrast OCTA images.</w:t>
+          <w:t>Hybrid multiscale vessel enhancement. A combination of Frangi (tubeness) and Laplacian of Gaussian (LoG) filters accentuates vessels of varying calibers. Fusion of complementary filters can improve vessel detection relative to single-filter methods [9–11]. Frangi (scales 0.8–4.0) identifies tubular structures; LoG detects edges. Their combined use supports enhancement of complex, multi-scale MNV networks in low-contrast OCTA images.</w:t>
         </w:r>
       </w:ins>
     </w:p>
@@ -3788,63 +3506,7 @@
       </w:pPr>
       <w:ins w:id="261" w:author="rev1" w:date="2026-08-03T08:56:00Z" w16du:dateUtc="2026-08-02T23:56:00Z">
         <w:r>
-          <w:t xml:space="preserve">Binarization Following </w:t>
-        </w:r>
-        <w:proofErr w:type="spellStart"/>
-        <w:r>
-          <w:t>Frangi</w:t>
-        </w:r>
-        <w:proofErr w:type="spellEnd"/>
-        <w:r>
-          <w:t>/</w:t>
-        </w:r>
-        <w:proofErr w:type="spellStart"/>
-        <w:r>
-          <w:t>LoG</w:t>
-        </w:r>
-        <w:proofErr w:type="spellEnd"/>
-        <w:r>
-          <w:t xml:space="preserve"> enhancement, MNV vessel maps exhibit spatially heterogeneous background intensity due to projection artifacts, signal attenuation, and intra-lesional contrast variation. To address this, we employed </w:t>
-        </w:r>
-        <w:proofErr w:type="spellStart"/>
-        <w:r>
-          <w:t>Phansalkar</w:t>
-        </w:r>
-        <w:proofErr w:type="spellEnd"/>
-        <w:r>
-          <w:t xml:space="preserve"> adaptive local thresholding rather than global Otsu thresholding. While global Otsu assumes a bimodal intensity histogram with a single cut-point - often leading to the erosion of fine peripheral capillaries or the inclusion of background speckles in overlapping distributions - </w:t>
-        </w:r>
-        <w:proofErr w:type="spellStart"/>
-        <w:r>
-          <w:t>Phansalkar’s</w:t>
-        </w:r>
-        <w:proofErr w:type="spellEnd"/>
-        <w:r>
-          <w:t xml:space="preserve"> local mean/SD-based approach estimates thresholds within a resolution-calibrated window (local radius corresponding to approximately 24 µm; k = 0.1, R = 0). This method preserves locally contrasted fine vessels while effectively suppressing regional background drift, leveraging its robustness to local intensity non-uniformity. Although </w:t>
-        </w:r>
-        <w:proofErr w:type="spellStart"/>
-        <w:r>
-          <w:t>Phansalkar</w:t>
-        </w:r>
-        <w:proofErr w:type="spellEnd"/>
-        <w:r>
-          <w:t xml:space="preserve"> is widely recognized in choriocapillaris flow-deficit analysis, this property makes it particularly advantageous for enhanced MNV vessel maps on the outer-retina/avascular-complex slab. Our implementation adheres to the ImageJ Auto Local Threshold (</w:t>
-        </w:r>
-        <w:proofErr w:type="spellStart"/>
-        <w:r>
-          <w:t>Phansalkar</w:t>
-        </w:r>
-        <w:proofErr w:type="spellEnd"/>
-        <w:r>
-          <w:t xml:space="preserve">) convention used in the original macro to ensure reproducibility. We selected this local adaptive method over Otsu to optimize vessel preservation in the heterogeneous MNV environment, acknowledging Otsu’s utility primarily in relatively homogeneous SCP/DCP </w:t>
-        </w:r>
-        <w:proofErr w:type="spellStart"/>
-        <w:r>
-          <w:t>en</w:t>
-        </w:r>
-        <w:proofErr w:type="spellEnd"/>
-        <w:r>
-          <w:t>-face slabs.</w:t>
+          <w:t>Binarization Following Frangi/LoG enhancement, MNV vessel maps exhibit spatially heterogeneous background intensity due to projection artifacts, signal attenuation, and intra-lesional contrast variation. To address this, we employed Phansalkar adaptive local thresholding rather than global Otsu thresholding. While global Otsu assumes a bimodal intensity histogram with a single cut-point - often leading to the erosion of fine peripheral capillaries or the inclusion of background speckles in overlapping distributions - Phansalkar’s local mean/SD-based approach estimates thresholds within a resolution-calibrated window (local radius corresponding to approximately 24 µm; k = 0.1, R = 0). This method preserves locally contrasted fine vessels while effectively suppressing regional background drift, leveraging its robustness to local intensity non-uniformity. Although Phansalkar is widely recognized in choriocapillaris flow-deficit analysis, this property makes it particularly advantageous for enhanced MNV vessel maps on the outer-retina/avascular-complex slab. Our implementation adheres to the ImageJ Auto Local Threshold (Phansalkar) convention used in the original macro to ensure reproducibility. We selected this local adaptive method over Otsu to optimize vessel preservation in the heterogeneous MNV environment, acknowledging Otsu’s utility primarily in relatively homogeneous SCP/DCP en-face slabs.</w:t>
         </w:r>
       </w:ins>
     </w:p>
@@ -3981,21 +3643,7 @@
         <w:rPr>
           <w:rFonts w:ascii="Arial" w:hAnsi="Arial" w:cs="Arial"/>
         </w:rPr>
-        <w:t xml:space="preserve"> The binary image </w:t>
-      </w:r>
-      <w:proofErr w:type="gramStart"/>
-      <w:r>
-        <w:rPr>
-          <w:rFonts w:ascii="Arial" w:hAnsi="Arial" w:cs="Arial"/>
-        </w:rPr>
-        <w:t>is</w:t>
-      </w:r>
-      <w:proofErr w:type="gramEnd"/>
-      <w:r>
-        <w:rPr>
-          <w:rFonts w:ascii="Arial" w:hAnsi="Arial" w:cs="Arial"/>
-        </w:rPr>
-        <w:t xml:space="preserve"> refined </w:t>
+        <w:t xml:space="preserve"> The binary image is refined </w:t>
       </w:r>
       <w:ins w:id="269" w:author="rev1" w:date="2026-08-03T08:56:00Z" w16du:dateUtc="2026-08-02T23:56:00Z">
         <w:r>
@@ -4350,15 +3998,7 @@
       </w:r>
       <w:ins w:id="296" w:author="rev1" w:date="2026-08-03T08:56:00Z" w16du:dateUtc="2026-08-02T23:56:00Z">
         <w:r>
-          <w:t xml:space="preserve">; separate columns list inter-rater and intra-rater </w:t>
-        </w:r>
-        <w:proofErr w:type="gramStart"/>
-        <w:r>
-          <w:t>ICC(</w:t>
-        </w:r>
-        <w:proofErr w:type="gramEnd"/>
-        <w:r>
-          <w:t>2,1) (or κ for morphological subtypes) for available lesion metrics.</w:t>
+          <w:t>; separate columns list inter-rater and intra-rater ICC(2,1) (or κ for morphological subtypes) for available lesion metrics.</w:t>
         </w:r>
       </w:ins>
       <w:del w:id="297" w:author="rev1" w:date="2026-08-03T08:56:00Z" w16du:dateUtc="2026-08-02T23:56:00Z">
@@ -4546,21 +4186,7 @@
         <w:rPr>
           <w:rFonts w:ascii="Arial" w:hAnsi="Arial" w:cs="Arial"/>
         </w:rPr>
-        <w:t>from the skeletonized MNV network: inverse Euler number (−</w:t>
-      </w:r>
-      <w:proofErr w:type="spellStart"/>
-      <w:r>
-        <w:rPr>
-          <w:rFonts w:ascii="Arial" w:hAnsi="Arial" w:cs="Arial"/>
-        </w:rPr>
-        <w:t>Euler_total</w:t>
-      </w:r>
-      <w:proofErr w:type="spellEnd"/>
-      <w:r>
-        <w:rPr>
-          <w:rFonts w:ascii="Arial" w:hAnsi="Arial" w:cs="Arial"/>
-        </w:rPr>
-        <w:t>), total loop count, junction density, and global fractal dimension. Reference distributions were constructed independently for each acquisition stratum (large, small_3mm, small</w:t>
+        <w:t>from the skeletonized MNV network: inverse Euler number (−Euler_total), total loop count, junction density, and global fractal dimension. Reference distributions were constructed independently for each acquisition stratum (large, small_3mm, small</w:t>
       </w:r>
       <w:ins w:id="309" w:author="rev1" w:date="2026-08-03T08:56:00Z" w16du:dateUtc="2026-08-02T23:56:00Z">
         <w:r>
@@ -4666,16 +4292,8 @@
         <w:rPr>
           <w:rFonts w:ascii="Arial" w:hAnsi="Arial" w:cs="Arial"/>
         </w:rPr>
-        <w:t xml:space="preserve"> (</w:t>
-      </w:r>
-      <w:proofErr w:type="spellStart"/>
-      <w:r>
-        <w:rPr>
-          <w:rFonts w:ascii="Arial" w:hAnsi="Arial" w:cs="Arial"/>
-        </w:rPr>
-        <w:t>TrunkDist</w:t>
-      </w:r>
-      <w:proofErr w:type="spellEnd"/>
+        <w:t xml:space="preserve"> (TrunkDist</w:t>
+      </w:r>
       <w:ins w:id="320" w:author="rev1" w:date="2026-08-03T08:56:00Z" w16du:dateUtc="2026-08-02T23:56:00Z">
         <w:r>
           <w:t xml:space="preserve"> =</w:t>
@@ -5135,14 +4753,9 @@
       </w:pPr>
       <w:ins w:id="363" w:author="rev1" w:date="2026-08-03T08:56:00Z" w16du:dateUtc="2026-08-02T23:56:00Z">
         <w:r>
-          <w:t xml:space="preserve">Score = </w:t>
-        </w:r>
-        <w:proofErr w:type="gramStart"/>
-        <w:r>
-          <w:t>clip(</w:t>
-        </w:r>
-      </w:ins>
-      <w:proofErr w:type="gramEnd"/>
+          <w:t>Score = clip(</w:t>
+        </w:r>
+      </w:ins>
       <w:del w:id="364" w:author="rev1" w:date="2026-08-03T08:56:00Z" w16du:dateUtc="2026-08-02T23:56:00Z">
         <w:r>
           <w:rPr>
@@ -5159,23 +4772,7 @@
       </w:r>
       <w:ins w:id="365" w:author="rev1" w:date="2026-08-03T08:56:00Z" w16du:dateUtc="2026-08-02T23:56:00Z">
         <w:r>
-          <w:t xml:space="preserve">75 × </w:t>
-        </w:r>
-        <w:proofErr w:type="gramStart"/>
-        <w:r>
-          <w:t>U(</w:t>
-        </w:r>
-        <w:proofErr w:type="gramEnd"/>
-        <w:r>
-          <w:t xml:space="preserve">−NV Diameter CV) + 0.25 × </w:t>
-        </w:r>
-        <w:proofErr w:type="gramStart"/>
-        <w:r>
-          <w:t>U(</w:t>
-        </w:r>
-        <w:proofErr w:type="gramEnd"/>
-        <w:r>
-          <w:t>−Dilated vessel %), 0, 100),</w:t>
+          <w:t>75 × U(−NV Diameter CV) + 0.25 × U(−Dilated vessel %), 0, 100),</w:t>
         </w:r>
       </w:ins>
       <w:del w:id="366" w:author="rev1" w:date="2026-08-03T08:56:00Z" w16du:dateUtc="2026-08-02T23:56:00Z">
@@ -5196,15 +4793,7 @@
       </w:pPr>
       <w:ins w:id="367" w:author="rev1" w:date="2026-08-03T08:56:00Z" w16du:dateUtc="2026-08-02T23:56:00Z">
         <w:r>
-          <w:t xml:space="preserve">where </w:t>
-        </w:r>
-        <w:proofErr w:type="gramStart"/>
-        <w:r>
-          <w:t>U(</w:t>
-        </w:r>
-        <w:proofErr w:type="gramEnd"/>
-        <w:r>
-          <w:t>·) denotes the stratum-specific piecewise map.</w:t>
+          <w:t>where U(·) denotes the stratum-specific piecewise map.</w:t>
         </w:r>
       </w:ins>
     </w:p>
@@ -5260,14 +4849,9 @@
         </w:rPr>
         <w:t xml:space="preserve">Maturity Index = </w:t>
       </w:r>
-      <w:proofErr w:type="gramStart"/>
       <w:ins w:id="371" w:author="rev1" w:date="2026-08-03T08:56:00Z" w16du:dateUtc="2026-08-02T23:56:00Z">
         <w:r>
-          <w:t>clip(</w:t>
-        </w:r>
-        <w:proofErr w:type="gramEnd"/>
-        <w:r>
-          <w:t>50</w:t>
+          <w:t>clip(50</w:t>
         </w:r>
       </w:ins>
       <w:del w:id="372" w:author="rev1" w:date="2026-08-03T08:56:00Z" w16du:dateUtc="2026-08-02T23:56:00Z">
@@ -5449,16 +5033,11 @@
         <w:t>Medusa</w:t>
       </w:r>
       <w:r>
-        <w:t xml:space="preserve">, </w:t>
-      </w:r>
-      <w:proofErr w:type="spellStart"/>
-      <w:r>
-        <w:t>S</w:t>
+        <w:t>, S</w:t>
       </w:r>
       <w:r>
         <w:t>eafan</w:t>
       </w:r>
-      <w:proofErr w:type="spellEnd"/>
       <w:r>
         <w:t>, or I</w:t>
       </w:r>
@@ -5479,23 +5058,7 @@
         <w:t>edusa</w:t>
       </w:r>
       <w:r>
-        <w:t xml:space="preserve"> trunk pattern and a Complexity Score at or above the 65th percentile were labeled Medusa. Those with a SEAFAN trunk pattern and a Complexity Score at or above the 40th percentile </w:t>
-      </w:r>
-      <w:proofErr w:type="gramStart"/>
-      <w:r>
-        <w:t>were</w:t>
-      </w:r>
-      <w:proofErr w:type="gramEnd"/>
-      <w:r>
-        <w:t xml:space="preserve"> labeled </w:t>
-      </w:r>
-      <w:proofErr w:type="spellStart"/>
-      <w:r>
-        <w:t>Seafan</w:t>
-      </w:r>
-      <w:proofErr w:type="spellEnd"/>
-      <w:r>
-        <w:t xml:space="preserve">. Lesions with a Complexity Score at or above the 30th percentile were labeled Glomerular irrespective of trunk pattern. The remaining lesions were labeled Tree in bud, </w:t>
+        <w:t xml:space="preserve"> trunk pattern and a Complexity Score at or above the 65th percentile were labeled Medusa. Those with a SEAFAN trunk pattern and a Complexity Score at or above the 40th percentile were labeled Seafan. Lesions with a Complexity Score at or above the 30th percentile were labeled Glomerular irrespective of trunk pattern. The remaining lesions were labeled Tree in bud, </w:t>
       </w:r>
       <w:r>
         <w:t>typically corresponding to an intermediate trunk pattern and mid-to-low complexity.</w:t>
@@ -5506,31 +5069,7 @@
         <w:pStyle w:val="af2"/>
       </w:pPr>
       <w:r>
-        <w:t xml:space="preserve">The percentile </w:t>
-      </w:r>
-      <w:proofErr w:type="gramStart"/>
-      <w:r>
-        <w:t>cut-points</w:t>
-      </w:r>
-      <w:proofErr w:type="gramEnd"/>
-      <w:r>
-        <w:t xml:space="preserve"> for each stratum were taken from the reference files used by the classifier and are summarized in Supplementary Table S1. For the small (</w:t>
-      </w:r>
-      <w:proofErr w:type="spellStart"/>
-      <w:r>
-        <w:t>Optovue</w:t>
-      </w:r>
-      <w:proofErr w:type="spellEnd"/>
-      <w:r>
-        <w:t xml:space="preserve"> Solix) stratum, the reference cohort used to define the Complexity percentile </w:t>
-      </w:r>
-      <w:proofErr w:type="gramStart"/>
-      <w:r>
-        <w:t>cut-points</w:t>
-      </w:r>
-      <w:proofErr w:type="gramEnd"/>
-      <w:r>
-        <w:t xml:space="preserve"> included 34 lesions, whereas the primary analysis batch reported in Table 3 included 33 lesions.</w:t>
+        <w:t>The percentile cut-points for each stratum were taken from the reference files used by the classifier and are summarized in Supplementary Table S1. For the small (Optovue Solix) stratum, the reference cohort used to define the Complexity percentile cut-points included 34 lesions, whereas the primary analysis batch reported in Table 3 included 33 lesions.</w:t>
       </w:r>
     </w:p>
     <w:p>
@@ -5542,23 +5081,7 @@
       </w:pPr>
       <w:ins w:id="390" w:author="rev1" w:date="2026-08-03T08:56:00Z" w16du:dateUtc="2026-08-02T23:56:00Z">
         <w:r>
-          <w:t xml:space="preserve">Level 2 - morphology-derived interpretive categories. Separately, rule-based labels Active-pattern, Mature-quiescent-pattern, Transitional-pattern, and </w:t>
-        </w:r>
-        <w:proofErr w:type="spellStart"/>
-        <w:r>
-          <w:t>Arteriolarized</w:t>
-        </w:r>
-        <w:proofErr w:type="spellEnd"/>
-        <w:r>
-          <w:t xml:space="preserve">-pattern are assigned from Maturity Index, Caliber Uniformity Score, and </w:t>
-        </w:r>
-        <w:proofErr w:type="spellStart"/>
-        <w:r>
-          <w:t>arteriolarization</w:t>
-        </w:r>
-        <w:proofErr w:type="spellEnd"/>
-        <w:r>
-          <w:t xml:space="preserve"> indicators (segment count, junction density, loop count, mean diameter relative to stratum percentiles), informed by published morphological criteria [12]. </w:t>
+          <w:t xml:space="preserve">Level 2 - morphology-derived interpretive categories. Separately, rule-based labels Active-pattern, Mature-quiescent-pattern, Transitional-pattern, and Arteriolarized-pattern are assigned from Maturity Index, Caliber Uniformity Score, and arteriolarization indicators (segment count, junction density, loop count, mean diameter relative to stratum percentiles), informed by published morphological criteria [12]. </w:t>
         </w:r>
       </w:ins>
       <w:r>
@@ -5594,25 +5117,7 @@
           <w:color w:val="auto"/>
           <w:lang w:eastAsia="zh-CN"/>
         </w:rPr>
-        <w:t xml:space="preserve">A retinal specialist (Y.Y.) performed masked morphological grading on a stratified subset of study OCTA images (n = 54; stratum allocation 24 / 16 / 14 for large / small / small_3mm) without access to automated subtype labels at the time of grading. Expert grades were compared with rule-based automated labels. Overall percent agreement and quadratic weighted Cohen’s κ were computed using the ordinal ordering Dead tree, Tree in bud, Glomerular, </w:t>
-      </w:r>
-      <w:proofErr w:type="spellStart"/>
-      <w:r>
-        <w:rPr>
-          <w:rFonts w:asciiTheme="minorHAnsi" w:hAnsiTheme="minorHAnsi" w:cstheme="minorBidi"/>
-          <w:color w:val="auto"/>
-          <w:lang w:eastAsia="zh-CN"/>
-        </w:rPr>
-        <w:t>Seafan</w:t>
-      </w:r>
-      <w:proofErr w:type="spellEnd"/>
-      <w:r>
-        <w:rPr>
-          <w:rFonts w:asciiTheme="minorHAnsi" w:hAnsiTheme="minorHAnsi" w:cstheme="minorBidi"/>
-          <w:color w:val="auto"/>
-          <w:lang w:eastAsia="zh-CN"/>
-        </w:rPr>
-        <w:t>, and Medusa; bootstrap 95% CIs were obtained from 10,000 resamples. The confusion matrix is provided in the Supplementary Material. This analysis was presented as an expert–algorithm agreement assessment and was intended to describe concordance between masked expert grading and the automated labeling scheme.</w:t>
+        <w:t>A retinal specialist (Y.Y.) performed masked morphological grading on a stratified subset of study OCTA images (n = 54; stratum allocation 24 / 16 / 14 for large / small / small_3mm) without access to automated subtype labels at the time of grading. Expert grades were compared with rule-based automated labels. Overall percent agreement and quadratic weighted Cohen’s κ were computed using the ordinal ordering Dead tree, Tree in bud, Glomerular, Seafan, and Medusa; bootstrap 95% CIs were obtained from 10,000 resamples. The confusion matrix is provided in the Supplementary Material. This analysis was presented as an expert–algorithm agreement assessment and was intended to describe concordance between masked expert grading and the automated labeling scheme.</w:t>
       </w:r>
     </w:p>
     <w:p>
@@ -5637,15 +5142,7 @@
       </w:pPr>
       <w:ins w:id="397" w:author="rev1" w:date="2026-08-03T08:56:00Z" w16du:dateUtc="2026-08-02T23:56:00Z">
         <w:r>
-          <w:t xml:space="preserve">Inter-observer (primary multi-rater analysis). Three independent operators performed freehand ROI delineation. Complete three-observer data were available for n = 46 cases. Automated processing after ROI delineation was identical across observers. All images were Angiography 3×3 mm acquisitions on Zeiss CIRRUS </w:t>
-        </w:r>
-        <w:proofErr w:type="spellStart"/>
-        <w:r>
-          <w:t>AngioPlex</w:t>
-        </w:r>
-        <w:proofErr w:type="spellEnd"/>
-        <w:r>
-          <w:t xml:space="preserve"> (small_3mm stratum).</w:t>
+          <w:t>Inter-observer (primary multi-rater analysis). Three independent operators performed freehand ROI delineation. Complete three-observer data were available for n = 46 cases. Automated processing after ROI delineation was identical across observers. All images were Angiography 3×3 mm acquisitions on Zeiss CIRRUS AngioPlex (small_3mm stratum).</w:t>
         </w:r>
       </w:ins>
     </w:p>
@@ -5658,35 +5155,11 @@
       </w:pPr>
       <w:ins w:id="399" w:author="rev1" w:date="2026-08-03T08:56:00Z" w16du:dateUtc="2026-08-02T23:56:00Z">
         <w:r>
-          <w:t xml:space="preserve">Intra-rater and inter-rater reliabilities were assessed using intraclass correlation coefficients (ICCs) [13,14]. For both designs, we report </w:t>
-        </w:r>
-        <w:proofErr w:type="gramStart"/>
-        <w:r>
-          <w:t>ICC(</w:t>
-        </w:r>
-        <w:proofErr w:type="gramEnd"/>
-        <w:r>
-          <w:t>2,1) (two-way random-</w:t>
+          <w:t>Intra-rater and inter-rater reliabilities were assessed using intraclass correlation coefficients (ICCs) [13,14]. For both designs, we report ICC(2,1) (two-way random-</w:t>
         </w:r>
         <w:r>
           <w:lastRenderedPageBreak/>
-          <w:t xml:space="preserve">effects, absolute agreement, single measures). Inter-observer analyses treated three operators as random raters, while intra-observer test–retest treated the two YY sessions as random raters under the same absolute-agreement model (selecting </w:t>
-        </w:r>
-        <w:proofErr w:type="gramStart"/>
-        <w:r>
-          <w:t>ICC(</w:t>
-        </w:r>
-        <w:proofErr w:type="gramEnd"/>
-        <w:r>
-          <w:t xml:space="preserve">2,1) over </w:t>
-        </w:r>
-        <w:proofErr w:type="gramStart"/>
-        <w:r>
-          <w:t>ICC(</w:t>
-        </w:r>
-        <w:proofErr w:type="gramEnd"/>
-        <w:r>
-          <w:t>1,1) to appropriately account for the same rater contributing both sessions). Primary endpoints included MNV area, Standardized Vascular Complexity Score, the Caliber Uniformity Score, and Maturity Index derived from Caliber Uniformity Score. Pairwise ICCs and a multilevel variance-component ICC were reported as complementary summaries for the multi-rater set. Interpretive bands for continuous clinical measurements (poor &lt;0.50; moderate 0.50–0.75; good 0.75–0.90; excellent &gt;0.90) follow published guidance [15].</w:t>
+          <w:t>effects, absolute agreement, single measures). Inter-observer analyses treated three operators as random raters, while intra-observer test–retest treated the two YY sessions as random raters under the same absolute-agreement model (selecting ICC(2,1) over ICC(1,1) to appropriately account for the same rater contributing both sessions). Primary endpoints included MNV area, Standardized Vascular Complexity Score, the Caliber Uniformity Score, and Maturity Index derived from Caliber Uniformity Score. Pairwise ICCs and a multilevel variance-component ICC were reported as complementary summaries for the multi-rater set. Interpretive bands for continuous clinical measurements (poor &lt;0.50; moderate 0.50–0.75; good 0.75–0.90; excellent &gt;0.90) follow published guidance [15].</w:t>
         </w:r>
       </w:ins>
     </w:p>
@@ -5699,15 +5172,7 @@
       </w:pPr>
       <w:ins w:id="401" w:author="rev1" w:date="2026-08-03T08:56:00Z" w16du:dateUtc="2026-08-02T23:56:00Z">
         <w:r>
-          <w:t xml:space="preserve">Intra-observer (supplemental analysis). The original analyst (YY) repeated freehand ROI delineation on the same n = 46 lesions in a separate sitting; </w:t>
-        </w:r>
-        <w:proofErr w:type="gramStart"/>
-        <w:r>
-          <w:t>ICC(</w:t>
-        </w:r>
-        <w:proofErr w:type="gramEnd"/>
-        <w:r>
-          <w:t>2,1) was computed as above. To ensure comparability across sessions, Caliber Uniformity and Maturity Index were calculated using the same standardized definition applied to both sessions (the Standardized Caliber Uniformity Score used as the primary inter-observer endpoint), alongside Area and Complexity Score (unchanged definitions). Unharmonized Caliber/Maturity columns, which lacked cross-session standardization, were excluded from this comparison. Intra-observer estimates serve as a supplemental validation of the three-observer ICCs.</w:t>
+          <w:t>Intra-observer (supplemental analysis). The original analyst (YY) repeated freehand ROI delineation on the same n = 46 lesions in a separate sitting; ICC(2,1) was computed as above. To ensure comparability across sessions, Caliber Uniformity and Maturity Index were calculated using the same standardized definition applied to both sessions (the Standardized Caliber Uniformity Score used as the primary inter-observer endpoint), alongside Area and Complexity Score (unchanged definitions). Unharmonized Caliber/Maturity columns, which lacked cross-session standardization, were excluded from this comparison. Intra-observer estimates serve as a supplemental validation of the three-observer ICCs.</w:t>
         </w:r>
       </w:ins>
     </w:p>
@@ -5746,39 +5211,7 @@
       </w:pPr>
       <w:ins w:id="404" w:author="rev1" w:date="2026-08-03T08:56:00Z" w16du:dateUtc="2026-08-02T23:56:00Z">
         <w:r>
-          <w:t>Between-stratum differences in standardized scores were assessed with the Kruskal–</w:t>
-        </w:r>
-        <w:proofErr w:type="gramStart"/>
-        <w:r>
-          <w:t>Wallis</w:t>
-        </w:r>
-        <w:proofErr w:type="gramEnd"/>
-        <w:r>
-          <w:t xml:space="preserve"> test. Effect size was summarized as ε² = (H − k + 1) / (n − k) with k = </w:t>
-        </w:r>
-        <w:proofErr w:type="gramStart"/>
-        <w:r>
-          <w:t>3, and</w:t>
-        </w:r>
-        <w:proofErr w:type="gramEnd"/>
-        <w:r>
-          <w:t xml:space="preserve"> bootstrap 95% CIs (10,000 within-stratum resamples; fixed random seed for reproducibility). A non-significant Kruskal–</w:t>
-        </w:r>
-        <w:proofErr w:type="gramStart"/>
-        <w:r>
-          <w:t>Wallis</w:t>
-        </w:r>
-        <w:proofErr w:type="gramEnd"/>
-        <w:r>
-          <w:t xml:space="preserve"> test was interpreted cautiously, without inferring statistical equivalence. Although Formal TOST equivalence testing was considered, clinically meaningful equivalence margins for </w:t>
-        </w:r>
-        <w:proofErr w:type="gramStart"/>
-        <w:r>
-          <w:t>these novel</w:t>
-        </w:r>
-        <w:proofErr w:type="gramEnd"/>
-        <w:r>
-          <w:t xml:space="preserve"> 0–100 scores were not established at study design; therefore, we prioritized transparent reporting of effect sizes with CIs over post-hoc TOST with provisional margins. Agreement analyses and ICC methods are described above. Analyses were performed in Python 3.11 using standard scientific computing libraries for statistical modeling and hypothesis testing. A p-value &lt; 0.05 was considered statistically significant for omnibus Kruskal–Wallis tests, with non-significant results (p ≥ 0.05) reported as absence of evidence for difference rather than evidence of equivalence.</w:t>
+          <w:t>Between-stratum differences in standardized scores were assessed with the Kruskal–Wallis test. Effect size was summarized as ε² = (H − k + 1) / (n − k) with k = 3, and bootstrap 95% CIs (10,000 within-stratum resamples; fixed random seed for reproducibility). A non-significant Kruskal–Wallis test was interpreted cautiously, without inferring statistical equivalence. Although Formal TOST equivalence testing was considered, clinically meaningful equivalence margins for these novel 0–100 scores were not established at study design; therefore, we prioritized transparent reporting of effect sizes with CIs over post-hoc TOST with provisional margins. Agreement analyses and ICC methods are described above. Analyses were performed in Python 3.11 using standard scientific computing libraries for statistical modeling and hypothesis testing. A p-value &lt; 0.05 was considered statistically significant for omnibus Kruskal–Wallis tests, with non-significant results (p ≥ 0.05) reported as absence of evidence for difference rather than evidence of equivalence.</w:t>
         </w:r>
       </w:ins>
     </w:p>
@@ -6102,23 +5535,7 @@
       </w:r>
       <w:ins w:id="431" w:author="rev1" w:date="2026-08-03T08:56:00Z" w16du:dateUtc="2026-08-02T23:56:00Z">
         <w:r>
-          <w:t>. The processing workflow is summarized in Figure 2; representative intermediate panels (</w:t>
-        </w:r>
-        <w:proofErr w:type="spellStart"/>
-        <w:r>
-          <w:t>Frangi</w:t>
-        </w:r>
-        <w:proofErr w:type="spellEnd"/>
-        <w:r>
-          <w:t xml:space="preserve"> enhancement, </w:t>
-        </w:r>
-        <w:proofErr w:type="spellStart"/>
-        <w:r>
-          <w:t>Phansalkar</w:t>
-        </w:r>
-        <w:proofErr w:type="spellEnd"/>
-        <w:r>
-          <w:t xml:space="preserve"> binarization, skeletonization) are shown in Figure 3</w:t>
+          <w:t>. The processing workflow is summarized in Figure 2; representative intermediate panels (Frangi enhancement, Phansalkar binarization, skeletonization) are shown in Figure 3</w:t>
         </w:r>
       </w:ins>
       <w:r>
@@ -6238,21 +5655,7 @@
         <w:rPr>
           <w:rFonts w:ascii="Arial" w:hAnsi="Arial" w:cs="Arial"/>
         </w:rPr>
-        <w:t>ranged from 300.3 ± 199.2 in the large (</w:t>
-      </w:r>
-      <w:proofErr w:type="spellStart"/>
-      <w:r>
-        <w:rPr>
-          <w:rFonts w:ascii="Arial" w:hAnsi="Arial" w:cs="Arial"/>
-        </w:rPr>
-        <w:t>PlexElite</w:t>
-      </w:r>
-      <w:proofErr w:type="spellEnd"/>
-      <w:r>
-        <w:rPr>
-          <w:rFonts w:ascii="Arial" w:hAnsi="Arial" w:cs="Arial"/>
-        </w:rPr>
-        <w:t xml:space="preserve"> 6×</w:t>
+        <w:t>ranged from 300.3 ± 199.2 in the large (PlexElite 6×</w:t>
       </w:r>
       <w:ins w:id="440" w:author="rev1" w:date="2026-08-03T08:56:00Z" w16du:dateUtc="2026-08-02T23:56:00Z">
         <w:r>
@@ -6275,15 +5678,7 @@
       </w:r>
       <w:ins w:id="442" w:author="rev1" w:date="2026-08-03T08:56:00Z" w16du:dateUtc="2026-08-02T23:56:00Z">
         <w:r>
-          <w:t xml:space="preserve">CIRRUS </w:t>
-        </w:r>
-        <w:proofErr w:type="spellStart"/>
-        <w:r>
-          <w:t>AngioPlex</w:t>
-        </w:r>
-        <w:proofErr w:type="spellEnd"/>
-        <w:r>
-          <w:t xml:space="preserve"> / </w:t>
+          <w:t xml:space="preserve">CIRRUS AngioPlex / </w:t>
         </w:r>
       </w:ins>
       <w:r>
@@ -6311,14 +5706,9 @@
         </w:rPr>
         <w:t>) group and 89.5 ± 53.4 in the small (</w:t>
       </w:r>
-      <w:proofErr w:type="spellStart"/>
       <w:ins w:id="445" w:author="rev1" w:date="2026-08-03T08:56:00Z" w16du:dateUtc="2026-08-02T23:56:00Z">
         <w:r>
-          <w:t>Optovue</w:t>
-        </w:r>
-        <w:proofErr w:type="spellEnd"/>
-        <w:r>
-          <w:t xml:space="preserve"> </w:t>
+          <w:t xml:space="preserve">Optovue </w:t>
         </w:r>
       </w:ins>
       <w:r>
@@ -6544,15 +5934,7 @@
       <w:ins w:id="466" w:author="rev1" w:date="2026-08-03T08:56:00Z" w16du:dateUtc="2026-08-02T23:56:00Z">
         <w:r>
           <w:lastRenderedPageBreak/>
-          <w:t>Table 3 presents standardized scores after stratum-specific normalization, together with Kruskal–</w:t>
-        </w:r>
-        <w:proofErr w:type="gramStart"/>
-        <w:r>
-          <w:t>Wallis</w:t>
-        </w:r>
-        <w:proofErr w:type="gramEnd"/>
-        <w:r>
-          <w:t xml:space="preserve"> statistics and ε² effect sizes (primary analysis set, n = 112: large = 49, small = 33, small_3mm = 30). The Standardized Vascular Complexity Score uses stratum-specific PCA with piecewise-linear PC scaling (PC1 explained variance 63.7% / 73.9% / 70.2% for large / small_3mm / small). Caliber Uniformity uses the Standardized Caliber Uniformity Score; Maturity Index is recomputed from that Caliber score and Complexity. By design, the piecewise-linear normalization maps each stratum’s locking-cohort median to 50 on the scaled axes. Consequently, median values near 50 after normalization are a direct mathematical consequence of this scaling procedure. These scores serve as a standardized reporting scale for within-stratum assessment and for applying shared rule-based thresholds across acquisition strata, while maintaining stratum-specific reference frames.</w:t>
+          <w:t>Table 3 presents standardized scores after stratum-specific normalization, together with Kruskal–Wallis statistics and ε² effect sizes (primary analysis set, n = 112: large = 49, small = 33, small_3mm = 30). The Standardized Vascular Complexity Score uses stratum-specific PCA with piecewise-linear PC scaling (PC1 explained variance 63.7% / 73.9% / 70.2% for large / small_3mm / small). Caliber Uniformity uses the Standardized Caliber Uniformity Score; Maturity Index is recomputed from that Caliber score and Complexity. By design, the piecewise-linear normalization maps each stratum’s locking-cohort median to 50 on the scaled axes. Consequently, median values near 50 after normalization are a direct mathematical consequence of this scaling procedure. These scores serve as a standardized reporting scale for within-stratum assessment and for applying shared rule-based thresholds across acquisition strata, while maintaining stratum-specific reference frames.</w:t>
         </w:r>
       </w:ins>
     </w:p>
@@ -6777,19 +6159,11 @@
           <w:t xml:space="preserve">Medusa pattern was observed only in the large group (n = 6, 12.2%). </w:t>
         </w:r>
       </w:ins>
-      <w:proofErr w:type="spellStart"/>
-      <w:r>
-        <w:rPr>
-          <w:rFonts w:ascii="Arial" w:hAnsi="Arial" w:cs="Arial"/>
-        </w:rPr>
-        <w:t>Seafan</w:t>
-      </w:r>
-      <w:proofErr w:type="spellEnd"/>
-      <w:r>
-        <w:rPr>
-          <w:rFonts w:ascii="Arial" w:hAnsi="Arial" w:cs="Arial"/>
-        </w:rPr>
-        <w:t xml:space="preserve"> pattern was more common in the small_3mm group (n</w:t>
+      <w:r>
+        <w:rPr>
+          <w:rFonts w:ascii="Arial" w:hAnsi="Arial" w:cs="Arial"/>
+        </w:rPr>
+        <w:t>Seafan pattern was more common in the small_3mm group (n</w:t>
       </w:r>
       <w:ins w:id="489" w:author="rev1" w:date="2026-08-03T08:56:00Z" w16du:dateUtc="2026-08-02T23:56:00Z">
         <w:r>
@@ -6915,15 +6289,7 @@
       </w:pPr>
       <w:ins w:id="502" w:author="rev1" w:date="2026-08-03T08:56:00Z" w16du:dateUtc="2026-08-02T23:56:00Z">
         <w:r>
-          <w:t xml:space="preserve">On the masked expert subset (n = 54), overall agreement between expert and automated labels was 57.4% (31/54); quadratic weighted Cohen’s κ was 0.507 (95% CI 0.222–0.714). When Glomerular and </w:t>
-        </w:r>
-        <w:proofErr w:type="spellStart"/>
-        <w:r>
-          <w:t>Seafan</w:t>
-        </w:r>
-        <w:proofErr w:type="spellEnd"/>
-        <w:r>
-          <w:t xml:space="preserve"> were merged on both sides (4-class </w:t>
+          <w:t xml:space="preserve">On the masked expert subset (n = 54), overall agreement between expert and automated labels was 57.4% (31/54); quadratic weighted Cohen’s κ was 0.507 (95% CI 0.222–0.714). When Glomerular and Seafan were merged on both sides (4-class </w:t>
         </w:r>
         <w:r>
           <w:lastRenderedPageBreak/>
@@ -6993,15 +6359,7 @@
       </w:pPr>
       <w:ins w:id="510" w:author="rev1" w:date="2026-08-03T08:56:00Z" w16du:dateUtc="2026-08-02T23:56:00Z">
         <w:r>
-          <w:t>Inter-observer reproducibility was assessed in a three-rater subset of 46 lesions. Agreement was good for lesion area (</w:t>
-        </w:r>
-        <w:proofErr w:type="gramStart"/>
-        <w:r>
-          <w:t>ICC(</w:t>
-        </w:r>
-        <w:proofErr w:type="gramEnd"/>
-        <w:r>
-          <w:t>2,1) = 0.859; 95% CI 0.680–0.930),</w:t>
+          <w:t>Inter-observer reproducibility was assessed in a three-rater subset of 46 lesions. Agreement was good for lesion area (ICC(2,1) = 0.859; 95% CI 0.680–0.930),</w:t>
         </w:r>
       </w:ins>
       <w:del w:id="511" w:author="rev1" w:date="2026-08-03T08:56:00Z" w16du:dateUtc="2026-08-02T23:56:00Z">
@@ -7020,31 +6378,7 @@
       </w:r>
       <w:ins w:id="512" w:author="rev1" w:date="2026-08-03T08:56:00Z" w16du:dateUtc="2026-08-02T23:56:00Z">
         <w:r>
-          <w:t>Standardized Vascular Complexity Score (</w:t>
-        </w:r>
-        <w:proofErr w:type="gramStart"/>
-        <w:r>
-          <w:t>ICC(</w:t>
-        </w:r>
-        <w:proofErr w:type="gramEnd"/>
-        <w:r>
-          <w:t>2,1) = 0.807; 95% CI 0.660–0.890), and the Standardized Caliber Uniformity Score (</w:t>
-        </w:r>
-        <w:proofErr w:type="gramStart"/>
-        <w:r>
-          <w:t>ICC(</w:t>
-        </w:r>
-        <w:proofErr w:type="gramEnd"/>
-        <w:r>
-          <w:t>2,1) = 0.770; 95% CI 0.660–0.860). In contrast, the Maturity Index showed only moderate agreement (</w:t>
-        </w:r>
-        <w:proofErr w:type="gramStart"/>
-        <w:r>
-          <w:t>ICC(</w:t>
-        </w:r>
-        <w:proofErr w:type="gramEnd"/>
-        <w:r>
-          <w:t>2,1) = 0.593; 95% CI 0.430–0.730), consistent with the lower reproducibility of the composite measure derived from the Caliber Uniformity Score</w:t>
+          <w:t>Standardized Vascular Complexity Score (ICC(2,1) = 0.807; 95% CI 0.660–0.890), and the Standardized Caliber Uniformity Score (ICC(2,1) = 0.770; 95% CI 0.660–0.860). In contrast, the Maturity Index showed only moderate agreement (ICC(2,1) = 0.593; 95% CI 0.430–0.730), consistent with the lower reproducibility of the composite measure derived from the Caliber Uniformity Score</w:t>
         </w:r>
       </w:ins>
       <w:del w:id="513" w:author="rev1" w:date="2026-08-03T08:56:00Z" w16du:dateUtc="2026-08-02T23:56:00Z">
@@ -7071,15 +6405,7 @@
       </w:pPr>
       <w:ins w:id="515" w:author="rev1" w:date="2026-08-03T08:56:00Z" w16du:dateUtc="2026-08-02T23:56:00Z">
         <w:r>
-          <w:t xml:space="preserve">Intra-observer reproducibility was excellent in the same 46-lesion subset. For the second session of the same rater, </w:t>
-        </w:r>
-        <w:proofErr w:type="gramStart"/>
-        <w:r>
-          <w:t>ICC(</w:t>
-        </w:r>
-        <w:proofErr w:type="gramEnd"/>
-        <w:r>
-          <w:t>2,1) values were 0.979 (95% CI 0.962–0.988) for lesion area, 0.950 (95% CI 0.913–0.973) for the Standardized Vascular Complexity Score, 0.925 (95% CI 0.871–0.959) for the Standardized Caliber Uniformity Score, and 0.917 (95% CI 0.857–0.954) for the Maturity Index. These findings indicate consistently high within-rater repeatability under the fixed score definition and complement the primary multi-rater reproducibility analysis.</w:t>
+          <w:t>Intra-observer reproducibility was excellent in the same 46-lesion subset. For the second session of the same rater, ICC(2,1) values were 0.979 (95% CI 0.962–0.988) for lesion area, 0.950 (95% CI 0.913–0.973) for the Standardized Vascular Complexity Score, 0.925 (95% CI 0.871–0.959) for the Standardized Caliber Uniformity Score, and 0.917 (95% CI 0.857–0.954) for the Maturity Index. These findings indicate consistently high within-rater repeatability under the fixed score definition and complement the primary multi-rater reproducibility analysis.</w:t>
         </w:r>
       </w:ins>
     </w:p>
@@ -7605,15 +6931,7 @@
       </w:r>
       <w:ins w:id="557" w:author="rev1" w:date="2026-08-03T08:56:00Z" w16du:dateUtc="2026-08-02T23:56:00Z">
         <w:r>
-          <w:t>designed to place scores on a common reporting axis [6]. Informative aspects of the framework include: (</w:t>
-        </w:r>
-        <w:proofErr w:type="spellStart"/>
-        <w:r>
-          <w:t>i</w:t>
-        </w:r>
-        <w:proofErr w:type="spellEnd"/>
-        <w:r>
-          <w:t>) large between-device differences in raw metrics (Table 2); (ii) consistency of Complexity PCA structure (</w:t>
+          <w:t>designed to place scores on a common reporting axis [6]. Informative aspects of the framework include: (i) large between-device differences in raw metrics (Table 2); (ii) consistency of Complexity PCA structure (</w:t>
         </w:r>
       </w:ins>
       <w:del w:id="558" w:author="rev1" w:date="2026-08-03T08:56:00Z" w16du:dateUtc="2026-08-02T23:56:00Z">
@@ -7693,31 +7011,7 @@
       </w:pPr>
       <w:ins w:id="566" w:author="rev1" w:date="2026-08-03T08:56:00Z" w16du:dateUtc="2026-08-02T23:56:00Z">
         <w:r>
-          <w:t xml:space="preserve">We also address terminological ambiguity around maturation, arterialization, and </w:t>
-        </w:r>
-        <w:proofErr w:type="spellStart"/>
-        <w:r>
-          <w:t>abnormalization</w:t>
-        </w:r>
-        <w:proofErr w:type="spellEnd"/>
-        <w:r>
-          <w:t xml:space="preserve"> [27–30]. Our morphology-derived interpretive categories map quantitative patterns onto labels informed by published criteria, including </w:t>
-        </w:r>
-        <w:proofErr w:type="spellStart"/>
-        <w:r>
-          <w:t>arteriolarization</w:t>
-        </w:r>
-        <w:proofErr w:type="spellEnd"/>
-        <w:r>
-          <w:t xml:space="preserve">-segment detection and caliber-uniformity scores related to the unstable vascular state described by Spaide as </w:t>
-        </w:r>
-        <w:proofErr w:type="spellStart"/>
-        <w:r>
-          <w:t>abnormalization</w:t>
-        </w:r>
-        <w:proofErr w:type="spellEnd"/>
-        <w:r>
-          <w:t xml:space="preserve"> [30]. </w:t>
+          <w:t xml:space="preserve">We also address terminological ambiguity around maturation, arterialization, and abnormalization [27–30]. Our morphology-derived interpretive categories map quantitative patterns onto labels informed by published criteria, including arteriolarization-segment detection and caliber-uniformity scores related to the unstable vascular state described by Spaide as abnormalization [30]. </w:t>
         </w:r>
       </w:ins>
       <w:r>
@@ -8486,788 +7780,1686 @@
         <w:t>References</w:t>
       </w:r>
     </w:p>
-    <w:p>
-      <w:pPr>
-        <w:pStyle w:val="FirstParagraph"/>
-        <w:rPr>
-          <w:ins w:id="600" w:author="rev1" w:date="2026-08-03T08:56:00Z" w16du:dateUtc="2026-08-02T23:56:00Z"/>
-        </w:rPr>
-      </w:pPr>
-      <w:ins w:id="601" w:author="rev1" w:date="2026-08-03T08:56:00Z" w16du:dateUtc="2026-08-02T23:56:00Z">
-        <w:r>
-          <w:t xml:space="preserve">1. Guo, J., Tang, W., Xu, S., Liu, W. &amp; Xu, G. OCTA evaluation of treatment-naïve flat irregular PED (FIPED)-associated CNV in chronic central serous chorioretinopathy before and after half-dose PDT. </w:t>
+    <w:bookmarkEnd w:id="599"/>
+    <w:p>
+      <w:pPr>
+        <w:pStyle w:val="aa"/>
+        <w:ind w:left="0" w:firstLine="0"/>
+        <w:rPr>
+          <w:rFonts w:asciiTheme="minorHAnsi" w:hAnsiTheme="minorHAnsi" w:cstheme="minorBidi"/>
+          <w:lang w:eastAsia="zh-CN"/>
+        </w:rPr>
+      </w:pPr>
+      <w:r>
+        <w:rPr>
+          <w:rFonts w:asciiTheme="minorHAnsi" w:hAnsiTheme="minorHAnsi" w:cstheme="minorBidi"/>
+          <w:lang w:eastAsia="zh-CN"/>
+        </w:rPr>
+        <w:t>1. Guo, J., Tang, W., Xu, S., Liu, W. &amp; Xu, G. OCTA evaluation of treatment-naïve flat irregular PED (FIPED)-associated CNV in chronic central serous chorioretinopathy before and after half-dose PDT. Eye 35, 2871–2878 (2021).</w:t>
+      </w:r>
+    </w:p>
+    <w:p>
+      <w:pPr>
+        <w:pStyle w:val="aa"/>
+        <w:ind w:left="0" w:firstLine="0"/>
+        <w:rPr>
+          <w:rFonts w:asciiTheme="minorHAnsi" w:hAnsiTheme="minorHAnsi" w:cstheme="minorBidi"/>
+          <w:lang w:eastAsia="zh-CN"/>
+        </w:rPr>
+      </w:pPr>
+      <w:r>
+        <w:rPr>
+          <w:rFonts w:asciiTheme="minorHAnsi" w:hAnsiTheme="minorHAnsi" w:cstheme="minorBidi"/>
+          <w:lang w:eastAsia="zh-CN"/>
+        </w:rPr>
+        <w:t>2. Zudaire, E., Gambardella, L., Kurcz, C. &amp; Vermeren, S. A Computational Tool for Quantitative Analysis of Vascular Networks. PLOS ONE 6, e27385 (2011).</w:t>
+      </w:r>
+    </w:p>
+    <w:p>
+      <w:pPr>
+        <w:pStyle w:val="aa"/>
+        <w:ind w:left="0" w:firstLine="0"/>
+        <w:rPr>
+          <w:rFonts w:asciiTheme="minorHAnsi" w:hAnsiTheme="minorHAnsi" w:cstheme="minorBidi"/>
+          <w:lang w:eastAsia="zh-CN"/>
+        </w:rPr>
+      </w:pPr>
+      <w:r>
+        <w:rPr>
+          <w:rFonts w:asciiTheme="minorHAnsi" w:hAnsiTheme="minorHAnsi" w:cstheme="minorBidi"/>
+          <w:lang w:eastAsia="zh-CN"/>
+        </w:rPr>
+        <w:t>3. Told, R. et al. Profiling neovascular age-related macular degeneration choroidal neovascularization lesion response to anti-vascular endothelial growth factor therapy using SSOCTA. Acta Ophthalmol. (Copenh.) 99, e240–e246 (2021).</w:t>
+      </w:r>
+    </w:p>
+    <w:p>
+      <w:pPr>
+        <w:pStyle w:val="aa"/>
+        <w:ind w:left="0" w:firstLine="0"/>
+        <w:rPr>
+          <w:rFonts w:asciiTheme="minorHAnsi" w:hAnsiTheme="minorHAnsi" w:cstheme="minorBidi"/>
+          <w:lang w:eastAsia="zh-CN"/>
+        </w:rPr>
+      </w:pPr>
+      <w:r>
+        <w:rPr>
+          <w:rFonts w:asciiTheme="minorHAnsi" w:hAnsiTheme="minorHAnsi" w:cstheme="minorBidi"/>
+          <w:lang w:eastAsia="zh-CN"/>
+        </w:rPr>
+        <w:t>4. Montesel, A. et al. Quantitative response of macular neovascularisation to loading phase of aflibercept in neovascular age-related macular degeneration. Eye 37, 3648–3655 (2023).</w:t>
+      </w:r>
+    </w:p>
+    <w:p>
+      <w:pPr>
+        <w:pStyle w:val="aa"/>
+        <w:ind w:left="0" w:firstLine="0"/>
+        <w:rPr>
+          <w:rFonts w:asciiTheme="minorHAnsi" w:hAnsiTheme="minorHAnsi" w:cstheme="minorBidi"/>
+          <w:lang w:eastAsia="zh-CN"/>
+        </w:rPr>
+      </w:pPr>
+      <w:r>
+        <w:rPr>
+          <w:rFonts w:asciiTheme="minorHAnsi" w:hAnsiTheme="minorHAnsi" w:cstheme="minorBidi"/>
+          <w:lang w:eastAsia="zh-CN"/>
+        </w:rPr>
+        <w:t xml:space="preserve">5. Carlà, M. M. et al. MORPHOMETRIC CHANGES IN MACULAR NEOVASCULARIZATION ARCHITECTURE AFTER FARICIMAB TREATMENT IN NEOVASCULAR AGE-RELATED MACULAR DEGENERATION: Comparison </w:t>
+      </w:r>
+      <w:r>
+        <w:rPr>
+          <w:rFonts w:asciiTheme="minorHAnsi" w:hAnsiTheme="minorHAnsi" w:cstheme="minorBidi"/>
+          <w:lang w:eastAsia="zh-CN"/>
+        </w:rPr>
+        <w:lastRenderedPageBreak/>
+        <w:t>Between Naive and Switched Eyes. Retina 125–135 (2026) doi:10.1097/iae.0000000000004635.</w:t>
+      </w:r>
+    </w:p>
+    <w:p>
+      <w:pPr>
+        <w:pStyle w:val="aa"/>
+        <w:ind w:left="0" w:firstLine="0"/>
+        <w:rPr>
+          <w:rFonts w:asciiTheme="minorHAnsi" w:hAnsiTheme="minorHAnsi" w:cstheme="minorBidi"/>
+          <w:lang w:eastAsia="zh-CN"/>
+        </w:rPr>
+      </w:pPr>
+      <w:r>
+        <w:rPr>
+          <w:rFonts w:asciiTheme="minorHAnsi" w:hAnsiTheme="minorHAnsi" w:cstheme="minorBidi"/>
+          <w:lang w:eastAsia="zh-CN"/>
+        </w:rPr>
+        <w:t>6. Munk, M. R. et al. OCT-angiography: A qualitative and quantitative comparison of 4 OCT-A devices. PLOS ONE 12, e0177059 (2017).</w:t>
+      </w:r>
+    </w:p>
+    <w:p>
+      <w:pPr>
+        <w:pStyle w:val="aa"/>
+        <w:ind w:left="0" w:firstLine="0"/>
+        <w:rPr>
+          <w:rFonts w:asciiTheme="minorHAnsi" w:hAnsiTheme="minorHAnsi" w:cstheme="minorBidi"/>
+          <w:lang w:eastAsia="zh-CN"/>
+        </w:rPr>
+      </w:pPr>
+      <w:r>
+        <w:rPr>
+          <w:rFonts w:asciiTheme="minorHAnsi" w:hAnsiTheme="minorHAnsi" w:cstheme="minorBidi"/>
+          <w:lang w:eastAsia="zh-CN"/>
+        </w:rPr>
+        <w:t>7. Miere, A. et al. VASCULAR REMODELING OF CHOROIDAL NEOVASCULARIZATION AFTER ANTI-VASCULAR ENDOTHELIAL GROWTH FACTOR THERAPY VISUALIZED ON OPTICAL COHERENCE TOMOGRAPHY ANGIOGRAPHY. Retina 39, 548–557 (2019).</w:t>
+      </w:r>
+    </w:p>
+    <w:p>
+      <w:pPr>
+        <w:pStyle w:val="aa"/>
+        <w:ind w:left="0" w:firstLine="0"/>
+        <w:rPr>
+          <w:rFonts w:asciiTheme="minorHAnsi" w:hAnsiTheme="minorHAnsi" w:cstheme="minorBidi"/>
+          <w:lang w:eastAsia="zh-CN"/>
+        </w:rPr>
+      </w:pPr>
+      <w:r>
+        <w:rPr>
+          <w:rFonts w:asciiTheme="minorHAnsi" w:hAnsiTheme="minorHAnsi" w:cstheme="minorBidi"/>
+          <w:lang w:eastAsia="zh-CN"/>
+        </w:rPr>
+        <w:t>8. Tew, T. B. et al. Comparison of different morphologies of choroidal neovascularization evaluated by ocular coherence tomography angiography in age-related macular degeneration. Clin. Experiment. Ophthalmol. 48, 927–937 (2020).</w:t>
+      </w:r>
+    </w:p>
+    <w:p>
+      <w:pPr>
+        <w:pStyle w:val="aa"/>
+        <w:ind w:left="0" w:firstLine="0"/>
+        <w:rPr>
+          <w:rFonts w:asciiTheme="minorHAnsi" w:hAnsiTheme="minorHAnsi" w:cstheme="minorBidi"/>
+          <w:lang w:eastAsia="zh-CN"/>
+        </w:rPr>
+      </w:pPr>
+      <w:r>
+        <w:rPr>
+          <w:rFonts w:asciiTheme="minorHAnsi" w:hAnsiTheme="minorHAnsi" w:cstheme="minorBidi"/>
+          <w:lang w:eastAsia="zh-CN"/>
+        </w:rPr>
+        <w:t>9. Oliveira, W. S., Teixeira, J. V., Ren, T. I., Cavalcanti, G. D. C. &amp; Sijbers, J. Unsupervised Retinal Vessel Segmentation Using Combined Filters. PLoS ONE 11, e0149943 (2016).</w:t>
+      </w:r>
+    </w:p>
+    <w:p>
+      <w:pPr>
+        <w:pStyle w:val="aa"/>
+        <w:ind w:left="0" w:firstLine="0"/>
+        <w:rPr>
+          <w:rFonts w:asciiTheme="minorHAnsi" w:hAnsiTheme="minorHAnsi" w:cstheme="minorBidi"/>
+          <w:lang w:eastAsia="zh-CN"/>
+        </w:rPr>
+      </w:pPr>
+      <w:r>
+        <w:rPr>
+          <w:rFonts w:asciiTheme="minorHAnsi" w:hAnsiTheme="minorHAnsi" w:cstheme="minorBidi"/>
+          <w:lang w:eastAsia="zh-CN"/>
+        </w:rPr>
+        <w:t>10. Ma, Y. et al. Multichannel Retinal Blood Vessel Segmentation Based on the Combination of Matched Filter and U-Net Network. BioMed Res. Int. 2021, 5561125 (2021).</w:t>
+      </w:r>
+    </w:p>
+    <w:p>
+      <w:pPr>
+        <w:pStyle w:val="aa"/>
+        <w:ind w:left="0" w:firstLine="0"/>
+        <w:rPr>
+          <w:rFonts w:asciiTheme="minorHAnsi" w:hAnsiTheme="minorHAnsi" w:cstheme="minorBidi"/>
+          <w:lang w:eastAsia="zh-CN"/>
+        </w:rPr>
+      </w:pPr>
+      <w:r>
+        <w:rPr>
+          <w:rFonts w:asciiTheme="minorHAnsi" w:hAnsiTheme="minorHAnsi" w:cstheme="minorBidi"/>
+          <w:lang w:eastAsia="zh-CN"/>
+        </w:rPr>
+        <w:t>11. Memari, N., Ramli, A. R., Bin Saripan, M. I., Mashohor, S. &amp; Moghbel, M. Supervised retinal vessel segmentation from color fundus images based on matched filtering and AdaBoost classifier. PLoS ONE 12, e0188939 (2017).</w:t>
+      </w:r>
+    </w:p>
+    <w:p>
+      <w:pPr>
+        <w:pStyle w:val="aa"/>
+        <w:ind w:left="0" w:firstLine="0"/>
+        <w:rPr>
+          <w:rFonts w:asciiTheme="minorHAnsi" w:hAnsiTheme="minorHAnsi" w:cstheme="minorBidi"/>
+          <w:lang w:eastAsia="zh-CN"/>
+        </w:rPr>
+      </w:pPr>
+      <w:r>
+        <w:rPr>
+          <w:rFonts w:asciiTheme="minorHAnsi" w:hAnsiTheme="minorHAnsi" w:cstheme="minorBidi"/>
+          <w:lang w:eastAsia="zh-CN"/>
+        </w:rPr>
+        <w:lastRenderedPageBreak/>
+        <w:t>12. Coscas, F. et al. Optical coherence tomography angiography in exudative age-related macular degeneration: A predictive model for treatment decisions. Br. J. Ophthalmol. 103, 1342–1356 (2019).</w:t>
+      </w:r>
+    </w:p>
+    <w:p>
+      <w:pPr>
+        <w:pStyle w:val="aa"/>
+        <w:ind w:left="0" w:firstLine="0"/>
+        <w:rPr>
+          <w:rFonts w:asciiTheme="minorHAnsi" w:hAnsiTheme="minorHAnsi" w:cstheme="minorBidi"/>
+          <w:lang w:eastAsia="zh-CN"/>
+        </w:rPr>
+      </w:pPr>
+      <w:r>
+        <w:rPr>
+          <w:rFonts w:asciiTheme="minorHAnsi" w:hAnsiTheme="minorHAnsi" w:cstheme="minorBidi"/>
+          <w:lang w:eastAsia="zh-CN"/>
+        </w:rPr>
+        <w:t>13. Shrout, P. E. &amp; Fleiss, J. L. Intraclass correlations: uses in assessing rater reliability. Psychol. Bull. 86, 420–428 (1979).</w:t>
+      </w:r>
+    </w:p>
+    <w:p>
+      <w:pPr>
+        <w:pStyle w:val="aa"/>
+        <w:ind w:left="0" w:firstLine="0"/>
+        <w:rPr>
+          <w:rFonts w:asciiTheme="minorHAnsi" w:hAnsiTheme="minorHAnsi" w:cstheme="minorBidi"/>
+          <w:lang w:eastAsia="zh-CN"/>
+        </w:rPr>
+      </w:pPr>
+      <w:r>
+        <w:rPr>
+          <w:rFonts w:asciiTheme="minorHAnsi" w:hAnsiTheme="minorHAnsi" w:cstheme="minorBidi"/>
+          <w:lang w:eastAsia="zh-CN"/>
+        </w:rPr>
+        <w:t>14. McGraw, K. O. &amp; Wong, S. P. Forming inferences about some intraclass correlation coefficients. Psychol. Methods 1, 30–46 (1996).</w:t>
+      </w:r>
+    </w:p>
+    <w:p>
+      <w:pPr>
+        <w:pStyle w:val="aa"/>
+        <w:ind w:left="0" w:firstLine="0"/>
+        <w:rPr>
+          <w:rFonts w:asciiTheme="minorHAnsi" w:hAnsiTheme="minorHAnsi" w:cstheme="minorBidi"/>
+          <w:lang w:eastAsia="zh-CN"/>
+        </w:rPr>
+      </w:pPr>
+      <w:r>
+        <w:rPr>
+          <w:rFonts w:asciiTheme="minorHAnsi" w:hAnsiTheme="minorHAnsi" w:cstheme="minorBidi"/>
+          <w:lang w:eastAsia="zh-CN"/>
+        </w:rPr>
+        <w:t>15. Koo, T. K. &amp; Li, M. Y. A guideline of selecting and reporting intraclass correlation coefficients for reliability research. J. Chiropr. Med. 15, 155–163 (2016).</w:t>
+      </w:r>
+    </w:p>
+    <w:p>
+      <w:pPr>
+        <w:pStyle w:val="aa"/>
+        <w:ind w:left="0" w:firstLine="0"/>
+        <w:rPr>
+          <w:rFonts w:asciiTheme="minorHAnsi" w:hAnsiTheme="minorHAnsi" w:cstheme="minorBidi"/>
+          <w:lang w:eastAsia="zh-CN"/>
+        </w:rPr>
+      </w:pPr>
+      <w:r>
+        <w:rPr>
+          <w:rFonts w:asciiTheme="minorHAnsi" w:hAnsiTheme="minorHAnsi" w:cstheme="minorBidi"/>
+          <w:lang w:eastAsia="zh-CN"/>
+        </w:rPr>
+        <w:t>16. Corvi, F. et al. Reproducibility of vessel density, fractal dimension, and foveal avascular zone using 7 different optical coherence tomography angiography devices. Am. J. Ophthalmol. 186, 25–31 (2018).</w:t>
+      </w:r>
+    </w:p>
+    <w:p>
+      <w:pPr>
+        <w:pStyle w:val="aa"/>
+        <w:ind w:left="0" w:firstLine="0"/>
+        <w:rPr>
+          <w:rFonts w:asciiTheme="minorHAnsi" w:hAnsiTheme="minorHAnsi" w:cstheme="minorBidi"/>
+          <w:lang w:eastAsia="zh-CN"/>
+        </w:rPr>
+      </w:pPr>
+      <w:r>
+        <w:rPr>
+          <w:rFonts w:asciiTheme="minorHAnsi" w:hAnsiTheme="minorHAnsi" w:cstheme="minorBidi"/>
+          <w:lang w:eastAsia="zh-CN"/>
+        </w:rPr>
+        <w:t>17. Corvi, F. et al. Comparison between several optical coherence tomography angiography devices and indocyanine green angiography of choroidal neovascularization. Retina 40, 873–880 (2020).</w:t>
+      </w:r>
+    </w:p>
+    <w:p>
+      <w:pPr>
+        <w:pStyle w:val="aa"/>
+        <w:ind w:left="0" w:firstLine="0"/>
+        <w:rPr>
+          <w:rFonts w:asciiTheme="minorHAnsi" w:hAnsiTheme="minorHAnsi" w:cstheme="minorBidi"/>
+          <w:lang w:eastAsia="zh-CN"/>
+        </w:rPr>
+      </w:pPr>
+      <w:r>
+        <w:rPr>
+          <w:rFonts w:asciiTheme="minorHAnsi" w:hAnsiTheme="minorHAnsi" w:cstheme="minorBidi"/>
+          <w:lang w:eastAsia="zh-CN"/>
+        </w:rPr>
+        <w:t>18. Wang, M. et al. Evaluating Polypoidal Choroidal Vasculopathy With Optical Coherence Tomography Angiography. Investig. Opthalmology Vis. Sci. 57, OCT526-32 (2016).</w:t>
+      </w:r>
+    </w:p>
+    <w:p>
+      <w:pPr>
+        <w:pStyle w:val="aa"/>
+        <w:ind w:left="0" w:firstLine="0"/>
+        <w:rPr>
+          <w:rFonts w:asciiTheme="minorHAnsi" w:hAnsiTheme="minorHAnsi" w:cstheme="minorBidi"/>
+          <w:lang w:eastAsia="zh-CN"/>
+        </w:rPr>
+      </w:pPr>
+      <w:r>
+        <w:rPr>
+          <w:rFonts w:asciiTheme="minorHAnsi" w:hAnsiTheme="minorHAnsi" w:cstheme="minorBidi"/>
+          <w:lang w:eastAsia="zh-CN"/>
+        </w:rPr>
+        <w:t xml:space="preserve">19. Xue, J. et al. Automatic quantification of choroidal neovascularization lesion area on OCT angiography based on density cell-like P systems with active membranes. </w:t>
+      </w:r>
+      <w:r>
+        <w:rPr>
+          <w:rFonts w:asciiTheme="minorHAnsi" w:hAnsiTheme="minorHAnsi" w:cstheme="minorBidi"/>
+          <w:lang w:eastAsia="zh-CN"/>
+        </w:rPr>
+        <w:lastRenderedPageBreak/>
+        <w:t>Biomed. Opt. Express 9, 3208–3219 (2018).</w:t>
+      </w:r>
+    </w:p>
+    <w:p>
+      <w:pPr>
+        <w:pStyle w:val="aa"/>
+        <w:ind w:left="0" w:firstLine="0"/>
+        <w:rPr>
+          <w:rFonts w:asciiTheme="minorHAnsi" w:hAnsiTheme="minorHAnsi" w:cstheme="minorBidi"/>
+          <w:lang w:eastAsia="zh-CN"/>
+        </w:rPr>
+      </w:pPr>
+      <w:r>
+        <w:rPr>
+          <w:rFonts w:asciiTheme="minorHAnsi" w:hAnsiTheme="minorHAnsi" w:cstheme="minorBidi"/>
+          <w:lang w:eastAsia="zh-CN"/>
+        </w:rPr>
+        <w:t>20. Babiuch, A. et al. IMPACT OF OPTICAL COHERENCE TOMOGRAPHY ANGIOGRAPHY REVIEW STRATEGY ON DETECTION OF CHOROIDAL NEOVASCULARIZATION. Retina 672–678 (2020) doi:10.1097/iae.0000000000002443.</w:t>
+      </w:r>
+    </w:p>
+    <w:p>
+      <w:pPr>
+        <w:pStyle w:val="aa"/>
+        <w:ind w:left="0" w:firstLine="0"/>
+        <w:rPr>
+          <w:rFonts w:asciiTheme="minorHAnsi" w:hAnsiTheme="minorHAnsi" w:cstheme="minorBidi"/>
+          <w:lang w:eastAsia="zh-CN"/>
+        </w:rPr>
+      </w:pPr>
+      <w:r>
+        <w:rPr>
+          <w:rFonts w:asciiTheme="minorHAnsi" w:hAnsiTheme="minorHAnsi" w:cstheme="minorBidi"/>
+          <w:lang w:eastAsia="zh-CN"/>
+        </w:rPr>
+        <w:t>21. Smith, A. &amp; Zavala, V. The Euler characteristic: A general topological descriptor for complex data. Comput Chem Eng 154, 107463 (2021).</w:t>
+      </w:r>
+    </w:p>
+    <w:p>
+      <w:pPr>
+        <w:pStyle w:val="aa"/>
+        <w:ind w:left="0" w:firstLine="0"/>
+        <w:rPr>
+          <w:rFonts w:asciiTheme="minorHAnsi" w:hAnsiTheme="minorHAnsi" w:cstheme="minorBidi"/>
+          <w:lang w:eastAsia="zh-CN"/>
+        </w:rPr>
+      </w:pPr>
+      <w:r>
+        <w:rPr>
+          <w:rFonts w:asciiTheme="minorHAnsi" w:hAnsiTheme="minorHAnsi" w:cstheme="minorBidi"/>
+          <w:lang w:eastAsia="zh-CN"/>
+        </w:rPr>
+        <w:t>22. Willführ, A. et al. Estimation of the number of alveolar capillaries by the Euler number (Euler-Poincaré characteristic). Am. J. Physiol. Lung Cell. Mol. Physiol. 309, L1286-93 (2015).</w:t>
+      </w:r>
+    </w:p>
+    <w:p>
+      <w:pPr>
+        <w:pStyle w:val="aa"/>
+        <w:ind w:left="0" w:firstLine="0"/>
+        <w:rPr>
+          <w:rFonts w:asciiTheme="minorHAnsi" w:hAnsiTheme="minorHAnsi" w:cstheme="minorBidi"/>
+          <w:lang w:eastAsia="zh-CN"/>
+        </w:rPr>
+      </w:pPr>
+      <w:r>
+        <w:rPr>
+          <w:rFonts w:asciiTheme="minorHAnsi" w:hAnsiTheme="minorHAnsi" w:cstheme="minorBidi"/>
+          <w:lang w:eastAsia="zh-CN"/>
+        </w:rPr>
+        <w:t>23. Santos, F. et al. Topological phase transitions in functional brain networks. bioRxiv https://doi.org/10.1101/469478 (2018) doi:10.1101/469478.</w:t>
+      </w:r>
+    </w:p>
+    <w:p>
+      <w:pPr>
+        <w:pStyle w:val="aa"/>
+        <w:ind w:left="0" w:firstLine="0"/>
+        <w:rPr>
+          <w:rFonts w:asciiTheme="minorHAnsi" w:hAnsiTheme="minorHAnsi" w:cstheme="minorBidi"/>
+          <w:lang w:eastAsia="zh-CN"/>
+        </w:rPr>
+      </w:pPr>
+      <w:r>
+        <w:rPr>
+          <w:rFonts w:asciiTheme="minorHAnsi" w:hAnsiTheme="minorHAnsi" w:cstheme="minorBidi"/>
+          <w:lang w:eastAsia="zh-CN"/>
+        </w:rPr>
+        <w:t>24. Viallard, C. &amp; Larrivée, B. Tumor angiogenesis and vascular normalization: alternative therapeutic targets. Angiogenesis 20, 409–426 (2017).</w:t>
+      </w:r>
+    </w:p>
+    <w:p>
+      <w:pPr>
+        <w:pStyle w:val="aa"/>
+        <w:ind w:left="0" w:firstLine="0"/>
+        <w:rPr>
+          <w:rFonts w:asciiTheme="minorHAnsi" w:hAnsiTheme="minorHAnsi" w:cstheme="minorBidi"/>
+          <w:lang w:eastAsia="zh-CN"/>
+        </w:rPr>
+      </w:pPr>
+      <w:r>
+        <w:rPr>
+          <w:rFonts w:asciiTheme="minorHAnsi" w:hAnsiTheme="minorHAnsi" w:cstheme="minorBidi"/>
+          <w:lang w:eastAsia="zh-CN"/>
+        </w:rPr>
+        <w:t>25. Goker, Y. S. &amp; Demir, G. Comparison of optical coherence tomography angiography features in type 1 versus type 2 choroidal neovascular membranes secondary to age-related macular degeneration. Med. Hypothesis Discov. Innov. Ophthalmol. J. 10, 67–73 (2021).</w:t>
+      </w:r>
+    </w:p>
+    <w:p>
+      <w:pPr>
+        <w:pStyle w:val="aa"/>
+        <w:ind w:left="0" w:firstLine="0"/>
+        <w:rPr>
+          <w:rFonts w:asciiTheme="minorHAnsi" w:hAnsiTheme="minorHAnsi" w:cstheme="minorBidi"/>
+          <w:lang w:eastAsia="zh-CN"/>
+        </w:rPr>
+      </w:pPr>
+      <w:r>
+        <w:rPr>
+          <w:rFonts w:asciiTheme="minorHAnsi" w:hAnsiTheme="minorHAnsi" w:cstheme="minorBidi"/>
+          <w:lang w:eastAsia="zh-CN"/>
+        </w:rPr>
+        <w:t>26. Li, J. et al. Comparative quantitative analysis of optical coherence tomography angiography in varied morphologies of macular neovascularization following intravitreal conbercept and ranibizumab treatments for neovascular age‑related macular degeneration. Exp. Ther. Med. 27, 214 (2024).</w:t>
+      </w:r>
+    </w:p>
+    <w:p>
+      <w:pPr>
+        <w:pStyle w:val="aa"/>
+        <w:ind w:left="0" w:firstLine="0"/>
+        <w:rPr>
+          <w:rFonts w:asciiTheme="minorHAnsi" w:hAnsiTheme="minorHAnsi" w:cstheme="minorBidi"/>
+          <w:lang w:eastAsia="zh-CN"/>
+        </w:rPr>
+      </w:pPr>
+      <w:r>
+        <w:rPr>
+          <w:rFonts w:asciiTheme="minorHAnsi" w:hAnsiTheme="minorHAnsi" w:cstheme="minorBidi"/>
+          <w:lang w:eastAsia="zh-CN"/>
+        </w:rPr>
+        <w:t>27. Mettu, P. S., Allingham, M. J. &amp; Cousins, S. W. Incomplete response to Anti-VEGF therapy in neovascular AMD: Exploring disease mechanisms and therapeutic opportunities. Prog. Retin. Eye Res. 82, 100906 (2021).</w:t>
+      </w:r>
+    </w:p>
+    <w:p>
+      <w:pPr>
+        <w:pStyle w:val="aa"/>
+        <w:ind w:left="0" w:firstLine="0"/>
+        <w:rPr>
+          <w:rFonts w:asciiTheme="minorHAnsi" w:hAnsiTheme="minorHAnsi" w:cstheme="minorBidi"/>
+          <w:lang w:eastAsia="zh-CN"/>
+        </w:rPr>
+      </w:pPr>
+      <w:r>
+        <w:rPr>
+          <w:rFonts w:asciiTheme="minorHAnsi" w:hAnsiTheme="minorHAnsi" w:cstheme="minorBidi"/>
+          <w:lang w:eastAsia="zh-CN"/>
+        </w:rPr>
+        <w:t>28. Attarde, A., Riad, T., Zhang, Z., Ahir, M. &amp; Fu, Y. Characterization of Vascular Morphology of Neovascular Age-Related Macular Degeneration by Indocyanine Green Angiography. J. Vis. Exp. JoVE 198, (2023).</w:t>
+      </w:r>
+    </w:p>
+    <w:p>
+      <w:pPr>
+        <w:pStyle w:val="aa"/>
+        <w:ind w:left="0" w:firstLine="0"/>
+        <w:rPr>
+          <w:rFonts w:asciiTheme="minorHAnsi" w:hAnsiTheme="minorHAnsi" w:cstheme="minorBidi"/>
+          <w:lang w:eastAsia="zh-CN"/>
+        </w:rPr>
+      </w:pPr>
+      <w:r>
+        <w:rPr>
+          <w:rFonts w:asciiTheme="minorHAnsi" w:hAnsiTheme="minorHAnsi" w:cstheme="minorBidi"/>
+          <w:lang w:eastAsia="zh-CN"/>
+        </w:rPr>
+        <w:t>29. Fu, Y., Zhang, Z., Webster, K. &amp; Paulus, Y. Treatment Strategies for Anti-VEGF Resistance in Neovascular Age-Related Macular Degeneration by Targeting Arteriolar Choroidal Neovascularization. Biomolecules 14, 252 (2024).</w:t>
+      </w:r>
+    </w:p>
+    <w:p>
+      <w:pPr>
+        <w:pStyle w:val="aa"/>
+        <w:ind w:left="0" w:firstLine="0"/>
+        <w:rPr>
+          <w:rFonts w:asciiTheme="minorHAnsi" w:hAnsiTheme="minorHAnsi" w:cstheme="minorBidi"/>
+          <w:lang w:eastAsia="zh-CN"/>
+        </w:rPr>
+      </w:pPr>
+      <w:r>
+        <w:rPr>
+          <w:rFonts w:asciiTheme="minorHAnsi" w:hAnsiTheme="minorHAnsi" w:cstheme="minorBidi"/>
+          <w:lang w:eastAsia="zh-CN"/>
+        </w:rPr>
+        <w:t>30. Spaide, R. Optical Coherence Tomography Angiography Signs of Vascular Abnormalization With Antiangiogenic Therapy for Choroidal Neovascularization. Am. J. Ophthalmol. 160, 6–16 (2015).</w:t>
+      </w:r>
+    </w:p>
+    <w:p>
+      <w:pPr>
+        <w:pStyle w:val="aa"/>
+        <w:ind w:left="0" w:firstLine="0"/>
+        <w:rPr>
+          <w:rFonts w:asciiTheme="minorHAnsi" w:hAnsiTheme="minorHAnsi" w:cstheme="minorBidi"/>
+          <w:lang w:eastAsia="zh-CN"/>
+        </w:rPr>
+      </w:pPr>
+      <w:r>
+        <w:rPr>
+          <w:rFonts w:asciiTheme="minorHAnsi" w:hAnsiTheme="minorHAnsi" w:cstheme="minorBidi"/>
+          <w:lang w:eastAsia="zh-CN"/>
+        </w:rPr>
+        <w:t>31. Shah, P. N. et al. Inter-rater reliability of proliferative diabetic retinopathy assessment on wide-field OCT-angiography and fluorescein angiography. Transl. Vis. Sci. Technol. 12(7), 13 (2023).</w:t>
+      </w:r>
+    </w:p>
+    <w:p>
+      <w:pPr>
+        <w:pStyle w:val="aa"/>
+        <w:ind w:left="0" w:firstLine="0"/>
+        <w:rPr>
+          <w:rFonts w:asciiTheme="minorHAnsi" w:hAnsiTheme="minorHAnsi" w:cstheme="minorBidi"/>
+          <w:lang w:eastAsia="zh-CN"/>
+        </w:rPr>
+      </w:pPr>
+      <w:r>
+        <w:rPr>
+          <w:rFonts w:asciiTheme="minorHAnsi" w:hAnsiTheme="minorHAnsi" w:cstheme="minorBidi"/>
+          <w:lang w:eastAsia="zh-CN"/>
+        </w:rPr>
+        <w:t>32. Deák, G. G. et al. Comparison of optical coherence tomography vs. fluorescein angiography-based macular neovascularization classifications in age-related macular degeneration. Sci. Rep. 15, 4303 (2025) doi:10.1038/s41598-025-87576-6.</w:t>
+      </w:r>
+    </w:p>
+    <w:p>
+      <w:pPr>
+        <w:pStyle w:val="aa"/>
+        <w:ind w:left="0" w:firstLine="0"/>
+        <w:rPr>
+          <w:rFonts w:asciiTheme="minorHAnsi" w:hAnsiTheme="minorHAnsi" w:cstheme="minorBidi"/>
+          <w:lang w:eastAsia="zh-CN"/>
+        </w:rPr>
+      </w:pPr>
+      <w:r>
+        <w:rPr>
+          <w:rFonts w:asciiTheme="minorHAnsi" w:hAnsiTheme="minorHAnsi" w:cstheme="minorBidi"/>
+          <w:lang w:eastAsia="zh-CN"/>
+        </w:rPr>
+        <w:t>33. Gan, Y. et al. Novel quantitative OCTA biomarkers of choroidal neovascularization and associations with disease activity and etiology. Transl. Vis. Sci. Technol. 15(3), 10 (2026).</w:t>
+      </w:r>
+    </w:p>
+    <w:p>
+      <w:pPr>
+        <w:pStyle w:val="aa"/>
+        <w:ind w:left="0" w:firstLine="0"/>
+        <w:rPr>
+          <w:rFonts w:asciiTheme="minorHAnsi" w:hAnsiTheme="minorHAnsi" w:cstheme="minorBidi"/>
+          <w:lang w:eastAsia="zh-CN"/>
+        </w:rPr>
+      </w:pPr>
+      <w:r>
+        <w:rPr>
+          <w:rFonts w:asciiTheme="minorHAnsi" w:hAnsiTheme="minorHAnsi" w:cstheme="minorBidi"/>
+          <w:lang w:eastAsia="zh-CN"/>
+        </w:rPr>
+        <w:t>34. Hsu, C. R. et al. Combined quantitative and qualitative optical coherence tomography angiography biomarkers for predicting active neovascular age-related macular degeneration. Sci. Rep. 11, 18068 (2021).</w:t>
+      </w:r>
+    </w:p>
+    <w:p>
+      <w:pPr>
+        <w:pStyle w:val="aa"/>
+        <w:rPr>
+          <w:del w:id="600" w:author="rev1" w:date="2026-08-03T08:56:00Z" w16du:dateUtc="2026-08-02T23:56:00Z"/>
+        </w:rPr>
+      </w:pPr>
+      <w:del w:id="601" w:author="rev1" w:date="2026-08-03T08:56:00Z" w16du:dateUtc="2026-08-02T23:56:00Z">
+        <w:r>
+          <w:rPr>
+            <w:rFonts w:ascii="Arial" w:hAnsi="Arial" w:cs="Arial"/>
+          </w:rPr>
+          <w:fldChar w:fldCharType="begin"/>
+        </w:r>
+        <w:r>
+          <w:rPr>
+            <w:rFonts w:ascii="Arial" w:hAnsi="Arial" w:cs="Arial"/>
+          </w:rPr>
+          <w:delInstrText xml:space="preserve"> ADDIN ZOTERO_BIBL {"uncited":[],"omitted":[],"custom":[]} CSL_BIBLIOGRAPHY </w:delInstrText>
+        </w:r>
+        <w:r>
+          <w:rPr>
+            <w:rFonts w:ascii="Arial" w:hAnsi="Arial" w:cs="Arial"/>
+          </w:rPr>
+          <w:fldChar w:fldCharType="separate"/>
+        </w:r>
+        <w:r>
+          <w:delText>1.</w:delText>
+        </w:r>
+        <w:r>
+          <w:tab/>
+          <w:delText xml:space="preserve">Guo, J., Tang, W., Xu, S., Liu, W. &amp; Xu, G. OCTA evaluation of treatment-naïve flat irregular PED (FIPED)-associated CNV in chronic central serous chorioretinopathy before and after half-dose PDT. </w:delText>
         </w:r>
         <w:r>
           <w:rPr>
             <w:i/>
             <w:iCs/>
           </w:rPr>
-          <w:t>Eye</w:t>
-        </w:r>
-        <w:r>
-          <w:t xml:space="preserve"> 35, 2871–2878 (2021). 2. </w:t>
-        </w:r>
-        <w:proofErr w:type="spellStart"/>
-        <w:r>
-          <w:t>Zudaire</w:t>
-        </w:r>
-        <w:proofErr w:type="spellEnd"/>
-        <w:r>
-          <w:t xml:space="preserve">, E., Gambardella, L., Kurcz, C. &amp; </w:t>
-        </w:r>
-        <w:proofErr w:type="spellStart"/>
-        <w:r>
-          <w:t>Vermeren</w:t>
-        </w:r>
-        <w:proofErr w:type="spellEnd"/>
-        <w:r>
-          <w:t xml:space="preserve">, S. A Computational Tool for Quantitative Analysis of Vascular Networks. </w:t>
+          <w:delText>Eye</w:delText>
+        </w:r>
+        <w:r>
+          <w:delText xml:space="preserve"> </w:delText>
+        </w:r>
+        <w:r>
+          <w:rPr>
+            <w:b/>
+            <w:bCs/>
+          </w:rPr>
+          <w:delText>35</w:delText>
+        </w:r>
+        <w:r>
+          <w:delText>, 2871–2878 (2021).</w:delText>
+        </w:r>
+      </w:del>
+    </w:p>
+    <w:p>
+      <w:pPr>
+        <w:pStyle w:val="aa"/>
+        <w:rPr>
+          <w:del w:id="602" w:author="rev1" w:date="2026-08-03T08:56:00Z" w16du:dateUtc="2026-08-02T23:56:00Z"/>
+        </w:rPr>
+      </w:pPr>
+      <w:del w:id="603" w:author="rev1" w:date="2026-08-03T08:56:00Z" w16du:dateUtc="2026-08-02T23:56:00Z">
+        <w:r>
+          <w:delText>2.</w:delText>
+        </w:r>
+        <w:r>
+          <w:tab/>
+          <w:delText xml:space="preserve">Zudaire, E., Gambardella, L., Kurcz, C. &amp; Vermeren, S. A Computational Tool for Quantitative Analysis of Vascular Networks. </w:delText>
         </w:r>
         <w:r>
           <w:rPr>
             <w:i/>
             <w:iCs/>
           </w:rPr>
-          <w:t>PLOS ONE</w:t>
-        </w:r>
-        <w:r>
-          <w:t xml:space="preserve"> 6, e27385 (2011). 3. Told, R. et al. Profiling neovascular age-related macular degeneration choroidal neovascularization lesion response to anti-vascular endothelial growth factor therapy using SSOCTA. </w:t>
+          <w:delText>PLOS ONE</w:delText>
+        </w:r>
+        <w:r>
+          <w:delText xml:space="preserve"> </w:delText>
+        </w:r>
+        <w:r>
+          <w:rPr>
+            <w:b/>
+            <w:bCs/>
+          </w:rPr>
+          <w:delText>6</w:delText>
+        </w:r>
+        <w:r>
+          <w:delText>, e27385 (2011).</w:delText>
+        </w:r>
+      </w:del>
+    </w:p>
+    <w:p>
+      <w:pPr>
+        <w:pStyle w:val="aa"/>
+        <w:rPr>
+          <w:del w:id="604" w:author="rev1" w:date="2026-08-03T08:56:00Z" w16du:dateUtc="2026-08-02T23:56:00Z"/>
+        </w:rPr>
+      </w:pPr>
+      <w:del w:id="605" w:author="rev1" w:date="2026-08-03T08:56:00Z" w16du:dateUtc="2026-08-02T23:56:00Z">
+        <w:r>
+          <w:delText>3.</w:delText>
+        </w:r>
+        <w:r>
+          <w:tab/>
+          <w:delText xml:space="preserve">Told, R. </w:delText>
         </w:r>
         <w:r>
           <w:rPr>
             <w:i/>
             <w:iCs/>
           </w:rPr>
-          <w:t xml:space="preserve">Acta </w:t>
-        </w:r>
-        <w:proofErr w:type="spellStart"/>
+          <w:delText>et al.</w:delText>
+        </w:r>
+        <w:r>
+          <w:delText xml:space="preserve"> Profiling neovascular age-related macular degeneration choroidal neovascularization lesion response to anti-vascular endothelial growth factor therapy using SSOCTA. </w:delText>
+        </w:r>
         <w:r>
           <w:rPr>
             <w:i/>
             <w:iCs/>
           </w:rPr>
-          <w:t>Ophthalmol</w:t>
-        </w:r>
-        <w:proofErr w:type="spellEnd"/>
+          <w:delText>Acta Ophthalmol. (Copenh.)</w:delText>
+        </w:r>
+        <w:r>
+          <w:delText xml:space="preserve"> </w:delText>
+        </w:r>
+        <w:r>
+          <w:rPr>
+            <w:b/>
+            <w:bCs/>
+          </w:rPr>
+          <w:delText>99</w:delText>
+        </w:r>
+        <w:r>
+          <w:delText>, e240–e246 (2021).</w:delText>
+        </w:r>
+      </w:del>
+    </w:p>
+    <w:p>
+      <w:pPr>
+        <w:pStyle w:val="aa"/>
+        <w:rPr>
+          <w:del w:id="606" w:author="rev1" w:date="2026-08-03T08:56:00Z" w16du:dateUtc="2026-08-02T23:56:00Z"/>
+        </w:rPr>
+      </w:pPr>
+      <w:del w:id="607" w:author="rev1" w:date="2026-08-03T08:56:00Z" w16du:dateUtc="2026-08-02T23:56:00Z">
+        <w:r>
+          <w:delText>4.</w:delText>
+        </w:r>
+        <w:r>
+          <w:tab/>
+          <w:delText xml:space="preserve">Montesel, A. </w:delText>
+        </w:r>
         <w:r>
           <w:rPr>
             <w:i/>
             <w:iCs/>
           </w:rPr>
-          <w:t>. (</w:t>
-        </w:r>
-        <w:proofErr w:type="spellStart"/>
+          <w:delText>et al.</w:delText>
+        </w:r>
+        <w:r>
+          <w:delText xml:space="preserve"> Quantitative response of macular neovascularisation to loading phase of aflibercept in neovascular age-related macular degeneration. </w:delText>
+        </w:r>
         <w:r>
           <w:rPr>
             <w:i/>
             <w:iCs/>
           </w:rPr>
-          <w:t>Copenh</w:t>
-        </w:r>
-        <w:proofErr w:type="spellEnd"/>
+          <w:delText>Eye</w:delText>
+        </w:r>
+        <w:r>
+          <w:delText xml:space="preserve"> </w:delText>
+        </w:r>
+        <w:r>
+          <w:rPr>
+            <w:b/>
+            <w:bCs/>
+          </w:rPr>
+          <w:delText>37</w:delText>
+        </w:r>
+        <w:r>
+          <w:delText>, 3648–3655 (2023).</w:delText>
+        </w:r>
+      </w:del>
+    </w:p>
+    <w:p>
+      <w:pPr>
+        <w:pStyle w:val="aa"/>
+        <w:rPr>
+          <w:del w:id="608" w:author="rev1" w:date="2026-08-03T08:56:00Z" w16du:dateUtc="2026-08-02T23:56:00Z"/>
+        </w:rPr>
+      </w:pPr>
+      <w:del w:id="609" w:author="rev1" w:date="2026-08-03T08:56:00Z" w16du:dateUtc="2026-08-02T23:56:00Z">
+        <w:r>
+          <w:delText>5.</w:delText>
+        </w:r>
+        <w:r>
+          <w:tab/>
+          <w:delText xml:space="preserve">Carlà, M. M. </w:delText>
+        </w:r>
         <w:r>
           <w:rPr>
             <w:i/>
             <w:iCs/>
           </w:rPr>
-          <w:t>.)</w:t>
-        </w:r>
-        <w:r>
-          <w:t xml:space="preserve"> 99, e240–e246 (2021). 4. </w:t>
-        </w:r>
-        <w:proofErr w:type="spellStart"/>
-        <w:r>
-          <w:t>Montesel</w:t>
-        </w:r>
-        <w:proofErr w:type="spellEnd"/>
-        <w:r>
-          <w:t xml:space="preserve">, A. et al. Quantitative response of macular </w:t>
-        </w:r>
-        <w:proofErr w:type="spellStart"/>
-        <w:r>
-          <w:t>neovascularisation</w:t>
-        </w:r>
-        <w:proofErr w:type="spellEnd"/>
-        <w:r>
-          <w:t xml:space="preserve"> to loading phase of aflibercept in neovascular age-related macular degeneration. </w:t>
+          <w:delText>et al.</w:delText>
+        </w:r>
+        <w:r>
+          <w:delText xml:space="preserve"> MORPHOMETRIC CHANGES IN MACULAR NEOVASCULARIZATION ARCHITECTURE AFTER FARICIMAB TREATMENT IN NEOVASCULAR AGE-RELATED MACULAR DEGENERATION: Comparison Between Naive and Switched Eyes. </w:delText>
         </w:r>
         <w:r>
           <w:rPr>
             <w:i/>
             <w:iCs/>
           </w:rPr>
-          <w:t>Eye</w:t>
-        </w:r>
-        <w:r>
-          <w:t xml:space="preserve"> 37, 3648–3655 (2023). 5. </w:t>
-        </w:r>
-        <w:proofErr w:type="spellStart"/>
-        <w:r>
-          <w:t>Carlà</w:t>
-        </w:r>
-        <w:proofErr w:type="spellEnd"/>
-        <w:r>
-          <w:t xml:space="preserve">, M. M. et al. MORPHOMETRIC CHANGES IN MACULAR NEOVASCULARIZATION ARCHITECTURE AFTER FARICIMAB TREATMENT IN NEOVASCULAR AGE-RELATED MACULAR DEGENERATION: Comparison Between Naive and Switched Eyes. </w:t>
+          <w:delText>Retina</w:delText>
+        </w:r>
+        <w:r>
+          <w:delText xml:space="preserve"> 125–135 (2026) doi:10.1097/iae.0000000000004635.</w:delText>
+        </w:r>
+      </w:del>
+    </w:p>
+    <w:p>
+      <w:pPr>
+        <w:pStyle w:val="aa"/>
+        <w:rPr>
+          <w:del w:id="610" w:author="rev1" w:date="2026-08-03T08:56:00Z" w16du:dateUtc="2026-08-02T23:56:00Z"/>
+        </w:rPr>
+      </w:pPr>
+      <w:del w:id="611" w:author="rev1" w:date="2026-08-03T08:56:00Z" w16du:dateUtc="2026-08-02T23:56:00Z">
+        <w:r>
+          <w:delText>6.</w:delText>
+        </w:r>
+        <w:r>
+          <w:tab/>
+          <w:delText xml:space="preserve">Munk, M. R. </w:delText>
         </w:r>
         <w:r>
           <w:rPr>
             <w:i/>
             <w:iCs/>
           </w:rPr>
-          <w:t>Retina</w:t>
-        </w:r>
-        <w:r>
-          <w:t xml:space="preserve"> 125–135 (2026) doi:10.1097/iae.0000000000004635. 6. Munk, M. R. et al. OCT-angiography: A qualitative and quantitative comparison of 4 OCT-A devices. </w:t>
+          <w:delText>et al.</w:delText>
+        </w:r>
+        <w:r>
+          <w:delText xml:space="preserve"> OCT-angiography: A qualitative and quantitative comparison of 4 OCT-A devices. </w:delText>
         </w:r>
         <w:r>
           <w:rPr>
             <w:i/>
             <w:iCs/>
           </w:rPr>
-          <w:t>PLOS ONE</w:t>
-        </w:r>
-        <w:r>
-          <w:t xml:space="preserve"> 12, e0177059 (2017). 7. </w:t>
-        </w:r>
-        <w:proofErr w:type="spellStart"/>
-        <w:r>
-          <w:t>Miere</w:t>
-        </w:r>
-        <w:proofErr w:type="spellEnd"/>
-        <w:r>
-          <w:t xml:space="preserve">, A. et al. VASCULAR REMODELING OF CHOROIDAL NEOVASCULARIZATION AFTER ANTI-VASCULAR ENDOTHELIAL GROWTH FACTOR THERAPY VISUALIZED ON OPTICAL COHERENCE TOMOGRAPHY ANGIOGRAPHY. </w:t>
+          <w:delText>PLOS ONE</w:delText>
+        </w:r>
+        <w:r>
+          <w:delText xml:space="preserve"> </w:delText>
+        </w:r>
+        <w:r>
+          <w:rPr>
+            <w:b/>
+            <w:bCs/>
+          </w:rPr>
+          <w:delText>12</w:delText>
+        </w:r>
+        <w:r>
+          <w:delText>, e0177059 (2017).</w:delText>
+        </w:r>
+      </w:del>
+    </w:p>
+    <w:p>
+      <w:pPr>
+        <w:pStyle w:val="aa"/>
+        <w:rPr>
+          <w:del w:id="612" w:author="rev1" w:date="2026-08-03T08:56:00Z" w16du:dateUtc="2026-08-02T23:56:00Z"/>
+        </w:rPr>
+      </w:pPr>
+      <w:del w:id="613" w:author="rev1" w:date="2026-08-03T08:56:00Z" w16du:dateUtc="2026-08-02T23:56:00Z">
+        <w:r>
+          <w:delText>7.</w:delText>
+        </w:r>
+        <w:r>
+          <w:tab/>
+          <w:delText xml:space="preserve">Miere, A. </w:delText>
         </w:r>
         <w:r>
           <w:rPr>
             <w:i/>
             <w:iCs/>
           </w:rPr>
-          <w:t>Retina</w:t>
-        </w:r>
-        <w:r>
-          <w:t xml:space="preserve"> 39, 548–557 (2019). 8. Tew, T. B. et al. Comparison of different morphologies of choroidal neovascularization evaluated by ocular coherence tomography angiography in age-related macular degeneration. </w:t>
+          <w:delText>et al.</w:delText>
+        </w:r>
+        <w:r>
+          <w:delText xml:space="preserve"> VASCULAR REMODELING OF CHOROIDAL NEOVASCULARIZATION AFTER ANTI-VASCULAR ENDOTHELIAL GROWTH FACTOR THERAPY VISUALIZED ON OPTICAL COHERENCE TOMOGRAPHY ANGIOGRAPHY. </w:delText>
         </w:r>
         <w:r>
           <w:rPr>
             <w:i/>
             <w:iCs/>
           </w:rPr>
-          <w:t xml:space="preserve">Clin. Experiment. </w:t>
-        </w:r>
-        <w:proofErr w:type="spellStart"/>
+          <w:delText>Retina</w:delText>
+        </w:r>
+        <w:r>
+          <w:delText xml:space="preserve"> </w:delText>
+        </w:r>
+        <w:r>
+          <w:rPr>
+            <w:b/>
+            <w:bCs/>
+          </w:rPr>
+          <w:delText>39</w:delText>
+        </w:r>
+        <w:r>
+          <w:delText>, 548–557 (2019).</w:delText>
+        </w:r>
+      </w:del>
+    </w:p>
+    <w:p>
+      <w:pPr>
+        <w:pStyle w:val="aa"/>
+        <w:rPr>
+          <w:del w:id="614" w:author="rev1" w:date="2026-08-03T08:56:00Z" w16du:dateUtc="2026-08-02T23:56:00Z"/>
+        </w:rPr>
+      </w:pPr>
+      <w:del w:id="615" w:author="rev1" w:date="2026-08-03T08:56:00Z" w16du:dateUtc="2026-08-02T23:56:00Z">
+        <w:r>
+          <w:delText>8.</w:delText>
+        </w:r>
+        <w:r>
+          <w:tab/>
+          <w:delText xml:space="preserve">Tew, T. </w:delText>
+        </w:r>
         <w:r>
           <w:rPr>
             <w:i/>
             <w:iCs/>
           </w:rPr>
-          <w:t>Ophthalmol</w:t>
-        </w:r>
-        <w:proofErr w:type="spellEnd"/>
+          <w:delText>et al.</w:delText>
+        </w:r>
+        <w:r>
+          <w:delText xml:space="preserve"> Comparison of different morphologies of choroidal neovascularization evaluated by ocular coherence tomography angiography in age-related macular degeneration. </w:delText>
+        </w:r>
         <w:r>
           <w:rPr>
             <w:i/>
             <w:iCs/>
           </w:rPr>
-          <w:t>.</w:t>
-        </w:r>
-        <w:r>
-          <w:t xml:space="preserve"> 48, 927–937 (2020). 9. Oliveira, W. S., Teixeira, J. V., Ren, T. I., Cavalcanti, G. D. C. &amp; </w:t>
-        </w:r>
-        <w:proofErr w:type="spellStart"/>
-        <w:r>
-          <w:t>Sijbers</w:t>
-        </w:r>
-        <w:proofErr w:type="spellEnd"/>
-        <w:r>
-          <w:t xml:space="preserve">, J. Unsupervised Retinal Vessel Segmentation Using Combined Filters. </w:t>
-        </w:r>
-        <w:proofErr w:type="spellStart"/>
+          <w:delText>Clin. Experiment. Ophthalmol.</w:delText>
+        </w:r>
+        <w:r>
+          <w:delText xml:space="preserve"> </w:delText>
+        </w:r>
+        <w:r>
+          <w:rPr>
+            <w:b/>
+            <w:bCs/>
+          </w:rPr>
+          <w:delText>48</w:delText>
+        </w:r>
+        <w:r>
+          <w:delText>, 927–937 (2020).</w:delText>
+        </w:r>
+      </w:del>
+    </w:p>
+    <w:p>
+      <w:pPr>
+        <w:pStyle w:val="aa"/>
+        <w:rPr>
+          <w:del w:id="616" w:author="rev1" w:date="2026-08-03T08:56:00Z" w16du:dateUtc="2026-08-02T23:56:00Z"/>
+        </w:rPr>
+      </w:pPr>
+      <w:del w:id="617" w:author="rev1" w:date="2026-08-03T08:56:00Z" w16du:dateUtc="2026-08-02T23:56:00Z">
+        <w:r>
+          <w:delText>9.</w:delText>
+        </w:r>
+        <w:r>
+          <w:tab/>
+          <w:delText xml:space="preserve">Coscas, F. </w:delText>
+        </w:r>
         <w:r>
           <w:rPr>
             <w:i/>
             <w:iCs/>
           </w:rPr>
-          <w:t>PLoS</w:t>
-        </w:r>
-        <w:proofErr w:type="spellEnd"/>
+          <w:delText>et al.</w:delText>
+        </w:r>
+        <w:r>
+          <w:delText xml:space="preserve"> Optical coherence tomography angiography in exudative age-related macular degeneration: A predictive model for treatment decisions. </w:delText>
+        </w:r>
         <w:r>
           <w:rPr>
             <w:i/>
             <w:iCs/>
           </w:rPr>
-          <w:t xml:space="preserve"> ONE</w:t>
-        </w:r>
-        <w:r>
-          <w:t xml:space="preserve"> 11, e0149943 (2016). 10. Ma, Y. et al. Multichannel Retinal Blood Vessel Segmentation Based on the Combination of </w:t>
-        </w:r>
-        <w:r>
-          <w:lastRenderedPageBreak/>
-          <w:t xml:space="preserve">Matched Filter and U-Net Network. </w:t>
+          <w:delText>Br. J. Ophthalmol.</w:delText>
+        </w:r>
+        <w:r>
+          <w:delText xml:space="preserve"> </w:delText>
+        </w:r>
+        <w:r>
+          <w:rPr>
+            <w:b/>
+            <w:bCs/>
+          </w:rPr>
+          <w:delText>103</w:delText>
+        </w:r>
+        <w:r>
+          <w:delText>, 1342–1356 (2019).</w:delText>
+        </w:r>
+      </w:del>
+    </w:p>
+    <w:p>
+      <w:pPr>
+        <w:pStyle w:val="aa"/>
+        <w:rPr>
+          <w:del w:id="618" w:author="rev1" w:date="2026-08-03T08:56:00Z" w16du:dateUtc="2026-08-02T23:56:00Z"/>
+        </w:rPr>
+      </w:pPr>
+      <w:del w:id="619" w:author="rev1" w:date="2026-08-03T08:56:00Z" w16du:dateUtc="2026-08-02T23:56:00Z">
+        <w:r>
+          <w:delText>10.</w:delText>
+        </w:r>
+        <w:r>
+          <w:tab/>
+          <w:delText xml:space="preserve">Oliveira, W. S., Teixeira, J. V., Ren, T. I., Cavalcanti, G. D. C. &amp; Sijbers, J. Unsupervised Retinal Vessel Segmentation Using Combined Filters. </w:delText>
         </w:r>
         <w:r>
           <w:rPr>
             <w:i/>
             <w:iCs/>
           </w:rPr>
-          <w:t>BioMed Res. Int.</w:t>
-        </w:r>
-        <w:r>
-          <w:t xml:space="preserve"> 2021, 5561125 (2021). 11. </w:t>
-        </w:r>
-        <w:proofErr w:type="spellStart"/>
-        <w:r>
-          <w:t>Memari</w:t>
-        </w:r>
-        <w:proofErr w:type="spellEnd"/>
-        <w:r>
-          <w:t xml:space="preserve">, N., Ramli, A. R., Bin Saripan, M. I., </w:t>
-        </w:r>
-        <w:proofErr w:type="spellStart"/>
-        <w:r>
-          <w:t>Mashohor</w:t>
-        </w:r>
-        <w:proofErr w:type="spellEnd"/>
-        <w:r>
-          <w:t xml:space="preserve">, S. &amp; </w:t>
-        </w:r>
-        <w:proofErr w:type="spellStart"/>
-        <w:r>
-          <w:t>Moghbel</w:t>
-        </w:r>
-        <w:proofErr w:type="spellEnd"/>
-        <w:r>
-          <w:t xml:space="preserve">, M. Supervised retinal vessel segmentation from color fundus images based on matched filtering and AdaBoost classifier. </w:t>
-        </w:r>
-        <w:proofErr w:type="spellStart"/>
+          <w:delText>PLoS ONE</w:delText>
+        </w:r>
+        <w:r>
+          <w:delText xml:space="preserve"> </w:delText>
+        </w:r>
+        <w:r>
+          <w:rPr>
+            <w:b/>
+            <w:bCs/>
+          </w:rPr>
+          <w:delText>11</w:delText>
+        </w:r>
+        <w:r>
+          <w:delText>, e0149943 (2016).</w:delText>
+        </w:r>
+      </w:del>
+    </w:p>
+    <w:p>
+      <w:pPr>
+        <w:pStyle w:val="aa"/>
+        <w:rPr>
+          <w:del w:id="620" w:author="rev1" w:date="2026-08-03T08:56:00Z" w16du:dateUtc="2026-08-02T23:56:00Z"/>
+        </w:rPr>
+      </w:pPr>
+      <w:del w:id="621" w:author="rev1" w:date="2026-08-03T08:56:00Z" w16du:dateUtc="2026-08-02T23:56:00Z">
+        <w:r>
+          <w:delText>11.</w:delText>
+        </w:r>
+        <w:r>
+          <w:tab/>
+          <w:delText xml:space="preserve">Ma, Y. </w:delText>
+        </w:r>
         <w:r>
           <w:rPr>
             <w:i/>
             <w:iCs/>
           </w:rPr>
-          <w:t>PLoS</w:t>
-        </w:r>
-        <w:proofErr w:type="spellEnd"/>
+          <w:delText>et al.</w:delText>
+        </w:r>
+        <w:r>
+          <w:delText xml:space="preserve"> Multichannel Retinal Blood Vessel Segmentation Based on the Combination of Matched Filter and U-Net Network. </w:delText>
+        </w:r>
         <w:r>
           <w:rPr>
             <w:i/>
             <w:iCs/>
           </w:rPr>
-          <w:t xml:space="preserve"> ONE</w:t>
-        </w:r>
-        <w:r>
-          <w:t xml:space="preserve"> 12, e0188939 (2017). 12. </w:t>
-        </w:r>
-        <w:proofErr w:type="spellStart"/>
-        <w:r>
-          <w:t>Coscas</w:t>
-        </w:r>
-        <w:proofErr w:type="spellEnd"/>
-        <w:r>
-          <w:t xml:space="preserve">, F. et al. Optical coherence tomography angiography in exudative age-related macular degeneration: A predictive model for treatment decisions. </w:t>
+          <w:delText>BioMed Res. Int.</w:delText>
+        </w:r>
+        <w:r>
+          <w:delText xml:space="preserve"> </w:delText>
+        </w:r>
+        <w:r>
+          <w:rPr>
+            <w:b/>
+            <w:bCs/>
+          </w:rPr>
+          <w:delText>2021</w:delText>
+        </w:r>
+        <w:r>
+          <w:delText>, 5561125 (2021).</w:delText>
+        </w:r>
+      </w:del>
+    </w:p>
+    <w:p>
+      <w:pPr>
+        <w:pStyle w:val="aa"/>
+        <w:rPr>
+          <w:del w:id="622" w:author="rev1" w:date="2026-08-03T08:56:00Z" w16du:dateUtc="2026-08-02T23:56:00Z"/>
+        </w:rPr>
+      </w:pPr>
+      <w:del w:id="623" w:author="rev1" w:date="2026-08-03T08:56:00Z" w16du:dateUtc="2026-08-02T23:56:00Z">
+        <w:r>
+          <w:delText>12.</w:delText>
+        </w:r>
+        <w:r>
+          <w:tab/>
+          <w:delText xml:space="preserve">Memari, N., Ramli, A. R., Bin Saripan, M. I., Mashohor, S. &amp; Moghbel, M. Supervised retinal vessel segmentation from color fundus images based on matched filtering and AdaBoost classifier. </w:delText>
         </w:r>
         <w:r>
           <w:rPr>
             <w:i/>
             <w:iCs/>
           </w:rPr>
-          <w:t xml:space="preserve">Br. J. </w:t>
-        </w:r>
-        <w:proofErr w:type="spellStart"/>
+          <w:delText>PLoS ONE</w:delText>
+        </w:r>
+        <w:r>
+          <w:delText xml:space="preserve"> </w:delText>
+        </w:r>
+        <w:r>
+          <w:rPr>
+            <w:b/>
+            <w:bCs/>
+          </w:rPr>
+          <w:delText>12</w:delText>
+        </w:r>
+        <w:r>
+          <w:delText>, e0188939 (2017).</w:delText>
+        </w:r>
+      </w:del>
+    </w:p>
+    <w:p>
+      <w:pPr>
+        <w:pStyle w:val="aa"/>
+        <w:rPr>
+          <w:del w:id="624" w:author="rev1" w:date="2026-08-03T08:56:00Z" w16du:dateUtc="2026-08-02T23:56:00Z"/>
+        </w:rPr>
+      </w:pPr>
+      <w:del w:id="625" w:author="rev1" w:date="2026-08-03T08:56:00Z" w16du:dateUtc="2026-08-02T23:56:00Z">
+        <w:r>
+          <w:delText>13.</w:delText>
+        </w:r>
+        <w:r>
+          <w:tab/>
+          <w:delText xml:space="preserve">Wang, M. </w:delText>
+        </w:r>
         <w:r>
           <w:rPr>
             <w:i/>
             <w:iCs/>
           </w:rPr>
-          <w:t>Ophthalmol</w:t>
-        </w:r>
-        <w:proofErr w:type="spellEnd"/>
+          <w:delText>et al.</w:delText>
+        </w:r>
+        <w:r>
+          <w:delText xml:space="preserve"> Evaluating Polypoidal Choroidal Vasculopathy With Optical Coherence Tomography Angiography. </w:delText>
+        </w:r>
         <w:r>
           <w:rPr>
             <w:i/>
             <w:iCs/>
           </w:rPr>
-          <w:t>.</w:t>
-        </w:r>
-        <w:r>
-          <w:t xml:space="preserve"> 103, 1342–1356 (2019). 13. Shrout, P. E. &amp; Fleiss, J. L. Intraclass correlations: uses in assessing rater reliability. </w:t>
+          <w:delText>Investig. Opthalmology Vis. Sci.</w:delText>
+        </w:r>
+        <w:r>
+          <w:delText xml:space="preserve"> </w:delText>
+        </w:r>
+        <w:r>
+          <w:rPr>
+            <w:b/>
+            <w:bCs/>
+          </w:rPr>
+          <w:delText>57</w:delText>
+        </w:r>
+        <w:r>
+          <w:delText>, OCT526-32 (2016).</w:delText>
+        </w:r>
+      </w:del>
+    </w:p>
+    <w:p>
+      <w:pPr>
+        <w:pStyle w:val="aa"/>
+        <w:rPr>
+          <w:del w:id="626" w:author="rev1" w:date="2026-08-03T08:56:00Z" w16du:dateUtc="2026-08-02T23:56:00Z"/>
+        </w:rPr>
+      </w:pPr>
+      <w:del w:id="627" w:author="rev1" w:date="2026-08-03T08:56:00Z" w16du:dateUtc="2026-08-02T23:56:00Z">
+        <w:r>
+          <w:delText>14.</w:delText>
+        </w:r>
+        <w:r>
+          <w:tab/>
+          <w:delText xml:space="preserve">Xue, J. </w:delText>
         </w:r>
         <w:r>
           <w:rPr>
             <w:i/>
             <w:iCs/>
           </w:rPr>
-          <w:t>Psychol. Bull.</w:t>
-        </w:r>
-        <w:r>
-          <w:t xml:space="preserve"> 86, 420–428 (1979). 14. McGraw, K. O. &amp; Wong, S. P. Forming inferences about some intraclass correlation coefficients. </w:t>
+          <w:delText>et al.</w:delText>
+        </w:r>
+        <w:r>
+          <w:delText xml:space="preserve"> Automatic quantification of choroidal neovascularization lesion area on OCT angiography based on density cell-like P systems with active membranes. </w:delText>
         </w:r>
         <w:r>
           <w:rPr>
             <w:i/>
             <w:iCs/>
           </w:rPr>
-          <w:t>Psychol. Methods</w:t>
-        </w:r>
-        <w:r>
-          <w:t xml:space="preserve"> 1, 30–46 (1996). 15. Koo, T. K. &amp; Li, M. Y. A guideline of selecting and reporting intraclass correlation coefficients for reliability research. </w:t>
+          <w:delText>Biomed. Opt. Express</w:delText>
+        </w:r>
+        <w:r>
+          <w:delText xml:space="preserve"> </w:delText>
+        </w:r>
+        <w:r>
+          <w:rPr>
+            <w:b/>
+            <w:bCs/>
+          </w:rPr>
+          <w:delText>9 7</w:delText>
+        </w:r>
+        <w:r>
+          <w:delText>, 3208–3219 (2018).</w:delText>
+        </w:r>
+      </w:del>
+    </w:p>
+    <w:p>
+      <w:pPr>
+        <w:pStyle w:val="aa"/>
+        <w:rPr>
+          <w:del w:id="628" w:author="rev1" w:date="2026-08-03T08:56:00Z" w16du:dateUtc="2026-08-02T23:56:00Z"/>
+        </w:rPr>
+      </w:pPr>
+      <w:del w:id="629" w:author="rev1" w:date="2026-08-03T08:56:00Z" w16du:dateUtc="2026-08-02T23:56:00Z">
+        <w:r>
+          <w:delText>15.</w:delText>
+        </w:r>
+        <w:r>
+          <w:tab/>
+          <w:delText xml:space="preserve">Babiuch, A. </w:delText>
         </w:r>
         <w:r>
           <w:rPr>
             <w:i/>
             <w:iCs/>
           </w:rPr>
-          <w:t xml:space="preserve">J. </w:t>
-        </w:r>
-        <w:proofErr w:type="spellStart"/>
+          <w:delText>et al.</w:delText>
+        </w:r>
+        <w:r>
+          <w:delText xml:space="preserve"> IMPACT OF OPTICAL COHERENCE TOMOGRAPHY ANGIOGRAPHY REVIEW STRATEGY ON DETECTION OF CHOROIDAL NEOVASCULARIZATION. </w:delText>
+        </w:r>
         <w:r>
           <w:rPr>
             <w:i/>
             <w:iCs/>
           </w:rPr>
-          <w:t>Chiropr</w:t>
-        </w:r>
-        <w:proofErr w:type="spellEnd"/>
+          <w:delText>Retina</w:delText>
+        </w:r>
+        <w:r>
+          <w:delText xml:space="preserve"> 672–678 (2020) doi:10.1097/iae.0000000000002443.</w:delText>
+        </w:r>
+      </w:del>
+    </w:p>
+    <w:p>
+      <w:pPr>
+        <w:pStyle w:val="aa"/>
+        <w:rPr>
+          <w:del w:id="630" w:author="rev1" w:date="2026-08-03T08:56:00Z" w16du:dateUtc="2026-08-02T23:56:00Z"/>
+        </w:rPr>
+      </w:pPr>
+      <w:del w:id="631" w:author="rev1" w:date="2026-08-03T08:56:00Z" w16du:dateUtc="2026-08-02T23:56:00Z">
+        <w:r>
+          <w:delText>16.</w:delText>
+        </w:r>
+        <w:r>
+          <w:tab/>
+          <w:delText xml:space="preserve">Smith, A. &amp; Zavala, V. The Euler characteristic: A general topological descriptor for complex data. </w:delText>
+        </w:r>
         <w:r>
           <w:rPr>
             <w:i/>
             <w:iCs/>
           </w:rPr>
-          <w:t>. Med.</w:t>
-        </w:r>
-        <w:r>
-          <w:t xml:space="preserve"> 15, 155–163 (2016). 16. Corvi, F. et al. Reproducibility of vessel density, fractal dimension, and foveal avascular zone using 7 different optical coherence tomography angiography devices. </w:t>
+          <w:delText>Comput Chem Eng</w:delText>
+        </w:r>
+        <w:r>
+          <w:delText xml:space="preserve"> </w:delText>
+        </w:r>
+        <w:r>
+          <w:rPr>
+            <w:b/>
+            <w:bCs/>
+          </w:rPr>
+          <w:delText>154</w:delText>
+        </w:r>
+        <w:r>
+          <w:delText>, 107463 (2021).</w:delText>
+        </w:r>
+      </w:del>
+    </w:p>
+    <w:p>
+      <w:pPr>
+        <w:pStyle w:val="aa"/>
+        <w:rPr>
+          <w:del w:id="632" w:author="rev1" w:date="2026-08-03T08:56:00Z" w16du:dateUtc="2026-08-02T23:56:00Z"/>
+        </w:rPr>
+      </w:pPr>
+      <w:del w:id="633" w:author="rev1" w:date="2026-08-03T08:56:00Z" w16du:dateUtc="2026-08-02T23:56:00Z">
+        <w:r>
+          <w:delText>17.</w:delText>
+        </w:r>
+        <w:r>
+          <w:tab/>
+          <w:delText xml:space="preserve">Willführ, A. </w:delText>
         </w:r>
         <w:r>
           <w:rPr>
             <w:i/>
             <w:iCs/>
           </w:rPr>
-          <w:t xml:space="preserve">Am. J. </w:t>
-        </w:r>
-        <w:proofErr w:type="spellStart"/>
+          <w:delText>et al.</w:delText>
+        </w:r>
+        <w:r>
+          <w:delText xml:space="preserve"> Estimation of the number of alveolar capillaries by the Euler number (Euler-Poincaré characteristic). </w:delText>
+        </w:r>
         <w:r>
           <w:rPr>
             <w:i/>
             <w:iCs/>
           </w:rPr>
-          <w:t>Ophthalmol</w:t>
-        </w:r>
-        <w:proofErr w:type="spellEnd"/>
+          <w:delText>Am. J. Physiol. Lung Cell. Mol. Physiol.</w:delText>
+        </w:r>
+        <w:r>
+          <w:delText xml:space="preserve"> </w:delText>
+        </w:r>
+        <w:r>
+          <w:rPr>
+            <w:b/>
+            <w:bCs/>
+          </w:rPr>
+          <w:delText>309</w:delText>
+        </w:r>
+        <w:r>
+          <w:delText>, L1286-93 (2015).</w:delText>
+        </w:r>
+      </w:del>
+    </w:p>
+    <w:p>
+      <w:pPr>
+        <w:pStyle w:val="aa"/>
+        <w:rPr>
+          <w:del w:id="634" w:author="rev1" w:date="2026-08-03T08:56:00Z" w16du:dateUtc="2026-08-02T23:56:00Z"/>
+        </w:rPr>
+      </w:pPr>
+      <w:del w:id="635" w:author="rev1" w:date="2026-08-03T08:56:00Z" w16du:dateUtc="2026-08-02T23:56:00Z">
+        <w:r>
+          <w:delText>18.</w:delText>
+        </w:r>
+        <w:r>
+          <w:tab/>
+          <w:delText xml:space="preserve">Santos, F. </w:delText>
+        </w:r>
         <w:r>
           <w:rPr>
             <w:i/>
             <w:iCs/>
           </w:rPr>
-          <w:t>.</w:t>
-        </w:r>
-        <w:r>
-          <w:t xml:space="preserve"> 186, 25–31 (2018). 17. Corvi, F. et al. Comparison between several optical coherence tomography angiography devices and indocyanine green angiography of choroidal neovascularization. </w:t>
+          <w:delText>et al.</w:delText>
+        </w:r>
+        <w:r>
+          <w:delText xml:space="preserve"> Topological phase transitions in functional brain networks. </w:delText>
         </w:r>
         <w:r>
           <w:rPr>
             <w:i/>
             <w:iCs/>
           </w:rPr>
-          <w:t>Retina</w:t>
-        </w:r>
-        <w:r>
-          <w:t xml:space="preserve"> 40, 873–880 (2020). 18. Wang, M. et al. Evaluating Polypoidal Choroidal Vasculopathy </w:t>
-        </w:r>
-        <w:proofErr w:type="gramStart"/>
-        <w:r>
-          <w:t>With</w:t>
-        </w:r>
-        <w:proofErr w:type="gramEnd"/>
-        <w:r>
-          <w:t xml:space="preserve"> Optical Coherence Tomography Angiography. </w:t>
-        </w:r>
-        <w:proofErr w:type="spellStart"/>
+          <w:delText>bioRxiv</w:delText>
+        </w:r>
+        <w:r>
+          <w:delText xml:space="preserve"> https://doi.org/10.1101/469478 (2018) doi:10.1101/469478.</w:delText>
+        </w:r>
+      </w:del>
+    </w:p>
+    <w:p>
+      <w:pPr>
+        <w:pStyle w:val="aa"/>
+        <w:rPr>
+          <w:del w:id="636" w:author="rev1" w:date="2026-08-03T08:56:00Z" w16du:dateUtc="2026-08-02T23:56:00Z"/>
+        </w:rPr>
+      </w:pPr>
+      <w:del w:id="637" w:author="rev1" w:date="2026-08-03T08:56:00Z" w16du:dateUtc="2026-08-02T23:56:00Z">
+        <w:r>
+          <w:delText>19.</w:delText>
+        </w:r>
+        <w:r>
+          <w:tab/>
+          <w:delText xml:space="preserve">Viallard, C. &amp; Larrivée, B. Tumor angiogenesis and vascular normalization: alternative therapeutic targets. </w:delText>
+        </w:r>
         <w:r>
           <w:rPr>
             <w:i/>
             <w:iCs/>
           </w:rPr>
-          <w:t>Investig</w:t>
-        </w:r>
-        <w:proofErr w:type="spellEnd"/>
+          <w:delText>Angiogenesis</w:delText>
+        </w:r>
+        <w:r>
+          <w:delText xml:space="preserve"> </w:delText>
+        </w:r>
+        <w:r>
+          <w:rPr>
+            <w:b/>
+            <w:bCs/>
+          </w:rPr>
+          <w:delText>20</w:delText>
+        </w:r>
+        <w:r>
+          <w:delText>, 409–426 (2017).</w:delText>
+        </w:r>
+      </w:del>
+    </w:p>
+    <w:p>
+      <w:pPr>
+        <w:pStyle w:val="aa"/>
+        <w:rPr>
+          <w:del w:id="638" w:author="rev1" w:date="2026-08-03T08:56:00Z" w16du:dateUtc="2026-08-02T23:56:00Z"/>
+        </w:rPr>
+      </w:pPr>
+      <w:del w:id="639" w:author="rev1" w:date="2026-08-03T08:56:00Z" w16du:dateUtc="2026-08-02T23:56:00Z">
+        <w:r>
+          <w:delText>20.</w:delText>
+        </w:r>
+        <w:r>
+          <w:tab/>
+          <w:delText xml:space="preserve">Goker, Y. S. &amp; Demir, G. Comparison of optical coherence tomography angiography features in type 1 versus type 2 choroidal neovascular membranes secondary to age-related macular degeneration. </w:delText>
+        </w:r>
         <w:r>
           <w:rPr>
             <w:i/>
             <w:iCs/>
           </w:rPr>
-          <w:t xml:space="preserve">. </w:t>
-        </w:r>
-        <w:proofErr w:type="spellStart"/>
+          <w:delText>Med. Hypothesis Discov. Innov. Ophthalmol. J.</w:delText>
+        </w:r>
+        <w:r>
+          <w:delText xml:space="preserve"> </w:delText>
+        </w:r>
+        <w:r>
+          <w:rPr>
+            <w:b/>
+            <w:bCs/>
+          </w:rPr>
+          <w:delText>10</w:delText>
+        </w:r>
+        <w:r>
+          <w:delText>, 67–73 (2021).</w:delText>
+        </w:r>
+      </w:del>
+    </w:p>
+    <w:p>
+      <w:pPr>
+        <w:pStyle w:val="aa"/>
+        <w:rPr>
+          <w:del w:id="640" w:author="rev1" w:date="2026-08-03T08:56:00Z" w16du:dateUtc="2026-08-02T23:56:00Z"/>
+        </w:rPr>
+      </w:pPr>
+      <w:del w:id="641" w:author="rev1" w:date="2026-08-03T08:56:00Z" w16du:dateUtc="2026-08-02T23:56:00Z">
+        <w:r>
+          <w:delText>21.</w:delText>
+        </w:r>
+        <w:r>
+          <w:tab/>
+          <w:delText xml:space="preserve">Li, J. </w:delText>
+        </w:r>
         <w:r>
           <w:rPr>
             <w:i/>
             <w:iCs/>
           </w:rPr>
-          <w:t>Opthalmology</w:t>
-        </w:r>
-        <w:proofErr w:type="spellEnd"/>
+          <w:delText>et al.</w:delText>
+        </w:r>
+        <w:r>
+          <w:delText xml:space="preserve"> Comparative quantitative analysis of optical coherence tomography angiography in varied morphologies of macular neovascularization following intravitreal conbercept and ranibizumab treatments for neovascular age‑related macular degeneration. </w:delText>
+        </w:r>
         <w:r>
           <w:rPr>
             <w:i/>
             <w:iCs/>
           </w:rPr>
-          <w:t xml:space="preserve"> Vis. Sci.</w:t>
-        </w:r>
-        <w:r>
-          <w:t xml:space="preserve"> 57, OCT526-32 (2016). 19. Xue, J. et al. Automatic quantification of choroidal neovascularization lesion area on OCT angiography based on density cell-like P systems with active membranes. </w:t>
+          <w:delText>Exp. Ther. Med.</w:delText>
+        </w:r>
+        <w:r>
+          <w:delText xml:space="preserve"> </w:delText>
+        </w:r>
+        <w:r>
+          <w:rPr>
+            <w:b/>
+            <w:bCs/>
+          </w:rPr>
+          <w:delText>27</w:delText>
+        </w:r>
+        <w:r>
+          <w:delText>, 214 (2024).</w:delText>
+        </w:r>
+      </w:del>
+    </w:p>
+    <w:p>
+      <w:pPr>
+        <w:pStyle w:val="aa"/>
+        <w:rPr>
+          <w:del w:id="642" w:author="rev1" w:date="2026-08-03T08:56:00Z" w16du:dateUtc="2026-08-02T23:56:00Z"/>
+        </w:rPr>
+      </w:pPr>
+      <w:del w:id="643" w:author="rev1" w:date="2026-08-03T08:56:00Z" w16du:dateUtc="2026-08-02T23:56:00Z">
+        <w:r>
+          <w:delText>22.</w:delText>
+        </w:r>
+        <w:r>
+          <w:tab/>
+          <w:delText xml:space="preserve">Tew, T. B. </w:delText>
         </w:r>
         <w:r>
           <w:rPr>
             <w:i/>
             <w:iCs/>
           </w:rPr>
-          <w:t>Biomed. Opt. Express</w:t>
-        </w:r>
-        <w:r>
-          <w:t xml:space="preserve"> 9, 3208–3219 (2018). 20. </w:t>
-        </w:r>
-        <w:proofErr w:type="spellStart"/>
-        <w:r>
-          <w:t>Babiuch</w:t>
-        </w:r>
-        <w:proofErr w:type="spellEnd"/>
-        <w:r>
-          <w:t xml:space="preserve">, A. et al. IMPACT OF OPTICAL COHERENCE TOMOGRAPHY ANGIOGRAPHY REVIEW STRATEGY ON DETECTION OF CHOROIDAL NEOVASCULARIZATION. </w:t>
+          <w:delText>et al.</w:delText>
+        </w:r>
+        <w:r>
+          <w:delText xml:space="preserve"> Comparison of different morphologies of choroidal neovascularization evaluated by ocular coherence tomography angiography in age-related macular degeneration. </w:delText>
         </w:r>
         <w:r>
           <w:rPr>
             <w:i/>
             <w:iCs/>
           </w:rPr>
-          <w:t>Retina</w:t>
-        </w:r>
-        <w:r>
-          <w:t xml:space="preserve"> 672–678 (2020) doi:10.1097/iae.0000000000002443. 21. Smith, A. &amp; Zavala, V. The Euler characteristic: A general topological descriptor for complex data. </w:t>
-        </w:r>
-        <w:proofErr w:type="spellStart"/>
+          <w:delText>Clin. Experiment. Ophthalmol.</w:delText>
+        </w:r>
+        <w:r>
+          <w:delText xml:space="preserve"> </w:delText>
+        </w:r>
+        <w:r>
+          <w:rPr>
+            <w:b/>
+            <w:bCs/>
+          </w:rPr>
+          <w:delText>48</w:delText>
+        </w:r>
+        <w:r>
+          <w:delText>, 927–937 (2020).</w:delText>
+        </w:r>
+      </w:del>
+    </w:p>
+    <w:p>
+      <w:pPr>
+        <w:pStyle w:val="aa"/>
+        <w:rPr>
+          <w:del w:id="644" w:author="rev1" w:date="2026-08-03T08:56:00Z" w16du:dateUtc="2026-08-02T23:56:00Z"/>
+        </w:rPr>
+      </w:pPr>
+      <w:del w:id="645" w:author="rev1" w:date="2026-08-03T08:56:00Z" w16du:dateUtc="2026-08-02T23:56:00Z">
+        <w:r>
+          <w:delText>23.</w:delText>
+        </w:r>
+        <w:r>
+          <w:tab/>
+          <w:delText xml:space="preserve">Mettu, P. S., Allingham, M. J. &amp; Cousins, S. W. Incomplete response to Anti-VEGF therapy in neovascular AMD: Exploring disease mechanisms and therapeutic opportunities. </w:delText>
+        </w:r>
         <w:r>
           <w:rPr>
             <w:i/>
             <w:iCs/>
           </w:rPr>
-          <w:t>Comput</w:t>
-        </w:r>
-        <w:proofErr w:type="spellEnd"/>
+          <w:delText>Prog. Retin. Eye Res.</w:delText>
+        </w:r>
+        <w:r>
+          <w:delText xml:space="preserve"> </w:delText>
+        </w:r>
+        <w:r>
+          <w:rPr>
+            <w:b/>
+            <w:bCs/>
+          </w:rPr>
+          <w:delText>82</w:delText>
+        </w:r>
+        <w:r>
+          <w:delText>, 100906 (2021).</w:delText>
+        </w:r>
+      </w:del>
+    </w:p>
+    <w:p>
+      <w:pPr>
+        <w:pStyle w:val="aa"/>
+        <w:rPr>
+          <w:del w:id="646" w:author="rev1" w:date="2026-08-03T08:56:00Z" w16du:dateUtc="2026-08-02T23:56:00Z"/>
+        </w:rPr>
+      </w:pPr>
+      <w:del w:id="647" w:author="rev1" w:date="2026-08-03T08:56:00Z" w16du:dateUtc="2026-08-02T23:56:00Z">
+        <w:r>
+          <w:delText>24.</w:delText>
+        </w:r>
+        <w:r>
+          <w:tab/>
+          <w:delText xml:space="preserve">Attarde, A., Riad, T., Zhang, Z., Ahir, M. &amp; Fu, Y. Characterization of Vascular Morphology of Neovascular Age-Related Macular Degeneration by Indocyanine Green Angiography. </w:delText>
+        </w:r>
         <w:r>
           <w:rPr>
             <w:i/>
             <w:iCs/>
           </w:rPr>
-          <w:t xml:space="preserve"> Chem Eng</w:t>
-        </w:r>
-        <w:r>
-          <w:t xml:space="preserve"> 154, 107463 (2021). 22. </w:t>
-        </w:r>
-        <w:proofErr w:type="spellStart"/>
-        <w:r>
-          <w:t>Willführ</w:t>
-        </w:r>
-        <w:proofErr w:type="spellEnd"/>
-        <w:r>
-          <w:t>, A. et al. Estimation of the number of alveolar capillaries by the Euler number (Euler-</w:t>
-        </w:r>
-        <w:proofErr w:type="spellStart"/>
-        <w:r>
-          <w:t>Poincaré</w:t>
-        </w:r>
-        <w:proofErr w:type="spellEnd"/>
-        <w:r>
-          <w:t xml:space="preserve"> characteristic). </w:t>
+          <w:delText>J. Vis. Exp. JoVE</w:delText>
+        </w:r>
+        <w:r>
+          <w:delText xml:space="preserve"> </w:delText>
+        </w:r>
+        <w:r>
+          <w:rPr>
+            <w:b/>
+            <w:bCs/>
+          </w:rPr>
+          <w:delText>198</w:delText>
+        </w:r>
+        <w:r>
+          <w:delText>, (2023).</w:delText>
+        </w:r>
+      </w:del>
+    </w:p>
+    <w:p>
+      <w:pPr>
+        <w:pStyle w:val="aa"/>
+        <w:rPr>
+          <w:del w:id="648" w:author="rev1" w:date="2026-08-03T08:56:00Z" w16du:dateUtc="2026-08-02T23:56:00Z"/>
+        </w:rPr>
+      </w:pPr>
+      <w:del w:id="649" w:author="rev1" w:date="2026-08-03T08:56:00Z" w16du:dateUtc="2026-08-02T23:56:00Z">
+        <w:r>
+          <w:delText>25.</w:delText>
+        </w:r>
+        <w:r>
+          <w:tab/>
+          <w:delText xml:space="preserve">Fu, Y., Zhang, Z., Webster, K. &amp; Paulus, Y. Treatment Strategies for Anti-VEGF Resistance in Neovascular Age-Related Macular Degeneration by Targeting Arteriolar Choroidal Neovascularization. </w:delText>
         </w:r>
         <w:r>
           <w:rPr>
             <w:i/>
             <w:iCs/>
           </w:rPr>
-          <w:t>Am. J. Physiol. Lung Cell. Mol. Physiol.</w:t>
-        </w:r>
-        <w:r>
-          <w:t xml:space="preserve"> 309, L1286-93 (2015). 23. Santos, F. et al. Topological phase transitions in functional brain networks. </w:t>
+          <w:delText>Biomolecules</w:delText>
+        </w:r>
+        <w:r>
+          <w:delText xml:space="preserve"> </w:delText>
+        </w:r>
+        <w:r>
+          <w:rPr>
+            <w:b/>
+            <w:bCs/>
+          </w:rPr>
+          <w:delText>14</w:delText>
+        </w:r>
+        <w:r>
+          <w:delText>, 252 (2024).</w:delText>
+        </w:r>
+      </w:del>
+    </w:p>
+    <w:p>
+      <w:pPr>
+        <w:pStyle w:val="aa"/>
+        <w:rPr>
+          <w:del w:id="650" w:author="rev1" w:date="2026-08-03T08:56:00Z" w16du:dateUtc="2026-08-02T23:56:00Z"/>
+        </w:rPr>
+      </w:pPr>
+      <w:del w:id="651" w:author="rev1" w:date="2026-08-03T08:56:00Z" w16du:dateUtc="2026-08-02T23:56:00Z">
+        <w:r>
+          <w:delText>26.</w:delText>
+        </w:r>
+        <w:r>
+          <w:tab/>
+          <w:delText xml:space="preserve">Spaide, R. Optical Coherence Tomography Angiography Signs of Vascular Abnormalization With Antiangiogenic Therapy for Choroidal Neovascularization. </w:delText>
         </w:r>
         <w:r>
           <w:rPr>
             <w:i/>
             <w:iCs/>
           </w:rPr>
-          <w:t>bioRxiv</w:t>
-        </w:r>
-        <w:r>
-          <w:t xml:space="preserve"> https://doi.org/10.1101/469478 (2018) doi:10.1101/469478. 24. </w:t>
-        </w:r>
-        <w:proofErr w:type="spellStart"/>
-        <w:r>
-          <w:t>Viallard</w:t>
-        </w:r>
-        <w:proofErr w:type="spellEnd"/>
-        <w:r>
-          <w:t xml:space="preserve">, C. &amp; Larrivée, B. Tumor angiogenesis and vascular normalization: alternative therapeutic targets. </w:t>
-        </w:r>
-        <w:r>
-          <w:rPr>
-            <w:i/>
-            <w:iCs/>
-          </w:rPr>
-          <w:t>Angiogenesis</w:t>
-        </w:r>
-        <w:r>
-          <w:t xml:space="preserve"> 20, 409–426 (2017). 25. </w:t>
-        </w:r>
-        <w:proofErr w:type="spellStart"/>
-        <w:r>
-          <w:t>Goker</w:t>
-        </w:r>
-        <w:proofErr w:type="spellEnd"/>
-        <w:r>
-          <w:t xml:space="preserve">, Y. S. &amp; Demir, G. Comparison of optical coherence tomography angiography features in type 1 versus type 2 choroidal neovascular membranes secondary to age-related macular degeneration. </w:t>
-        </w:r>
-        <w:r>
-          <w:rPr>
-            <w:i/>
-            <w:iCs/>
-          </w:rPr>
-          <w:t xml:space="preserve">Med. Hypothesis </w:t>
-        </w:r>
-        <w:proofErr w:type="spellStart"/>
-        <w:r>
-          <w:rPr>
-            <w:i/>
-            <w:iCs/>
-          </w:rPr>
-          <w:t>Discov</w:t>
-        </w:r>
-        <w:proofErr w:type="spellEnd"/>
-        <w:r>
-          <w:rPr>
-            <w:i/>
-            <w:iCs/>
-          </w:rPr>
-          <w:t xml:space="preserve">. Innov. </w:t>
-        </w:r>
-        <w:proofErr w:type="spellStart"/>
-        <w:r>
-          <w:rPr>
-            <w:i/>
-            <w:iCs/>
-          </w:rPr>
-          <w:t>Ophthalmol</w:t>
-        </w:r>
-        <w:proofErr w:type="spellEnd"/>
-        <w:r>
-          <w:rPr>
-            <w:i/>
-            <w:iCs/>
-          </w:rPr>
-          <w:t>. J.</w:t>
-        </w:r>
-        <w:r>
-          <w:t xml:space="preserve"> 10, 67–73 (2021). 26. Li, J. et al. Comparative quantitative analysis of optical coherence tomography angiography in varied morphologies of macular neovascularization following intravitreal </w:t>
-        </w:r>
-        <w:proofErr w:type="spellStart"/>
-        <w:r>
-          <w:t>conbercept</w:t>
-        </w:r>
-        <w:proofErr w:type="spellEnd"/>
-        <w:r>
-          <w:t xml:space="preserve"> and ranibizumab treatments for neovascular age‑related macular degeneration. </w:t>
-        </w:r>
-        <w:r>
-          <w:rPr>
-            <w:i/>
-            <w:iCs/>
-          </w:rPr>
-          <w:t>Exp. Ther. Med.</w:t>
-        </w:r>
-        <w:r>
-          <w:t xml:space="preserve"> 27, 214 (2024). 27. </w:t>
-        </w:r>
-        <w:proofErr w:type="spellStart"/>
-        <w:r>
-          <w:t>Mettu</w:t>
-        </w:r>
-        <w:proofErr w:type="spellEnd"/>
-        <w:r>
-          <w:t xml:space="preserve">, P. S., Allingham, M. J. &amp; Cousins, S. W. Incomplete response to Anti-VEGF </w:t>
-        </w:r>
-        <w:r>
-          <w:lastRenderedPageBreak/>
-          <w:t xml:space="preserve">therapy in neovascular AMD: Exploring disease mechanisms and therapeutic opportunities. </w:t>
-        </w:r>
-        <w:r>
-          <w:rPr>
-            <w:i/>
-            <w:iCs/>
-          </w:rPr>
-          <w:t>Prog. Retin. Eye Res.</w:t>
-        </w:r>
-        <w:r>
-          <w:t xml:space="preserve"> 82, 100906 (2021). 28. </w:t>
-        </w:r>
-        <w:proofErr w:type="spellStart"/>
-        <w:r>
-          <w:t>Attarde</w:t>
-        </w:r>
-        <w:proofErr w:type="spellEnd"/>
-        <w:r>
-          <w:t xml:space="preserve">, A., Riad, T., Zhang, Z., Ahir, M. &amp; Fu, Y. Characterization of Vascular Morphology of Neovascular Age-Related Macular Degeneration by Indocyanine Green Angiography. </w:t>
-        </w:r>
-        <w:r>
-          <w:rPr>
-            <w:i/>
-            <w:iCs/>
-          </w:rPr>
-          <w:t xml:space="preserve">J. Vis. Exp. </w:t>
-        </w:r>
-        <w:proofErr w:type="spellStart"/>
-        <w:r>
-          <w:rPr>
-            <w:i/>
-            <w:iCs/>
-          </w:rPr>
-          <w:t>JoVE</w:t>
-        </w:r>
-        <w:proofErr w:type="spellEnd"/>
-        <w:r>
-          <w:t xml:space="preserve"> 198, (2023). 29. Fu, Y., Zhang, Z., Webster, K. &amp; Paulus, Y. Treatment Strategies for Anti-VEGF Resistance in Neovascular Age-Related Macular Degeneration by Targeting Arteriolar Choroidal Neovascularization. </w:t>
-        </w:r>
-        <w:r>
-          <w:rPr>
-            <w:i/>
-            <w:iCs/>
-          </w:rPr>
-          <w:t>Biomolecules</w:t>
-        </w:r>
-        <w:r>
-          <w:t xml:space="preserve"> 14, 252 (2024). 30. Spaide, R. Optical Coherence Tomography Angiography Signs of Vascular </w:t>
-        </w:r>
-        <w:proofErr w:type="spellStart"/>
-        <w:r>
-          <w:t>Abnormalization</w:t>
-        </w:r>
-        <w:proofErr w:type="spellEnd"/>
-        <w:r>
-          <w:t xml:space="preserve"> </w:t>
-        </w:r>
-        <w:proofErr w:type="gramStart"/>
-        <w:r>
-          <w:t>With</w:t>
-        </w:r>
-        <w:proofErr w:type="gramEnd"/>
-        <w:r>
-          <w:t xml:space="preserve"> Antiangiogenic Therapy for Choroidal Neovascularization. </w:t>
-        </w:r>
-        <w:r>
-          <w:rPr>
-            <w:i/>
-            <w:iCs/>
-          </w:rPr>
-          <w:t xml:space="preserve">Am. J. </w:t>
-        </w:r>
-        <w:proofErr w:type="spellStart"/>
-        <w:r>
-          <w:rPr>
-            <w:i/>
-            <w:iCs/>
-          </w:rPr>
-          <w:t>Ophthalmol</w:t>
-        </w:r>
-        <w:proofErr w:type="spellEnd"/>
-        <w:r>
-          <w:rPr>
-            <w:i/>
-            <w:iCs/>
-          </w:rPr>
-          <w:t>.</w:t>
-        </w:r>
-        <w:r>
-          <w:t xml:space="preserve"> 160, 6–16 (2015). 31. Shah, P. N. et al. Inter-rater reliability of proliferative diabetic retinopathy assessment on wide-field OCT-angiography and fluorescein angiography. </w:t>
-        </w:r>
-        <w:r>
-          <w:rPr>
-            <w:i/>
-            <w:iCs/>
-          </w:rPr>
-          <w:t>Transl. Vis. Sci. Technol.</w:t>
-        </w:r>
-        <w:r>
-          <w:t xml:space="preserve"> 12(7), 13 (2023). 32. Deák, G. G. et al. Comparison of optical coherence tomography vs. fluorescein angiography-based macular neovascularization classifications in age-related macular degeneration. </w:t>
-        </w:r>
-        <w:r>
-          <w:rPr>
-            <w:i/>
-            <w:iCs/>
-          </w:rPr>
-          <w:t>Sci. Rep.</w:t>
-        </w:r>
-        <w:r>
-          <w:t xml:space="preserve"> 15, 4303 (2025) doi:10.1038/s41598-025-87576-6. 33. Gan, Y. et al. Novel quantitative OCTA biomarkers of choroidal neovascularization and associations with disease activity and etiology. </w:t>
-        </w:r>
-        <w:r>
-          <w:rPr>
-            <w:i/>
-            <w:iCs/>
-          </w:rPr>
-          <w:t>Transl. Vis. Sci. Technol.</w:t>
-        </w:r>
-        <w:r>
-          <w:t xml:space="preserve"> 15(3), 10 (2026). 34. Hsu, C. R. et al. Combined quantitative and qualitative optical coherence tomography angiography biomarkers for predicting active neovascular age-related macular degeneration. </w:t>
-        </w:r>
-        <w:r>
-          <w:rPr>
-            <w:i/>
-            <w:iCs/>
-          </w:rPr>
-          <w:t>Sci. Rep.</w:t>
-        </w:r>
-        <w:r>
-          <w:t xml:space="preserve"> 11, 18068 (2021).</w:t>
-        </w:r>
-      </w:ins>
-    </w:p>
-    <w:bookmarkEnd w:id="599"/>
-    <w:p>
-      <w:pPr>
-        <w:pStyle w:val="aa"/>
-        <w:rPr>
-          <w:del w:id="602" w:author="rev1" w:date="2026-08-03T08:56:00Z" w16du:dateUtc="2026-08-02T23:56:00Z"/>
-        </w:rPr>
-      </w:pPr>
-      <w:del w:id="603" w:author="rev1" w:date="2026-08-03T08:56:00Z" w16du:dateUtc="2026-08-02T23:56:00Z">
-        <w:r>
-          <w:rPr>
-            <w:rFonts w:ascii="Arial" w:hAnsi="Arial" w:cs="Arial"/>
-          </w:rPr>
-          <w:fldChar w:fldCharType="begin"/>
-        </w:r>
-        <w:r>
-          <w:rPr>
-            <w:rFonts w:ascii="Arial" w:hAnsi="Arial" w:cs="Arial"/>
-          </w:rPr>
-          <w:delInstrText xml:space="preserve"> ADDIN ZOTERO_BIBL {"uncited":[],"omitted":[],"custom":[]} CSL_BIBLIOGRAPHY </w:delInstrText>
-        </w:r>
-        <w:r>
-          <w:rPr>
-            <w:rFonts w:ascii="Arial" w:hAnsi="Arial" w:cs="Arial"/>
-          </w:rPr>
-          <w:fldChar w:fldCharType="separate"/>
-        </w:r>
-        <w:r>
-          <w:delText>1.</w:delText>
-        </w:r>
-        <w:r>
-          <w:tab/>
-          <w:delText xml:space="preserve">Guo, J., Tang, W., Xu, S., Liu, W. &amp; Xu, G. OCTA evaluation of treatment-naïve flat irregular PED (FIPED)-associated CNV in chronic central serous chorioretinopathy before and after half-dose PDT. </w:delText>
-        </w:r>
-        <w:r>
-          <w:rPr>
-            <w:i/>
-            <w:iCs/>
-          </w:rPr>
-          <w:delText>Eye</w:delText>
+          <w:delText>Am. J. Ophthalmol.</w:delText>
         </w:r>
         <w:r>
           <w:delText xml:space="preserve"> </w:delText>
@@ -9277,10 +9469,10 @@
             <w:b/>
             <w:bCs/>
           </w:rPr>
-          <w:delText>35</w:delText>
-        </w:r>
-        <w:r>
-          <w:delText>, 2871–2878 (2021).</w:delText>
+          <w:delText>160 1</w:delText>
+        </w:r>
+        <w:r>
+          <w:delText>, 6–16 (2015).</w:delText>
         </w:r>
       </w:del>
     </w:p>
@@ -9288,1232 +9480,187 @@
       <w:pPr>
         <w:pStyle w:val="aa"/>
         <w:rPr>
-          <w:del w:id="604" w:author="rev1" w:date="2026-08-03T08:56:00Z" w16du:dateUtc="2026-08-02T23:56:00Z"/>
-        </w:rPr>
-      </w:pPr>
-      <w:del w:id="605" w:author="rev1" w:date="2026-08-03T08:56:00Z" w16du:dateUtc="2026-08-02T23:56:00Z">
-        <w:r>
-          <w:delText>2.</w:delText>
-        </w:r>
-        <w:r>
-          <w:tab/>
-          <w:delText xml:space="preserve">Zudaire, E., Gambardella, L., Kurcz, C. &amp; Vermeren, S. A Computational Tool for Quantitative Analysis of Vascular Networks. </w:delText>
-        </w:r>
-        <w:r>
-          <w:rPr>
-            <w:i/>
-            <w:iCs/>
-          </w:rPr>
-          <w:delText>PLOS ONE</w:delText>
-        </w:r>
-        <w:r>
-          <w:delText xml:space="preserve"> </w:delText>
-        </w:r>
-        <w:r>
-          <w:rPr>
+          <w:del w:id="652" w:author="rev1" w:date="2026-08-03T08:56:00Z" w16du:dateUtc="2026-08-02T23:56:00Z"/>
+          <w:rFonts w:ascii="Arial" w:hAnsi="Arial" w:cs="Arial"/>
+        </w:rPr>
+      </w:pPr>
+      <w:del w:id="653" w:author="rev1" w:date="2026-08-03T08:56:00Z" w16du:dateUtc="2026-08-02T23:56:00Z">
+        <w:r>
+          <w:rPr>
+            <w:rFonts w:ascii="Arial" w:hAnsi="Arial" w:cs="Arial"/>
+          </w:rPr>
+          <w:fldChar w:fldCharType="end"/>
+        </w:r>
+      </w:del>
+    </w:p>
+    <w:p>
+      <w:pPr>
+        <w:pStyle w:val="aa"/>
+        <w:ind w:left="0" w:firstLine="0"/>
+        <w:rPr>
+          <w:rFonts w:ascii="Arial" w:hAnsi="Arial" w:cs="Arial"/>
+          <w:b/>
+          <w:bCs/>
+        </w:rPr>
+      </w:pPr>
+      <w:bookmarkStart w:id="654" w:name="figure"/>
+      <w:r>
+        <w:rPr>
+          <w:rFonts w:ascii="Arial" w:hAnsi="Arial" w:cs="Arial"/>
+          <w:b/>
+          <w:bCs/>
+        </w:rPr>
+        <w:t>Figure</w:t>
+      </w:r>
+    </w:p>
+    <w:p>
+      <w:pPr>
+        <w:pStyle w:val="aa"/>
+        <w:ind w:left="0" w:firstLine="0"/>
+        <w:rPr>
+          <w:del w:id="655" w:author="rev1" w:date="2026-08-03T08:56:00Z" w16du:dateUtc="2026-08-02T23:56:00Z"/>
+          <w:rFonts w:ascii="Arial" w:hAnsi="Arial" w:cs="Arial"/>
+        </w:rPr>
+      </w:pPr>
+      <w:r>
+        <w:rPr>
+          <w:rFonts w:ascii="Arial" w:hAnsi="Arial" w:cs="Arial"/>
+          <w:b/>
+          <w:bCs/>
+        </w:rPr>
+        <w:t xml:space="preserve">Representative </w:t>
+      </w:r>
+      <w:ins w:id="656" w:author="rev1" w:date="2026-08-03T08:56:00Z" w16du:dateUtc="2026-08-02T23:56:00Z">
+        <w:r>
+          <w:t xml:space="preserve">OCTA processing and </w:t>
+        </w:r>
+      </w:ins>
+      <w:del w:id="657" w:author="rev1" w:date="2026-08-03T08:56:00Z" w16du:dateUtc="2026-08-02T23:56:00Z">
+        <w:r>
+          <w:rPr>
+            <w:rFonts w:ascii="Arial" w:hAnsi="Arial" w:cs="Arial"/>
             <w:b/>
             <w:bCs/>
           </w:rPr>
-          <w:delText>6</w:delText>
-        </w:r>
-        <w:r>
-          <w:delText>, e27385 (2011).</w:delText>
-        </w:r>
-      </w:del>
-    </w:p>
-    <w:p>
-      <w:pPr>
-        <w:pStyle w:val="aa"/>
-        <w:rPr>
-          <w:del w:id="606" w:author="rev1" w:date="2026-08-03T08:56:00Z" w16du:dateUtc="2026-08-02T23:56:00Z"/>
-        </w:rPr>
-      </w:pPr>
-      <w:del w:id="607" w:author="rev1" w:date="2026-08-03T08:56:00Z" w16du:dateUtc="2026-08-02T23:56:00Z">
-        <w:r>
-          <w:delText>3.</w:delText>
-        </w:r>
-        <w:r>
-          <w:tab/>
-          <w:delText xml:space="preserve">Told, R. </w:delText>
-        </w:r>
-        <w:r>
-          <w:rPr>
-            <w:i/>
-            <w:iCs/>
-          </w:rPr>
-          <w:delText>et al.</w:delText>
-        </w:r>
-        <w:r>
-          <w:delText xml:space="preserve"> Profiling neovascular age-related macular degeneration choroidal neovascularization lesion response to anti-vascular endothelial growth factor therapy using SSOCTA. </w:delText>
-        </w:r>
-        <w:r>
-          <w:rPr>
-            <w:i/>
-            <w:iCs/>
-          </w:rPr>
-          <w:delText>Acta Ophthalmol. (Copenh.)</w:delText>
-        </w:r>
-        <w:r>
-          <w:delText xml:space="preserve"> </w:delText>
-        </w:r>
-        <w:r>
-          <w:rPr>
+          <w:delText xml:space="preserve">OCT-A images demonstrating consistent MNV </w:delText>
+        </w:r>
+      </w:del>
+      <w:r>
+        <w:rPr>
+          <w:rFonts w:ascii="Arial" w:hAnsi="Arial" w:cs="Arial"/>
+          <w:b/>
+          <w:bCs/>
+        </w:rPr>
+        <w:t xml:space="preserve">segmentation </w:t>
+      </w:r>
+      <w:ins w:id="658" w:author="rev1" w:date="2026-08-03T08:56:00Z" w16du:dateUtc="2026-08-02T23:56:00Z">
+        <w:r>
+          <w:t>panels</w:t>
+        </w:r>
+      </w:ins>
+      <w:del w:id="659" w:author="rev1" w:date="2026-08-03T08:56:00Z" w16du:dateUtc="2026-08-02T23:56:00Z">
+        <w:r>
+          <w:rPr>
+            <w:rFonts w:ascii="Arial" w:hAnsi="Arial" w:cs="Arial"/>
             <w:b/>
             <w:bCs/>
           </w:rPr>
-          <w:delText>99</w:delText>
-        </w:r>
-        <w:r>
-          <w:delText>, e240–e246 (2021).</w:delText>
+          <w:delText>across multiple platforms.</w:delText>
+        </w:r>
+        <w:r>
+          <w:rPr>
+            <w:rFonts w:ascii="Arial" w:hAnsi="Arial" w:cs="Arial"/>
+          </w:rPr>
+          <w:delText xml:space="preserve"> </w:delText>
         </w:r>
       </w:del>
     </w:p>
     <w:p>
       <w:pPr>
         <w:pStyle w:val="aa"/>
-        <w:rPr>
-          <w:del w:id="608" w:author="rev1" w:date="2026-08-03T08:56:00Z" w16du:dateUtc="2026-08-02T23:56:00Z"/>
-        </w:rPr>
-      </w:pPr>
-      <w:del w:id="609" w:author="rev1" w:date="2026-08-03T08:56:00Z" w16du:dateUtc="2026-08-02T23:56:00Z">
-        <w:r>
-          <w:delText>4.</w:delText>
-        </w:r>
-        <w:r>
-          <w:tab/>
-          <w:delText xml:space="preserve">Montesel, A. </w:delText>
-        </w:r>
-        <w:r>
-          <w:rPr>
-            <w:i/>
-            <w:iCs/>
-          </w:rPr>
-          <w:delText>et al.</w:delText>
-        </w:r>
-        <w:r>
-          <w:delText xml:space="preserve"> Quantitative response of macular neovascularisation to loading phase of aflibercept in neovascular age-related macular degeneration. </w:delText>
-        </w:r>
-        <w:r>
-          <w:rPr>
-            <w:i/>
-            <w:iCs/>
-          </w:rPr>
-          <w:delText>Eye</w:delText>
-        </w:r>
-        <w:r>
-          <w:delText xml:space="preserve"> </w:delText>
-        </w:r>
-        <w:r>
-          <w:rPr>
+        <w:ind w:left="0" w:firstLine="0"/>
+        <w:rPr>
+          <w:rFonts w:ascii="Arial" w:hAnsi="Arial" w:cs="Arial"/>
+        </w:rPr>
+      </w:pPr>
+      <w:del w:id="660" w:author="rev1" w:date="2026-08-03T08:56:00Z" w16du:dateUtc="2026-08-02T23:56:00Z">
+        <w:r>
+          <w:rPr>
+            <w:rFonts w:ascii="Arial" w:hAnsi="Arial" w:cs="Arial"/>
+          </w:rPr>
+          <w:delText xml:space="preserve">Images were acquired using: </w:delText>
+        </w:r>
+        <w:r>
+          <w:rPr>
+            <w:rFonts w:ascii="Arial" w:hAnsi="Arial" w:cs="Arial"/>
             <w:b/>
             <w:bCs/>
           </w:rPr>
-          <w:delText>37</w:delText>
-        </w:r>
-        <w:r>
-          <w:delText>, 3648–3655 (2023).</w:delText>
-        </w:r>
-      </w:del>
-    </w:p>
-    <w:p>
-      <w:pPr>
-        <w:pStyle w:val="aa"/>
-        <w:rPr>
-          <w:del w:id="610" w:author="rev1" w:date="2026-08-03T08:56:00Z" w16du:dateUtc="2026-08-02T23:56:00Z"/>
-        </w:rPr>
-      </w:pPr>
-      <w:del w:id="611" w:author="rev1" w:date="2026-08-03T08:56:00Z" w16du:dateUtc="2026-08-02T23:56:00Z">
-        <w:r>
-          <w:delText>5.</w:delText>
-        </w:r>
-        <w:r>
-          <w:tab/>
-          <w:delText xml:space="preserve">Carlà, M. M. </w:delText>
-        </w:r>
-        <w:r>
-          <w:rPr>
-            <w:i/>
-            <w:iCs/>
-          </w:rPr>
-          <w:delText>et al.</w:delText>
-        </w:r>
-        <w:r>
-          <w:delText xml:space="preserve"> MORPHOMETRIC CHANGES IN MACULAR NEOVASCULARIZATION ARCHITECTURE AFTER FARICIMAB TREATMENT IN NEOVASCULAR AGE-RELATED MACULAR DEGENERATION: Comparison Between Naive and Switched Eyes. </w:delText>
-        </w:r>
-        <w:r>
-          <w:rPr>
-            <w:i/>
-            <w:iCs/>
-          </w:rPr>
-          <w:delText>Retina</w:delText>
-        </w:r>
-        <w:r>
-          <w:delText xml:space="preserve"> 125–135 (2026) doi:10.1097/iae.0000000000004635.</w:delText>
-        </w:r>
-      </w:del>
-    </w:p>
-    <w:p>
-      <w:pPr>
-        <w:pStyle w:val="aa"/>
-        <w:rPr>
-          <w:del w:id="612" w:author="rev1" w:date="2026-08-03T08:56:00Z" w16du:dateUtc="2026-08-02T23:56:00Z"/>
-        </w:rPr>
-      </w:pPr>
-      <w:del w:id="613" w:author="rev1" w:date="2026-08-03T08:56:00Z" w16du:dateUtc="2026-08-02T23:56:00Z">
-        <w:r>
-          <w:delText>6.</w:delText>
-        </w:r>
-        <w:r>
-          <w:tab/>
-          <w:delText xml:space="preserve">Munk, M. R. </w:delText>
-        </w:r>
-        <w:r>
-          <w:rPr>
-            <w:i/>
-            <w:iCs/>
-          </w:rPr>
-          <w:delText>et al.</w:delText>
-        </w:r>
-        <w:r>
-          <w:delText xml:space="preserve"> OCT-angiography: A qualitative and quantitative comparison of 4 OCT-A devices. </w:delText>
-        </w:r>
-        <w:r>
-          <w:rPr>
-            <w:i/>
-            <w:iCs/>
-          </w:rPr>
-          <w:delText>PLOS ONE</w:delText>
-        </w:r>
-        <w:r>
-          <w:delText xml:space="preserve"> </w:delText>
-        </w:r>
-        <w:r>
-          <w:rPr>
+          <w:delText>(A)</w:delText>
+        </w:r>
+        <w:r>
+          <w:rPr>
+            <w:rFonts w:ascii="Arial" w:hAnsi="Arial" w:cs="Arial"/>
+          </w:rPr>
+          <w:delText xml:space="preserve"> Zeiss PlexElite 9000 (6×6 mm), </w:delText>
+        </w:r>
+        <w:r>
+          <w:rPr>
+            <w:rFonts w:ascii="Arial" w:hAnsi="Arial" w:cs="Arial"/>
             <w:b/>
             <w:bCs/>
           </w:rPr>
-          <w:delText>12</w:delText>
-        </w:r>
-        <w:r>
-          <w:delText>, e0177059 (2017).</w:delText>
-        </w:r>
-      </w:del>
-    </w:p>
-    <w:p>
-      <w:pPr>
-        <w:pStyle w:val="aa"/>
-        <w:rPr>
-          <w:del w:id="614" w:author="rev1" w:date="2026-08-03T08:56:00Z" w16du:dateUtc="2026-08-02T23:56:00Z"/>
-        </w:rPr>
-      </w:pPr>
-      <w:del w:id="615" w:author="rev1" w:date="2026-08-03T08:56:00Z" w16du:dateUtc="2026-08-02T23:56:00Z">
-        <w:r>
-          <w:delText>7.</w:delText>
-        </w:r>
-        <w:r>
-          <w:tab/>
-          <w:delText xml:space="preserve">Miere, A. </w:delText>
-        </w:r>
-        <w:r>
-          <w:rPr>
-            <w:i/>
-            <w:iCs/>
-          </w:rPr>
-          <w:delText>et al.</w:delText>
-        </w:r>
-        <w:r>
-          <w:delText xml:space="preserve"> VASCULAR REMODELING OF CHOROIDAL NEOVASCULARIZATION AFTER ANTI-VASCULAR ENDOTHELIAL GROWTH FACTOR THERAPY VISUALIZED ON OPTICAL COHERENCE TOMOGRAPHY ANGIOGRAPHY. </w:delText>
-        </w:r>
-        <w:r>
-          <w:rPr>
-            <w:i/>
-            <w:iCs/>
-          </w:rPr>
-          <w:delText>Retina</w:delText>
-        </w:r>
-        <w:r>
-          <w:delText xml:space="preserve"> </w:delText>
-        </w:r>
-        <w:r>
-          <w:rPr>
+          <w:delText>(B)</w:delText>
+        </w:r>
+        <w:r>
+          <w:rPr>
+            <w:rFonts w:ascii="Arial" w:hAnsi="Arial" w:cs="Arial"/>
+          </w:rPr>
+          <w:delText xml:space="preserve"> Optovue Solix (6×6 mm), and </w:delText>
+        </w:r>
+        <w:r>
+          <w:rPr>
+            <w:rFonts w:ascii="Arial" w:hAnsi="Arial" w:cs="Arial"/>
             <w:b/>
             <w:bCs/>
           </w:rPr>
-          <w:delText>39</w:delText>
-        </w:r>
-        <w:r>
-          <w:delText>, 548–557 (2019).</w:delText>
-        </w:r>
-      </w:del>
-    </w:p>
-    <w:p>
-      <w:pPr>
-        <w:pStyle w:val="aa"/>
-        <w:rPr>
-          <w:del w:id="616" w:author="rev1" w:date="2026-08-03T08:56:00Z" w16du:dateUtc="2026-08-02T23:56:00Z"/>
-        </w:rPr>
-      </w:pPr>
-      <w:del w:id="617" w:author="rev1" w:date="2026-08-03T08:56:00Z" w16du:dateUtc="2026-08-02T23:56:00Z">
-        <w:r>
-          <w:delText>8.</w:delText>
-        </w:r>
-        <w:r>
-          <w:tab/>
-          <w:delText xml:space="preserve">Tew, T. </w:delText>
-        </w:r>
-        <w:r>
-          <w:rPr>
-            <w:i/>
-            <w:iCs/>
-          </w:rPr>
-          <w:delText>et al.</w:delText>
-        </w:r>
-        <w:r>
-          <w:delText xml:space="preserve"> Comparison of different morphologies of choroidal neovascularization evaluated by ocular coherence tomography angiography in age-related macular degeneration. </w:delText>
-        </w:r>
-        <w:r>
-          <w:rPr>
-            <w:i/>
-            <w:iCs/>
-          </w:rPr>
-          <w:delText>Clin. Experiment. Ophthalmol.</w:delText>
-        </w:r>
-        <w:r>
-          <w:delText xml:space="preserve"> </w:delText>
-        </w:r>
-        <w:r>
-          <w:rPr>
-            <w:b/>
-            <w:bCs/>
-          </w:rPr>
-          <w:delText>48</w:delText>
-        </w:r>
-        <w:r>
-          <w:delText>, 927–937 (2020).</w:delText>
-        </w:r>
-      </w:del>
-    </w:p>
-    <w:p>
-      <w:pPr>
-        <w:pStyle w:val="aa"/>
-        <w:rPr>
-          <w:del w:id="618" w:author="rev1" w:date="2026-08-03T08:56:00Z" w16du:dateUtc="2026-08-02T23:56:00Z"/>
-        </w:rPr>
-      </w:pPr>
-      <w:del w:id="619" w:author="rev1" w:date="2026-08-03T08:56:00Z" w16du:dateUtc="2026-08-02T23:56:00Z">
-        <w:r>
-          <w:delText>9.</w:delText>
-        </w:r>
-        <w:r>
-          <w:tab/>
-          <w:delText xml:space="preserve">Coscas, F. </w:delText>
-        </w:r>
-        <w:r>
-          <w:rPr>
-            <w:i/>
-            <w:iCs/>
-          </w:rPr>
-          <w:delText>et al.</w:delText>
-        </w:r>
-        <w:r>
-          <w:delText xml:space="preserve"> Optical coherence tomography angiography in exudative age-related macular degeneration: A predictive model for treatment decisions. </w:delText>
-        </w:r>
-        <w:r>
-          <w:rPr>
-            <w:i/>
-            <w:iCs/>
-          </w:rPr>
-          <w:delText>Br. J. Ophthalmol.</w:delText>
-        </w:r>
-        <w:r>
-          <w:delText xml:space="preserve"> </w:delText>
-        </w:r>
-        <w:r>
-          <w:rPr>
-            <w:b/>
-            <w:bCs/>
-          </w:rPr>
-          <w:delText>103</w:delText>
-        </w:r>
-        <w:r>
-          <w:delText>, 1342–1356 (2019).</w:delText>
-        </w:r>
-      </w:del>
-    </w:p>
-    <w:p>
-      <w:pPr>
-        <w:pStyle w:val="aa"/>
-        <w:rPr>
-          <w:del w:id="620" w:author="rev1" w:date="2026-08-03T08:56:00Z" w16du:dateUtc="2026-08-02T23:56:00Z"/>
-        </w:rPr>
-      </w:pPr>
-      <w:del w:id="621" w:author="rev1" w:date="2026-08-03T08:56:00Z" w16du:dateUtc="2026-08-02T23:56:00Z">
-        <w:r>
-          <w:delText>10.</w:delText>
-        </w:r>
-        <w:r>
-          <w:tab/>
-          <w:delText xml:space="preserve">Oliveira, W. S., Teixeira, J. V., Ren, T. I., Cavalcanti, G. D. C. &amp; Sijbers, J. Unsupervised Retinal Vessel Segmentation Using Combined Filters. </w:delText>
-        </w:r>
-        <w:r>
-          <w:rPr>
-            <w:i/>
-            <w:iCs/>
-          </w:rPr>
-          <w:delText>PLoS ONE</w:delText>
-        </w:r>
-        <w:r>
-          <w:delText xml:space="preserve"> </w:delText>
-        </w:r>
-        <w:r>
-          <w:rPr>
-            <w:b/>
-            <w:bCs/>
-          </w:rPr>
-          <w:delText>11</w:delText>
-        </w:r>
-        <w:r>
-          <w:delText>, e0149943 (2016).</w:delText>
-        </w:r>
-      </w:del>
-    </w:p>
-    <w:p>
-      <w:pPr>
-        <w:pStyle w:val="aa"/>
-        <w:rPr>
-          <w:del w:id="622" w:author="rev1" w:date="2026-08-03T08:56:00Z" w16du:dateUtc="2026-08-02T23:56:00Z"/>
-        </w:rPr>
-      </w:pPr>
-      <w:del w:id="623" w:author="rev1" w:date="2026-08-03T08:56:00Z" w16du:dateUtc="2026-08-02T23:56:00Z">
-        <w:r>
-          <w:delText>11.</w:delText>
-        </w:r>
-        <w:r>
-          <w:tab/>
-          <w:delText xml:space="preserve">Ma, Y. </w:delText>
-        </w:r>
-        <w:r>
-          <w:rPr>
-            <w:i/>
-            <w:iCs/>
-          </w:rPr>
-          <w:delText>et al.</w:delText>
-        </w:r>
-        <w:r>
-          <w:delText xml:space="preserve"> Multichannel Retinal Blood Vessel Segmentation Based on the Combination of Matched Filter and U-Net Network. </w:delText>
-        </w:r>
-        <w:r>
-          <w:rPr>
-            <w:i/>
-            <w:iCs/>
-          </w:rPr>
-          <w:delText>BioMed Res. Int.</w:delText>
-        </w:r>
-        <w:r>
-          <w:delText xml:space="preserve"> </w:delText>
-        </w:r>
-        <w:r>
-          <w:rPr>
-            <w:b/>
-            <w:bCs/>
-          </w:rPr>
-          <w:delText>2021</w:delText>
-        </w:r>
-        <w:r>
-          <w:delText>, 5561125 (2021).</w:delText>
-        </w:r>
-      </w:del>
-    </w:p>
-    <w:p>
-      <w:pPr>
-        <w:pStyle w:val="aa"/>
-        <w:rPr>
-          <w:del w:id="624" w:author="rev1" w:date="2026-08-03T08:56:00Z" w16du:dateUtc="2026-08-02T23:56:00Z"/>
-        </w:rPr>
-      </w:pPr>
-      <w:del w:id="625" w:author="rev1" w:date="2026-08-03T08:56:00Z" w16du:dateUtc="2026-08-02T23:56:00Z">
-        <w:r>
-          <w:delText>12.</w:delText>
-        </w:r>
-        <w:r>
-          <w:tab/>
-          <w:delText xml:space="preserve">Memari, N., Ramli, A. R., Bin Saripan, M. I., Mashohor, S. &amp; Moghbel, M. Supervised retinal vessel segmentation from color fundus images based on matched filtering and AdaBoost classifier. </w:delText>
-        </w:r>
-        <w:r>
-          <w:rPr>
-            <w:i/>
-            <w:iCs/>
-          </w:rPr>
-          <w:delText>PLoS ONE</w:delText>
-        </w:r>
-        <w:r>
-          <w:delText xml:space="preserve"> </w:delText>
-        </w:r>
-        <w:r>
-          <w:rPr>
-            <w:b/>
-            <w:bCs/>
-          </w:rPr>
-          <w:delText>12</w:delText>
-        </w:r>
-        <w:r>
-          <w:delText>, e0188939 (2017).</w:delText>
-        </w:r>
-      </w:del>
-    </w:p>
-    <w:p>
-      <w:pPr>
-        <w:pStyle w:val="aa"/>
-        <w:rPr>
-          <w:del w:id="626" w:author="rev1" w:date="2026-08-03T08:56:00Z" w16du:dateUtc="2026-08-02T23:56:00Z"/>
-        </w:rPr>
-      </w:pPr>
-      <w:del w:id="627" w:author="rev1" w:date="2026-08-03T08:56:00Z" w16du:dateUtc="2026-08-02T23:56:00Z">
-        <w:r>
-          <w:delText>13.</w:delText>
-        </w:r>
-        <w:r>
-          <w:tab/>
-          <w:delText xml:space="preserve">Wang, M. </w:delText>
-        </w:r>
-        <w:r>
-          <w:rPr>
-            <w:i/>
-            <w:iCs/>
-          </w:rPr>
-          <w:delText>et al.</w:delText>
-        </w:r>
-        <w:r>
-          <w:delText xml:space="preserve"> Evaluating Polypoidal Choroidal Vasculopathy With Optical Coherence Tomography Angiography. </w:delText>
-        </w:r>
-        <w:r>
-          <w:rPr>
-            <w:i/>
-            <w:iCs/>
-          </w:rPr>
-          <w:delText>Investig. Opthalmology Vis. Sci.</w:delText>
-        </w:r>
-        <w:r>
-          <w:delText xml:space="preserve"> </w:delText>
-        </w:r>
-        <w:r>
-          <w:rPr>
-            <w:b/>
-            <w:bCs/>
-          </w:rPr>
-          <w:delText>57</w:delText>
-        </w:r>
-        <w:r>
-          <w:delText>, OCT526-32 (2016).</w:delText>
-        </w:r>
-      </w:del>
-    </w:p>
-    <w:p>
-      <w:pPr>
-        <w:pStyle w:val="aa"/>
-        <w:rPr>
-          <w:del w:id="628" w:author="rev1" w:date="2026-08-03T08:56:00Z" w16du:dateUtc="2026-08-02T23:56:00Z"/>
-        </w:rPr>
-      </w:pPr>
-      <w:del w:id="629" w:author="rev1" w:date="2026-08-03T08:56:00Z" w16du:dateUtc="2026-08-02T23:56:00Z">
-        <w:r>
-          <w:delText>14.</w:delText>
-        </w:r>
-        <w:r>
-          <w:tab/>
-          <w:delText xml:space="preserve">Xue, J. </w:delText>
-        </w:r>
-        <w:r>
-          <w:rPr>
-            <w:i/>
-            <w:iCs/>
-          </w:rPr>
-          <w:delText>et al.</w:delText>
-        </w:r>
-        <w:r>
-          <w:delText xml:space="preserve"> Automatic quantification of choroidal neovascularization lesion area on OCT angiography based on density cell-like P systems with active membranes. </w:delText>
-        </w:r>
-        <w:r>
-          <w:rPr>
-            <w:i/>
-            <w:iCs/>
-          </w:rPr>
-          <w:delText>Biomed. Opt. Express</w:delText>
-        </w:r>
-        <w:r>
-          <w:delText xml:space="preserve"> </w:delText>
-        </w:r>
-        <w:r>
-          <w:rPr>
-            <w:b/>
-            <w:bCs/>
-          </w:rPr>
-          <w:delText>9 7</w:delText>
-        </w:r>
-        <w:r>
-          <w:delText>, 3208–3219 (2018).</w:delText>
-        </w:r>
-      </w:del>
-    </w:p>
-    <w:p>
-      <w:pPr>
-        <w:pStyle w:val="aa"/>
-        <w:rPr>
-          <w:del w:id="630" w:author="rev1" w:date="2026-08-03T08:56:00Z" w16du:dateUtc="2026-08-02T23:56:00Z"/>
-        </w:rPr>
-      </w:pPr>
-      <w:del w:id="631" w:author="rev1" w:date="2026-08-03T08:56:00Z" w16du:dateUtc="2026-08-02T23:56:00Z">
-        <w:r>
-          <w:delText>15.</w:delText>
-        </w:r>
-        <w:r>
-          <w:tab/>
-          <w:delText xml:space="preserve">Babiuch, A. </w:delText>
-        </w:r>
-        <w:r>
-          <w:rPr>
-            <w:i/>
-            <w:iCs/>
-          </w:rPr>
-          <w:delText>et al.</w:delText>
-        </w:r>
-        <w:r>
-          <w:delText xml:space="preserve"> IMPACT OF OPTICAL COHERENCE TOMOGRAPHY ANGIOGRAPHY REVIEW STRATEGY ON DETECTION OF CHOROIDAL NEOVASCULARIZATION. </w:delText>
-        </w:r>
-        <w:r>
-          <w:rPr>
-            <w:i/>
-            <w:iCs/>
-          </w:rPr>
-          <w:delText>Retina</w:delText>
-        </w:r>
-        <w:r>
-          <w:delText xml:space="preserve"> 672–678 (2020) doi:10.1097/iae.0000000000002443.</w:delText>
-        </w:r>
-      </w:del>
-    </w:p>
-    <w:p>
-      <w:pPr>
-        <w:pStyle w:val="aa"/>
-        <w:rPr>
-          <w:del w:id="632" w:author="rev1" w:date="2026-08-03T08:56:00Z" w16du:dateUtc="2026-08-02T23:56:00Z"/>
-        </w:rPr>
-      </w:pPr>
-      <w:del w:id="633" w:author="rev1" w:date="2026-08-03T08:56:00Z" w16du:dateUtc="2026-08-02T23:56:00Z">
-        <w:r>
-          <w:delText>16.</w:delText>
-        </w:r>
-        <w:r>
-          <w:tab/>
-          <w:delText xml:space="preserve">Smith, A. &amp; Zavala, V. The Euler characteristic: A general topological descriptor for complex data. </w:delText>
-        </w:r>
-        <w:r>
-          <w:rPr>
-            <w:i/>
-            <w:iCs/>
-          </w:rPr>
-          <w:delText>Comput Chem Eng</w:delText>
-        </w:r>
-        <w:r>
-          <w:delText xml:space="preserve"> </w:delText>
-        </w:r>
-        <w:r>
-          <w:rPr>
-            <w:b/>
-            <w:bCs/>
-          </w:rPr>
-          <w:delText>154</w:delText>
-        </w:r>
-        <w:r>
-          <w:delText>, 107463 (2021).</w:delText>
-        </w:r>
-      </w:del>
-    </w:p>
-    <w:p>
-      <w:pPr>
-        <w:pStyle w:val="aa"/>
-        <w:rPr>
-          <w:del w:id="634" w:author="rev1" w:date="2026-08-03T08:56:00Z" w16du:dateUtc="2026-08-02T23:56:00Z"/>
-        </w:rPr>
-      </w:pPr>
-      <w:del w:id="635" w:author="rev1" w:date="2026-08-03T08:56:00Z" w16du:dateUtc="2026-08-02T23:56:00Z">
-        <w:r>
-          <w:delText>17.</w:delText>
-        </w:r>
-        <w:r>
-          <w:tab/>
-          <w:delText xml:space="preserve">Willführ, A. </w:delText>
-        </w:r>
-        <w:r>
-          <w:rPr>
-            <w:i/>
-            <w:iCs/>
-          </w:rPr>
-          <w:delText>et al.</w:delText>
-        </w:r>
-        <w:r>
-          <w:delText xml:space="preserve"> Estimation of the number of alveolar capillaries by the Euler number (Euler-Poincaré characteristic). </w:delText>
-        </w:r>
-        <w:r>
-          <w:rPr>
-            <w:i/>
-            <w:iCs/>
-          </w:rPr>
-          <w:delText>Am. J. Physiol. Lung Cell. Mol. Physiol.</w:delText>
-        </w:r>
-        <w:r>
-          <w:delText xml:space="preserve"> </w:delText>
-        </w:r>
-        <w:r>
-          <w:rPr>
-            <w:b/>
-            <w:bCs/>
-          </w:rPr>
-          <w:delText>309</w:delText>
-        </w:r>
-        <w:r>
-          <w:delText>, L1286-93 (2015).</w:delText>
-        </w:r>
-      </w:del>
-    </w:p>
-    <w:p>
-      <w:pPr>
-        <w:pStyle w:val="aa"/>
-        <w:rPr>
-          <w:del w:id="636" w:author="rev1" w:date="2026-08-03T08:56:00Z" w16du:dateUtc="2026-08-02T23:56:00Z"/>
-        </w:rPr>
-      </w:pPr>
-      <w:del w:id="637" w:author="rev1" w:date="2026-08-03T08:56:00Z" w16du:dateUtc="2026-08-02T23:56:00Z">
-        <w:r>
-          <w:delText>18.</w:delText>
-        </w:r>
-        <w:r>
-          <w:tab/>
-          <w:delText xml:space="preserve">Santos, F. </w:delText>
-        </w:r>
-        <w:r>
-          <w:rPr>
-            <w:i/>
-            <w:iCs/>
-          </w:rPr>
-          <w:delText>et al.</w:delText>
-        </w:r>
-        <w:r>
-          <w:delText xml:space="preserve"> Topological phase transitions in functional brain networks. </w:delText>
-        </w:r>
-        <w:r>
-          <w:rPr>
-            <w:i/>
-            <w:iCs/>
-          </w:rPr>
-          <w:delText>bioRxiv</w:delText>
-        </w:r>
-        <w:r>
-          <w:delText xml:space="preserve"> https://doi.org/10.1101/469478 (2018) doi:10.1101/469478.</w:delText>
-        </w:r>
-      </w:del>
-    </w:p>
-    <w:p>
-      <w:pPr>
-        <w:pStyle w:val="aa"/>
-        <w:rPr>
-          <w:del w:id="638" w:author="rev1" w:date="2026-08-03T08:56:00Z" w16du:dateUtc="2026-08-02T23:56:00Z"/>
-        </w:rPr>
-      </w:pPr>
-      <w:del w:id="639" w:author="rev1" w:date="2026-08-03T08:56:00Z" w16du:dateUtc="2026-08-02T23:56:00Z">
-        <w:r>
-          <w:delText>19.</w:delText>
-        </w:r>
-        <w:r>
-          <w:tab/>
-          <w:delText xml:space="preserve">Viallard, C. &amp; Larrivée, B. Tumor angiogenesis and vascular normalization: alternative therapeutic targets. </w:delText>
-        </w:r>
-        <w:r>
-          <w:rPr>
-            <w:i/>
-            <w:iCs/>
-          </w:rPr>
-          <w:delText>Angiogenesis</w:delText>
-        </w:r>
-        <w:r>
-          <w:delText xml:space="preserve"> </w:delText>
-        </w:r>
-        <w:r>
-          <w:rPr>
-            <w:b/>
-            <w:bCs/>
-          </w:rPr>
-          <w:delText>20</w:delText>
-        </w:r>
-        <w:r>
-          <w:delText>, 409–426 (2017).</w:delText>
-        </w:r>
-      </w:del>
-    </w:p>
-    <w:p>
-      <w:pPr>
-        <w:pStyle w:val="aa"/>
-        <w:rPr>
-          <w:del w:id="640" w:author="rev1" w:date="2026-08-03T08:56:00Z" w16du:dateUtc="2026-08-02T23:56:00Z"/>
-        </w:rPr>
-      </w:pPr>
-      <w:del w:id="641" w:author="rev1" w:date="2026-08-03T08:56:00Z" w16du:dateUtc="2026-08-02T23:56:00Z">
-        <w:r>
-          <w:delText>20.</w:delText>
-        </w:r>
-        <w:r>
-          <w:tab/>
-          <w:delText xml:space="preserve">Goker, Y. S. &amp; Demir, G. Comparison of optical coherence tomography angiography features in type 1 versus type 2 choroidal neovascular membranes secondary to age-related macular degeneration. </w:delText>
-        </w:r>
-        <w:r>
-          <w:rPr>
-            <w:i/>
-            <w:iCs/>
-          </w:rPr>
-          <w:delText>Med. Hypothesis Discov. Innov. Ophthalmol. J.</w:delText>
-        </w:r>
-        <w:r>
-          <w:delText xml:space="preserve"> </w:delText>
-        </w:r>
-        <w:r>
-          <w:rPr>
-            <w:b/>
-            <w:bCs/>
-          </w:rPr>
-          <w:delText>10</w:delText>
-        </w:r>
-        <w:r>
-          <w:delText>, 67–73 (2021).</w:delText>
-        </w:r>
-      </w:del>
-    </w:p>
-    <w:p>
-      <w:pPr>
-        <w:pStyle w:val="aa"/>
-        <w:rPr>
-          <w:del w:id="642" w:author="rev1" w:date="2026-08-03T08:56:00Z" w16du:dateUtc="2026-08-02T23:56:00Z"/>
-        </w:rPr>
-      </w:pPr>
-      <w:del w:id="643" w:author="rev1" w:date="2026-08-03T08:56:00Z" w16du:dateUtc="2026-08-02T23:56:00Z">
-        <w:r>
-          <w:delText>21.</w:delText>
-        </w:r>
-        <w:r>
-          <w:tab/>
-          <w:delText xml:space="preserve">Li, J. </w:delText>
-        </w:r>
-        <w:r>
-          <w:rPr>
-            <w:i/>
-            <w:iCs/>
-          </w:rPr>
-          <w:delText>et al.</w:delText>
-        </w:r>
-        <w:r>
-          <w:delText xml:space="preserve"> Comparative quantitative analysis of optical coherence tomography angiography in varied morphologies of macular neovascularization following intravitreal conbercept and ranibizumab treatments for neovascular age‑related macular degeneration. </w:delText>
-        </w:r>
-        <w:r>
-          <w:rPr>
-            <w:i/>
-            <w:iCs/>
-          </w:rPr>
-          <w:delText>Exp. Ther. Med.</w:delText>
-        </w:r>
-        <w:r>
-          <w:delText xml:space="preserve"> </w:delText>
-        </w:r>
-        <w:r>
-          <w:rPr>
-            <w:b/>
-            <w:bCs/>
-          </w:rPr>
-          <w:delText>27</w:delText>
-        </w:r>
-        <w:r>
-          <w:delText>, 214 (2024).</w:delText>
-        </w:r>
-      </w:del>
-    </w:p>
-    <w:p>
-      <w:pPr>
-        <w:pStyle w:val="aa"/>
-        <w:rPr>
-          <w:del w:id="644" w:author="rev1" w:date="2026-08-03T08:56:00Z" w16du:dateUtc="2026-08-02T23:56:00Z"/>
-        </w:rPr>
-      </w:pPr>
-      <w:del w:id="645" w:author="rev1" w:date="2026-08-03T08:56:00Z" w16du:dateUtc="2026-08-02T23:56:00Z">
-        <w:r>
-          <w:delText>22.</w:delText>
-        </w:r>
-        <w:r>
-          <w:tab/>
-          <w:delText xml:space="preserve">Tew, T. B. </w:delText>
-        </w:r>
-        <w:r>
-          <w:rPr>
-            <w:i/>
-            <w:iCs/>
-          </w:rPr>
-          <w:delText>et al.</w:delText>
-        </w:r>
-        <w:r>
-          <w:delText xml:space="preserve"> Comparison of different morphologies of choroidal neovascularization evaluated by ocular coherence tomography angiography in age-related macular degeneration. </w:delText>
-        </w:r>
-        <w:r>
-          <w:rPr>
-            <w:i/>
-            <w:iCs/>
-          </w:rPr>
-          <w:delText>Clin. Experiment. Ophthalmol.</w:delText>
-        </w:r>
-        <w:r>
-          <w:delText xml:space="preserve"> </w:delText>
-        </w:r>
-        <w:r>
-          <w:rPr>
-            <w:b/>
-            <w:bCs/>
-          </w:rPr>
-          <w:delText>48</w:delText>
-        </w:r>
-        <w:r>
-          <w:delText>, 927–937 (2020).</w:delText>
-        </w:r>
-      </w:del>
-    </w:p>
-    <w:p>
-      <w:pPr>
-        <w:pStyle w:val="aa"/>
-        <w:rPr>
-          <w:del w:id="646" w:author="rev1" w:date="2026-08-03T08:56:00Z" w16du:dateUtc="2026-08-02T23:56:00Z"/>
-        </w:rPr>
-      </w:pPr>
-      <w:del w:id="647" w:author="rev1" w:date="2026-08-03T08:56:00Z" w16du:dateUtc="2026-08-02T23:56:00Z">
-        <w:r>
-          <w:delText>23.</w:delText>
-        </w:r>
-        <w:r>
-          <w:tab/>
-          <w:delText xml:space="preserve">Mettu, P. S., Allingham, M. J. &amp; Cousins, S. W. Incomplete response to Anti-VEGF therapy in neovascular AMD: Exploring disease mechanisms and therapeutic opportunities. </w:delText>
-        </w:r>
-        <w:r>
-          <w:rPr>
-            <w:i/>
-            <w:iCs/>
-          </w:rPr>
-          <w:delText>Prog. Retin. Eye Res.</w:delText>
-        </w:r>
-        <w:r>
-          <w:delText xml:space="preserve"> </w:delText>
-        </w:r>
-        <w:r>
-          <w:rPr>
-            <w:b/>
-            <w:bCs/>
-          </w:rPr>
-          <w:delText>82</w:delText>
-        </w:r>
-        <w:r>
-          <w:delText>, 100906 (2021).</w:delText>
-        </w:r>
-      </w:del>
-    </w:p>
-    <w:p>
-      <w:pPr>
-        <w:pStyle w:val="aa"/>
-        <w:rPr>
-          <w:del w:id="648" w:author="rev1" w:date="2026-08-03T08:56:00Z" w16du:dateUtc="2026-08-02T23:56:00Z"/>
-        </w:rPr>
-      </w:pPr>
-      <w:del w:id="649" w:author="rev1" w:date="2026-08-03T08:56:00Z" w16du:dateUtc="2026-08-02T23:56:00Z">
-        <w:r>
-          <w:delText>24.</w:delText>
-        </w:r>
-        <w:r>
-          <w:tab/>
-          <w:delText xml:space="preserve">Attarde, A., Riad, T., Zhang, Z., Ahir, M. &amp; Fu, Y. Characterization of Vascular Morphology of Neovascular Age-Related Macular Degeneration by Indocyanine Green Angiography. </w:delText>
-        </w:r>
-        <w:r>
-          <w:rPr>
-            <w:i/>
-            <w:iCs/>
-          </w:rPr>
-          <w:delText>J. Vis. Exp. JoVE</w:delText>
-        </w:r>
-        <w:r>
-          <w:delText xml:space="preserve"> </w:delText>
-        </w:r>
-        <w:r>
-          <w:rPr>
-            <w:b/>
-            <w:bCs/>
-          </w:rPr>
-          <w:delText>198</w:delText>
-        </w:r>
-        <w:r>
-          <w:delText>, (2023).</w:delText>
-        </w:r>
-      </w:del>
-    </w:p>
-    <w:p>
-      <w:pPr>
-        <w:pStyle w:val="aa"/>
-        <w:rPr>
-          <w:del w:id="650" w:author="rev1" w:date="2026-08-03T08:56:00Z" w16du:dateUtc="2026-08-02T23:56:00Z"/>
-        </w:rPr>
-      </w:pPr>
-      <w:del w:id="651" w:author="rev1" w:date="2026-08-03T08:56:00Z" w16du:dateUtc="2026-08-02T23:56:00Z">
-        <w:r>
-          <w:delText>25.</w:delText>
-        </w:r>
-        <w:r>
-          <w:tab/>
-          <w:delText xml:space="preserve">Fu, Y., Zhang, Z., Webster, K. &amp; Paulus, Y. Treatment Strategies for Anti-VEGF Resistance in Neovascular Age-Related Macular Degeneration by Targeting Arteriolar Choroidal Neovascularization. </w:delText>
-        </w:r>
-        <w:r>
-          <w:rPr>
-            <w:i/>
-            <w:iCs/>
-          </w:rPr>
-          <w:delText>Biomolecules</w:delText>
-        </w:r>
-        <w:r>
-          <w:delText xml:space="preserve"> </w:delText>
-        </w:r>
-        <w:r>
-          <w:rPr>
-            <w:b/>
-            <w:bCs/>
-          </w:rPr>
-          <w:delText>14</w:delText>
-        </w:r>
-        <w:r>
-          <w:delText>, 252 (2024).</w:delText>
-        </w:r>
-      </w:del>
-    </w:p>
-    <w:p>
-      <w:pPr>
-        <w:pStyle w:val="aa"/>
-        <w:rPr>
-          <w:del w:id="652" w:author="rev1" w:date="2026-08-03T08:56:00Z" w16du:dateUtc="2026-08-02T23:56:00Z"/>
-        </w:rPr>
-      </w:pPr>
-      <w:del w:id="653" w:author="rev1" w:date="2026-08-03T08:56:00Z" w16du:dateUtc="2026-08-02T23:56:00Z">
-        <w:r>
-          <w:delText>26.</w:delText>
-        </w:r>
-        <w:r>
-          <w:tab/>
-          <w:delText xml:space="preserve">Spaide, R. Optical Coherence Tomography Angiography Signs of Vascular Abnormalization With Antiangiogenic Therapy for Choroidal Neovascularization. </w:delText>
-        </w:r>
-        <w:r>
-          <w:rPr>
-            <w:i/>
-            <w:iCs/>
-          </w:rPr>
-          <w:delText>Am. J. Ophthalmol.</w:delText>
-        </w:r>
-        <w:r>
-          <w:delText xml:space="preserve"> </w:delText>
-        </w:r>
-        <w:r>
-          <w:rPr>
-            <w:b/>
-            <w:bCs/>
-          </w:rPr>
-          <w:delText>160 1</w:delText>
-        </w:r>
-        <w:r>
-          <w:delText>, 6–16 (2015).</w:delText>
-        </w:r>
-      </w:del>
-    </w:p>
-    <w:p>
-      <w:pPr>
-        <w:pStyle w:val="aa"/>
-        <w:rPr>
-          <w:del w:id="654" w:author="rev1" w:date="2026-08-03T08:56:00Z" w16du:dateUtc="2026-08-02T23:56:00Z"/>
-          <w:rFonts w:ascii="Arial" w:hAnsi="Arial" w:cs="Arial"/>
-        </w:rPr>
-      </w:pPr>
-      <w:del w:id="655" w:author="rev1" w:date="2026-08-03T08:56:00Z" w16du:dateUtc="2026-08-02T23:56:00Z">
-        <w:r>
-          <w:rPr>
-            <w:rFonts w:ascii="Arial" w:hAnsi="Arial" w:cs="Arial"/>
-          </w:rPr>
-          <w:fldChar w:fldCharType="end"/>
-        </w:r>
-      </w:del>
-    </w:p>
-    <w:p>
-      <w:pPr>
-        <w:pStyle w:val="aa"/>
-        <w:ind w:left="0" w:firstLine="0"/>
-        <w:rPr>
-          <w:rFonts w:ascii="Arial" w:hAnsi="Arial" w:cs="Arial"/>
-          <w:b/>
-          <w:bCs/>
-        </w:rPr>
-      </w:pPr>
-      <w:bookmarkStart w:id="656" w:name="figure"/>
-      <w:r>
-        <w:rPr>
-          <w:rFonts w:ascii="Arial" w:hAnsi="Arial" w:cs="Arial"/>
-          <w:b/>
-          <w:bCs/>
-        </w:rPr>
-        <w:t>Figure</w:t>
-      </w:r>
-    </w:p>
-    <w:p>
-      <w:pPr>
-        <w:pStyle w:val="aa"/>
-        <w:ind w:left="0" w:firstLine="0"/>
-        <w:rPr>
-          <w:del w:id="657" w:author="rev1" w:date="2026-08-03T08:56:00Z" w16du:dateUtc="2026-08-02T23:56:00Z"/>
-          <w:rFonts w:ascii="Arial" w:hAnsi="Arial" w:cs="Arial"/>
-        </w:rPr>
-      </w:pPr>
-      <w:r>
-        <w:rPr>
-          <w:rFonts w:ascii="Arial" w:hAnsi="Arial" w:cs="Arial"/>
-          <w:b/>
-          <w:bCs/>
-        </w:rPr>
-        <w:t xml:space="preserve">Representative </w:t>
-      </w:r>
-      <w:ins w:id="658" w:author="rev1" w:date="2026-08-03T08:56:00Z" w16du:dateUtc="2026-08-02T23:56:00Z">
-        <w:r>
-          <w:t xml:space="preserve">OCTA processing and </w:t>
-        </w:r>
-      </w:ins>
-      <w:del w:id="659" w:author="rev1" w:date="2026-08-03T08:56:00Z" w16du:dateUtc="2026-08-02T23:56:00Z">
-        <w:r>
-          <w:rPr>
-            <w:rFonts w:ascii="Arial" w:hAnsi="Arial" w:cs="Arial"/>
-            <w:b/>
-            <w:bCs/>
-          </w:rPr>
-          <w:delText xml:space="preserve">OCT-A images demonstrating consistent MNV </w:delText>
-        </w:r>
-      </w:del>
-      <w:r>
-        <w:rPr>
-          <w:rFonts w:ascii="Arial" w:hAnsi="Arial" w:cs="Arial"/>
-          <w:b/>
-          <w:bCs/>
-        </w:rPr>
-        <w:t xml:space="preserve">segmentation </w:t>
-      </w:r>
-      <w:ins w:id="660" w:author="rev1" w:date="2026-08-03T08:56:00Z" w16du:dateUtc="2026-08-02T23:56:00Z">
-        <w:r>
-          <w:t>panels</w:t>
-        </w:r>
-      </w:ins>
-      <w:del w:id="661" w:author="rev1" w:date="2026-08-03T08:56:00Z" w16du:dateUtc="2026-08-02T23:56:00Z">
-        <w:r>
-          <w:rPr>
-            <w:rFonts w:ascii="Arial" w:hAnsi="Arial" w:cs="Arial"/>
-            <w:b/>
-            <w:bCs/>
-          </w:rPr>
-          <w:delText>across multiple platforms.</w:delText>
-        </w:r>
-        <w:r>
-          <w:rPr>
-            <w:rFonts w:ascii="Arial" w:hAnsi="Arial" w:cs="Arial"/>
-          </w:rPr>
-          <w:delText xml:space="preserve"> </w:delText>
-        </w:r>
-      </w:del>
-    </w:p>
-    <w:p>
-      <w:pPr>
-        <w:pStyle w:val="aa"/>
-        <w:ind w:left="0" w:firstLine="0"/>
-        <w:rPr>
-          <w:rFonts w:ascii="Arial" w:hAnsi="Arial" w:cs="Arial"/>
-        </w:rPr>
-      </w:pPr>
+          <w:delText>(C)</w:delText>
+        </w:r>
+        <w:r>
+          <w:rPr>
+            <w:rFonts w:ascii="Arial" w:hAnsi="Arial" w:cs="Arial"/>
+          </w:rPr>
+          <w:delText xml:space="preserve"> Zeiss HD series (3×3 mm). The system provides consistent segmentation of MNV lesions across these devices. The semi-automatically delineated lesion areas (yellow) and dilated neovascular segments (red) accurately follow the internal lesion architecture. </w:delText>
+        </w:r>
+        <w:r>
+          <w:rPr>
+            <w:rFonts w:ascii="Arial" w:hAnsi="Arial" w:cs="Arial"/>
+          </w:rPr>
+          <w:delText>Note that the region of interest (ROI) is refined to the non-perfused tissue border to minimize boundary artifacts, and incomplete peripheral vessel segments</w:delText>
+        </w:r>
+      </w:del>
+      <w:r>
+        <w:rPr>
+          <w:rFonts w:ascii="Arial" w:hAnsi="Arial" w:cs="Arial"/>
+        </w:rPr>
+        <w:t xml:space="preserve"> are </w:t>
+      </w:r>
+      <w:ins w:id="661" w:author="rev1" w:date="2026-08-03T08:56:00Z" w16du:dateUtc="2026-08-02T23:56:00Z">
+        <w:r>
+          <w:t xml:space="preserve">provided as separate figure files; detailed figure legends are supplied in </w:t>
+        </w:r>
+        <w:r>
+          <w:rPr>
+            <w:rStyle w:val="VerbatimChar"/>
+          </w:rPr>
+          <w:t>MNV_Analysis_YY_rev1_figure_legends.docx</w:t>
+        </w:r>
+      </w:ins>
       <w:del w:id="662" w:author="rev1" w:date="2026-08-03T08:56:00Z" w16du:dateUtc="2026-08-02T23:56:00Z">
         <w:r>
           <w:rPr>
             <w:rFonts w:ascii="Arial" w:hAnsi="Arial" w:cs="Arial"/>
           </w:rPr>
-          <w:delText xml:space="preserve">Images were acquired using: </w:delText>
-        </w:r>
-        <w:r>
-          <w:rPr>
-            <w:rFonts w:ascii="Arial" w:hAnsi="Arial" w:cs="Arial"/>
-            <w:b/>
-            <w:bCs/>
-          </w:rPr>
-          <w:delText>(A)</w:delText>
-        </w:r>
-        <w:r>
-          <w:rPr>
-            <w:rFonts w:ascii="Arial" w:hAnsi="Arial" w:cs="Arial"/>
-          </w:rPr>
-          <w:delText xml:space="preserve"> Zeiss PlexElite 9000 (6×6 mm), </w:delText>
-        </w:r>
-        <w:r>
-          <w:rPr>
-            <w:rFonts w:ascii="Arial" w:hAnsi="Arial" w:cs="Arial"/>
-            <w:b/>
-            <w:bCs/>
-          </w:rPr>
-          <w:delText>(B)</w:delText>
-        </w:r>
-        <w:r>
-          <w:rPr>
-            <w:rFonts w:ascii="Arial" w:hAnsi="Arial" w:cs="Arial"/>
-          </w:rPr>
-          <w:delText xml:space="preserve"> Optovue Solix (6×6 mm), and </w:delText>
-        </w:r>
-        <w:r>
-          <w:rPr>
-            <w:rFonts w:ascii="Arial" w:hAnsi="Arial" w:cs="Arial"/>
-            <w:b/>
-            <w:bCs/>
-          </w:rPr>
-          <w:delText>(C)</w:delText>
-        </w:r>
-        <w:r>
-          <w:rPr>
-            <w:rFonts w:ascii="Arial" w:hAnsi="Arial" w:cs="Arial"/>
-          </w:rPr>
-          <w:delText xml:space="preserve"> Zeiss HD series (3×3 mm). The system provides consistent segmentation of MNV lesions across these devices. The semi-automatically delineated lesion areas (yellow) and dilated neovascular segments (red) accurately follow the internal lesion architecture. </w:delText>
-        </w:r>
-        <w:r>
-          <w:rPr>
-            <w:rFonts w:ascii="Arial" w:hAnsi="Arial" w:cs="Arial"/>
-          </w:rPr>
-          <w:delText>Note that the region of interest (ROI) is refined to the non-perfused tissue border to minimize boundary artifacts, and incomplete peripheral vessel segments</w:delText>
-        </w:r>
-      </w:del>
-      <w:r>
-        <w:rPr>
-          <w:rFonts w:ascii="Arial" w:hAnsi="Arial" w:cs="Arial"/>
-        </w:rPr>
-        <w:t xml:space="preserve"> are </w:t>
-      </w:r>
-      <w:ins w:id="663" w:author="rev1" w:date="2026-08-03T08:56:00Z" w16du:dateUtc="2026-08-02T23:56:00Z">
-        <w:r>
-          <w:t xml:space="preserve">provided as separate figure files; detailed figure legends are supplied in </w:t>
-        </w:r>
-        <w:r>
-          <w:rPr>
-            <w:rStyle w:val="VerbatimChar"/>
-          </w:rPr>
-          <w:t>MNV_Analysis_YY_rev1_figure_legends.docx</w:t>
-        </w:r>
-      </w:ins>
-      <w:del w:id="664" w:author="rev1" w:date="2026-08-03T08:56:00Z" w16du:dateUtc="2026-08-02T23:56:00Z">
-        <w:r>
-          <w:rPr>
-            <w:rFonts w:ascii="Arial" w:hAnsi="Arial" w:cs="Arial"/>
-          </w:rPr>
           <w:delText>excluded from the quantitative analysis to ensure morphometric accuracy</w:delText>
         </w:r>
       </w:del>
@@ -10524,7 +9671,7 @@
         <w:t>.</w:t>
       </w:r>
       <w:bookmarkEnd w:id="0"/>
-      <w:bookmarkEnd w:id="656"/>
+      <w:bookmarkEnd w:id="654"/>
     </w:p>
     <w:sectPr>
       <w:headerReference w:type="default" r:id="rId8"/>
@@ -10571,6 +9718,11 @@
         <w:docPartUnique/>
       </w:docPartObj>
     </w:sdtPr>
+    <w:sdtEndPr>
+      <w:rPr>
+        <w:rStyle w:val="af0"/>
+      </w:rPr>
+    </w:sdtEndPr>
     <w:sdtContent>
       <w:p>
         <w:pPr>
@@ -10580,7 +9732,7 @@
             <w:rStyle w:val="af0"/>
           </w:rPr>
         </w:pPr>
-        <w:del w:id="665" w:author="rev1" w:date="2026-08-03T08:56:00Z" w16du:dateUtc="2026-08-02T23:56:00Z">
+        <w:del w:id="663" w:author="rev1" w:date="2026-08-03T08:56:00Z" w16du:dateUtc="2026-08-02T23:56:00Z">
           <w:r>
             <w:rPr>
               <w:rStyle w:val="af0"/>
@@ -10631,6 +9783,11 @@
         <w:docPartUnique/>
       </w:docPartObj>
     </w:sdtPr>
+    <w:sdtEndPr>
+      <w:rPr>
+        <w:rStyle w:val="af0"/>
+      </w:rPr>
+    </w:sdtEndPr>
     <w:sdtContent>
       <w:p>
         <w:pPr>
@@ -10640,7 +9797,7 @@
             <w:rStyle w:val="af0"/>
           </w:rPr>
         </w:pPr>
-        <w:del w:id="666" w:author="rev1" w:date="2026-08-03T08:56:00Z" w16du:dateUtc="2026-08-02T23:56:00Z">
+        <w:del w:id="664" w:author="rev1" w:date="2026-08-03T08:56:00Z" w16du:dateUtc="2026-08-02T23:56:00Z">
           <w:r>
             <w:rPr>
               <w:rStyle w:val="af0"/>
@@ -11750,6 +10907,7 @@
   <w:style w:type="character" w:default="1" w:styleId="a0">
     <w:name w:val="Default Paragraph Font"/>
     <w:uiPriority w:val="1"/>
+    <w:semiHidden/>
     <w:unhideWhenUsed/>
   </w:style>
   <w:style w:type="table" w:default="1" w:styleId="a1">

</xml_diff>